<commit_message>
Redacto la sección de Organización y estructura del equipo y los  roles. Relacionado con el #1
</commit_message>
<xml_diff>
--- a/Documentos/Practicas.docx
+++ b/Documentos/Practicas.docx
@@ -109,8 +109,976 @@
         <w:t>Victoria Rangel 31.602.528</w:t>
       </w:r>
     </w:p>
+    <w:p>
+      <w:pPr>
+        <w:rPr>
+          <w:lang w:val="es-VE"/>
+        </w:rPr>
+      </w:pPr>
+    </w:p>
+    <w:p>
+      <w:pPr>
+        <w:rPr>
+          <w:lang w:val="es-VE"/>
+        </w:rPr>
+      </w:pPr>
+    </w:p>
+    <w:p>
+      <w:pPr>
+        <w:rPr>
+          <w:lang w:val="es-VE"/>
+        </w:rPr>
+      </w:pPr>
+    </w:p>
+    <w:p>
+      <w:pPr>
+        <w:pStyle w:val="Ttulo1"/>
+        <w:numPr>
+          <w:ilvl w:val="0"/>
+          <w:numId w:val="1"/>
+        </w:numPr>
+        <w:rPr>
+          <w:u w:val="single"/>
+          <w:lang w:val="es-VE"/>
+        </w:rPr>
+      </w:pPr>
+      <w:r>
+        <w:rPr>
+          <w:u w:val="single"/>
+          <w:lang w:val="es-VE"/>
+        </w:rPr>
+        <w:lastRenderedPageBreak/>
+        <w:t>Organización y Estructura del Equipo</w:t>
+      </w:r>
+    </w:p>
+    <w:p>
+      <w:pPr>
+        <w:rPr>
+          <w:lang w:val="es-VE"/>
+        </w:rPr>
+      </w:pPr>
+      <w:r>
+        <w:rPr>
+          <w:lang w:val="es-VE"/>
+        </w:rPr>
+        <w:t xml:space="preserve">El éxito de </w:t>
+      </w:r>
+      <w:r>
+        <w:rPr>
+          <w:lang w:val="es-VE"/>
+        </w:rPr>
+        <w:t xml:space="preserve">un </w:t>
+      </w:r>
+      <w:r>
+        <w:rPr>
+          <w:lang w:val="es-VE"/>
+        </w:rPr>
+        <w:t xml:space="preserve">proyecto universitario no depende </w:t>
+      </w:r>
+      <w:r>
+        <w:rPr>
+          <w:lang w:val="es-VE"/>
+        </w:rPr>
+        <w:t xml:space="preserve">solo </w:t>
+      </w:r>
+      <w:r>
+        <w:rPr>
+          <w:lang w:val="es-VE"/>
+        </w:rPr>
+        <w:t xml:space="preserve">del conocimiento  de sus integrantes, sino de cómo se organizan desde el primer día. Una estructura clara evita malentendidos, duplicidad de trabajo y entregas de última hora. Para </w:t>
+      </w:r>
+      <w:r>
+        <w:rPr>
+          <w:lang w:val="es-VE"/>
+        </w:rPr>
+        <w:t xml:space="preserve"> que esto funcione y puedan lograrlo, </w:t>
+      </w:r>
+      <w:r>
+        <w:rPr>
+          <w:lang w:val="es-VE"/>
+        </w:rPr>
+        <w:t>es fundamental establecer roles, reglas claras y elegir las herramientas adecuada</w:t>
+      </w:r>
+    </w:p>
+    <w:p>
+      <w:pPr>
+        <w:pStyle w:val="Ttulo2"/>
+        <w:rPr>
+          <w:sz w:val="27"/>
+          <w:lang w:val="es-VE"/>
+        </w:rPr>
+      </w:pPr>
+      <w:r>
+        <w:rPr>
+          <w:lang w:val="es-VE"/>
+        </w:rPr>
+        <w:t>Formación y Asignación de Roles</w:t>
+      </w:r>
+    </w:p>
+    <w:p>
+      <w:pPr>
+        <w:rPr>
+          <w:lang w:val="es-VE"/>
+        </w:rPr>
+      </w:pPr>
+      <w:r>
+        <w:rPr>
+          <w:lang w:val="es-VE"/>
+        </w:rPr>
+        <w:t>Trabajar en equipo no significa que todos hacen todo al mismo tiempo. Para ser eficientes, se deben identificar las fortalezas de cada miembro y asignar responsabilidades específicas</w:t>
+      </w:r>
+      <w:r>
+        <w:rPr>
+          <w:lang w:val="es-VE"/>
+        </w:rPr>
+        <w:t xml:space="preserve"> para </w:t>
+      </w:r>
+      <w:proofErr w:type="spellStart"/>
+      <w:r>
+        <w:rPr>
+          <w:lang w:val="es-VE"/>
+        </w:rPr>
+        <w:t>desarrolloa</w:t>
+      </w:r>
+      <w:proofErr w:type="spellEnd"/>
+      <w:r>
+        <w:rPr>
+          <w:lang w:val="es-VE"/>
+        </w:rPr>
+        <w:t xml:space="preserve"> el proyecto</w:t>
+      </w:r>
+      <w:r>
+        <w:rPr>
+          <w:lang w:val="es-VE"/>
+        </w:rPr>
+        <w:t>. Los roles básicos recomendados son:</w:t>
+      </w:r>
+    </w:p>
+    <w:p>
+      <w:pPr>
+        <w:pStyle w:val="Prrafodelista"/>
+        <w:numPr>
+          <w:ilvl w:val="0"/>
+          <w:numId w:val="5"/>
+        </w:numPr>
+        <w:rPr>
+          <w:lang w:val="es-VE"/>
+        </w:rPr>
+      </w:pPr>
+      <w:r>
+        <w:rPr>
+          <w:b/>
+          <w:bCs/>
+          <w:lang w:val="es-VE"/>
+        </w:rPr>
+        <w:t>Coordinador del Proyecto</w:t>
+      </w:r>
+      <w:r>
+        <w:rPr>
+          <w:b/>
+          <w:bCs/>
+          <w:lang w:val="es-VE"/>
+        </w:rPr>
+        <w:t xml:space="preserve"> o presidente</w:t>
+      </w:r>
+      <w:r>
+        <w:rPr>
+          <w:b/>
+          <w:bCs/>
+          <w:lang w:val="es-VE"/>
+        </w:rPr>
+        <w:t>:</w:t>
+      </w:r>
+      <w:r>
+        <w:rPr>
+          <w:lang w:val="es-VE"/>
+        </w:rPr>
+        <w:t xml:space="preserve"> Es el encargado de velar por el cumplimiento del cronograma, organizar las reuniones y mantener la comunicación fluida. </w:t>
+      </w:r>
+      <w:r>
+        <w:rPr>
+          <w:lang w:val="es-VE"/>
+        </w:rPr>
+        <w:t xml:space="preserve">No es </w:t>
+      </w:r>
+      <w:r>
+        <w:rPr>
+          <w:lang w:val="es-VE"/>
+        </w:rPr>
+        <w:t>el jefe como tal, es el facilitador, el que esta pendiente y responde por el grupo</w:t>
+      </w:r>
+    </w:p>
+    <w:p>
+      <w:pPr>
+        <w:pStyle w:val="Prrafodelista"/>
+        <w:numPr>
+          <w:ilvl w:val="0"/>
+          <w:numId w:val="5"/>
+        </w:numPr>
+        <w:rPr>
+          <w:lang w:val="es-VE"/>
+        </w:rPr>
+      </w:pPr>
+      <w:r>
+        <w:rPr>
+          <w:b/>
+          <w:bCs/>
+          <w:lang w:val="es-VE"/>
+        </w:rPr>
+        <w:t>Investigador:</w:t>
+      </w:r>
+      <w:r>
+        <w:rPr>
+          <w:lang w:val="es-VE"/>
+        </w:rPr>
+        <w:t xml:space="preserve"> Responsable de buscar fuentes confiables, recopilar datos y filtrar la información que servirá de base teórica para el proyecto.</w:t>
+      </w:r>
+    </w:p>
+    <w:p>
+      <w:pPr>
+        <w:pStyle w:val="Prrafodelista"/>
+        <w:numPr>
+          <w:ilvl w:val="0"/>
+          <w:numId w:val="5"/>
+        </w:numPr>
+        <w:rPr>
+          <w:lang w:val="es-VE"/>
+        </w:rPr>
+      </w:pPr>
+      <w:r>
+        <w:rPr>
+          <w:b/>
+          <w:bCs/>
+          <w:lang w:val="es-VE"/>
+        </w:rPr>
+        <w:t xml:space="preserve">Redactor </w:t>
+      </w:r>
+      <w:r>
+        <w:rPr>
+          <w:b/>
+          <w:bCs/>
+          <w:lang w:val="es-VE"/>
+        </w:rPr>
+        <w:t>y edito</w:t>
+      </w:r>
+      <w:r>
+        <w:rPr>
+          <w:b/>
+          <w:bCs/>
+          <w:lang w:val="es-VE"/>
+        </w:rPr>
+        <w:t>r:</w:t>
+      </w:r>
+      <w:r>
+        <w:rPr>
+          <w:lang w:val="es-VE"/>
+        </w:rPr>
+        <w:t xml:space="preserve"> Se encarga de redactar el documento final, asegurando que el texto tenga coherencia, buena ortografía y </w:t>
+      </w:r>
+      <w:r>
+        <w:rPr>
+          <w:lang w:val="es-VE"/>
+        </w:rPr>
+        <w:t xml:space="preserve">combine con </w:t>
+      </w:r>
+      <w:r>
+        <w:rPr>
+          <w:lang w:val="es-VE"/>
+        </w:rPr>
+        <w:t>el tono de lo que los demás aporten.</w:t>
+      </w:r>
+    </w:p>
+    <w:p>
+      <w:pPr>
+        <w:pStyle w:val="Prrafodelista"/>
+        <w:numPr>
+          <w:ilvl w:val="0"/>
+          <w:numId w:val="5"/>
+        </w:numPr>
+        <w:rPr>
+          <w:lang w:val="es-VE"/>
+        </w:rPr>
+      </w:pPr>
+      <w:r>
+        <w:rPr>
+          <w:b/>
+          <w:bCs/>
+          <w:lang w:val="es-VE"/>
+        </w:rPr>
+        <w:t>Diseñador:</w:t>
+      </w:r>
+      <w:r>
+        <w:rPr>
+          <w:lang w:val="es-VE"/>
+        </w:rPr>
+        <w:t xml:space="preserve"> Responsable de la parte visual (presentaciones, diagramas, maquetación del Word) o de la implementación técnica si el proyecto lo requiere.</w:t>
+      </w:r>
+    </w:p>
+    <w:p>
+      <w:pPr>
+        <w:rPr>
+          <w:lang w:val="es-VE"/>
+        </w:rPr>
+      </w:pPr>
+    </w:p>
+    <w:p>
+      <w:pPr>
+        <w:rPr>
+          <w:lang w:val="es-VE"/>
+        </w:rPr>
+      </w:pPr>
+    </w:p>
+    <w:p>
+      <w:pPr>
+        <w:rPr>
+          <w:lang w:val="es-VE"/>
+        </w:rPr>
+      </w:pPr>
+      <w:r>
+        <w:rPr>
+          <w:lang w:val="es-VE"/>
+        </w:rPr>
+        <w:lastRenderedPageBreak/>
+        <w:t>la importancia de las estructuras administrativas en la gestión de proyectos</w:t>
+      </w:r>
+      <w:r>
+        <w:rPr>
+          <w:lang w:val="es-VE"/>
+        </w:rPr>
+        <w:t xml:space="preserve"> </w:t>
+      </w:r>
+      <w:proofErr w:type="spellStart"/>
+      <w:r>
+        <w:rPr>
+          <w:lang w:val="es-VE"/>
+        </w:rPr>
+        <w:t>reslata</w:t>
+      </w:r>
+      <w:proofErr w:type="spellEnd"/>
+      <w:r>
+        <w:rPr>
+          <w:lang w:val="es-VE"/>
+        </w:rPr>
+        <w:t xml:space="preserve"> que el trabajar en equipo mejora;</w:t>
+      </w:r>
+    </w:p>
+    <w:p>
+      <w:pPr>
+        <w:rPr>
+          <w:lang w:val="es-VE"/>
+        </w:rPr>
+      </w:pPr>
+      <w:r>
+        <w:rPr>
+          <w:rFonts w:hAnsi="Symbol"/>
+        </w:rPr>
+        <w:t></w:t>
+      </w:r>
+      <w:r>
+        <w:rPr>
+          <w:lang w:val="es-VE"/>
+        </w:rPr>
+        <w:t xml:space="preserve"> </w:t>
+      </w:r>
+      <w:r>
+        <w:rPr>
+          <w:b/>
+          <w:bCs/>
+          <w:lang w:val="es-VE"/>
+        </w:rPr>
+        <w:t>Optimización de recursos:</w:t>
+      </w:r>
+      <w:r>
+        <w:rPr>
+          <w:lang w:val="es-VE"/>
+        </w:rPr>
+        <w:t xml:space="preserve"> Una estructura sólida permite distribuir el trabajo de forma inteligente, garantizando que cada integrante asuma un papel específico y útil dentro del proyecto.</w:t>
+      </w:r>
+    </w:p>
+    <w:p>
+      <w:pPr>
+        <w:rPr>
+          <w:lang w:val="es-VE"/>
+        </w:rPr>
+      </w:pPr>
+      <w:r>
+        <w:rPr>
+          <w:rFonts w:hAnsi="Symbol"/>
+        </w:rPr>
+        <w:t></w:t>
+      </w:r>
+      <w:r>
+        <w:rPr>
+          <w:lang w:val="es-VE"/>
+        </w:rPr>
+        <w:t xml:space="preserve"> </w:t>
+      </w:r>
+      <w:r>
+        <w:rPr>
+          <w:b/>
+          <w:bCs/>
+          <w:lang w:val="es-VE"/>
+        </w:rPr>
+        <w:t>Roles precisos:</w:t>
+      </w:r>
+      <w:r>
+        <w:rPr>
+          <w:lang w:val="es-VE"/>
+        </w:rPr>
+        <w:t xml:space="preserve"> Establecer quién hace qué elimina las ambigüedades operativas y asegura que cada tarea sea ejecutada por la persona adecuada.</w:t>
+      </w:r>
+    </w:p>
+    <w:p>
+      <w:pPr>
+        <w:rPr>
+          <w:lang w:val="es-VE"/>
+        </w:rPr>
+      </w:pPr>
+      <w:r>
+        <w:rPr>
+          <w:rFonts w:hAnsi="Symbol"/>
+        </w:rPr>
+        <w:t></w:t>
+      </w:r>
+      <w:r>
+        <w:rPr>
+          <w:lang w:val="es-VE"/>
+        </w:rPr>
+        <w:t xml:space="preserve"> </w:t>
+      </w:r>
+      <w:r>
+        <w:rPr>
+          <w:b/>
+          <w:bCs/>
+          <w:lang w:val="es-VE"/>
+        </w:rPr>
+        <w:t>Comunicación fluida:</w:t>
+      </w:r>
+      <w:r>
+        <w:rPr>
+          <w:lang w:val="es-VE"/>
+        </w:rPr>
+        <w:t xml:space="preserve"> Fomenta la integración del equipo al instaurar canales oficiales y reuniones de seguimiento para evaluar el avance grupal.</w:t>
+      </w:r>
+    </w:p>
+    <w:p>
+      <w:pPr>
+        <w:rPr>
+          <w:lang w:val="es-VE"/>
+        </w:rPr>
+      </w:pPr>
+      <w:r>
+        <w:rPr>
+          <w:rFonts w:hAnsi="Symbol"/>
+        </w:rPr>
+        <w:t></w:t>
+      </w:r>
+      <w:r>
+        <w:rPr>
+          <w:lang w:val="es-VE"/>
+        </w:rPr>
+        <w:t xml:space="preserve"> </w:t>
+      </w:r>
+      <w:r>
+        <w:rPr>
+          <w:b/>
+          <w:bCs/>
+          <w:lang w:val="es-VE"/>
+        </w:rPr>
+        <w:t>Resolución ágil:</w:t>
+      </w:r>
+      <w:r>
+        <w:rPr>
+          <w:lang w:val="es-VE"/>
+        </w:rPr>
+        <w:t xml:space="preserve"> Al tener claras las responsabilidades, el equipo puede tomar decisiones clave con mayor velocidad, algo vital en entornos de desarrollo dinámicos.</w:t>
+      </w:r>
+    </w:p>
+    <w:p>
+      <w:pPr>
+        <w:rPr>
+          <w:lang w:val="es-VE"/>
+        </w:rPr>
+      </w:pPr>
+      <w:r>
+        <w:rPr>
+          <w:rFonts w:hAnsi="Symbol"/>
+        </w:rPr>
+        <w:t></w:t>
+      </w:r>
+      <w:r>
+        <w:rPr>
+          <w:lang w:val="es-VE"/>
+        </w:rPr>
+        <w:t xml:space="preserve"> </w:t>
+      </w:r>
+      <w:r>
+        <w:rPr>
+          <w:b/>
+          <w:bCs/>
+          <w:lang w:val="es-VE"/>
+        </w:rPr>
+        <w:t>Flexibilidad ante imprevistos:</w:t>
+      </w:r>
+      <w:r>
+        <w:rPr>
+          <w:lang w:val="es-VE"/>
+        </w:rPr>
+        <w:t xml:space="preserve"> Un esquema organizativo adaptable ayuda al grupo a pivotar rápidamente frente a modificaciones en los tiempos, el alcance o los requerimientos del trabajo.</w:t>
+      </w:r>
+    </w:p>
+    <w:p>
+      <w:pPr>
+        <w:rPr>
+          <w:lang w:val="es-VE"/>
+        </w:rPr>
+      </w:pPr>
+      <w:r>
+        <w:rPr>
+          <w:rFonts w:hAnsi="Symbol"/>
+        </w:rPr>
+        <w:t></w:t>
+      </w:r>
+      <w:r>
+        <w:rPr>
+          <w:lang w:val="es-VE"/>
+        </w:rPr>
+        <w:t xml:space="preserve"> </w:t>
+      </w:r>
+      <w:r>
+        <w:rPr>
+          <w:b/>
+          <w:bCs/>
+          <w:lang w:val="es-VE"/>
+        </w:rPr>
+        <w:t>Mitigación de riesgos:</w:t>
+      </w:r>
+      <w:r>
+        <w:rPr>
+          <w:lang w:val="es-VE"/>
+        </w:rPr>
+        <w:t xml:space="preserve"> Con flujos de trabajo bien marcados, resulta mucho más sencillo detectar, evaluar y neutralizar posibles </w:t>
+      </w:r>
+      <w:r>
+        <w:rPr>
+          <w:lang w:val="es-VE"/>
+        </w:rPr>
+        <w:t xml:space="preserve">problemas </w:t>
+      </w:r>
+      <w:r>
+        <w:rPr>
+          <w:lang w:val="es-VE"/>
+        </w:rPr>
+        <w:t>antes de que afecten la entrega.</w:t>
+      </w:r>
+    </w:p>
+    <w:p>
+      <w:pPr>
+        <w:rPr>
+          <w:lang w:val="es-VE"/>
+        </w:rPr>
+      </w:pPr>
+      <w:r>
+        <w:rPr>
+          <w:rFonts w:hAnsi="Symbol"/>
+        </w:rPr>
+        <w:t></w:t>
+      </w:r>
+      <w:r>
+        <w:rPr>
+          <w:lang w:val="es-VE"/>
+        </w:rPr>
+        <w:t xml:space="preserve"> </w:t>
+      </w:r>
+      <w:r>
+        <w:rPr>
+          <w:b/>
+          <w:bCs/>
+          <w:lang w:val="es-VE"/>
+        </w:rPr>
+        <w:t>Máximo rendimiento:</w:t>
+      </w:r>
+      <w:r>
+        <w:rPr>
+          <w:lang w:val="es-VE"/>
+        </w:rPr>
+        <w:t xml:space="preserve"> Al evitar que dos personas hagan la misma tarea o que existan tiempos </w:t>
+      </w:r>
+      <w:r>
+        <w:rPr>
+          <w:lang w:val="es-VE"/>
+        </w:rPr>
+        <w:t>sin hacer nada</w:t>
+      </w:r>
+      <w:r>
+        <w:rPr>
+          <w:lang w:val="es-VE"/>
+        </w:rPr>
+        <w:t>, la claridad en las funciones eleva la productividad tota</w:t>
+      </w:r>
+    </w:p>
+    <w:p>
+      <w:pPr>
+        <w:rPr>
+          <w:lang w:val="es-VE"/>
+        </w:rPr>
+      </w:pPr>
+    </w:p>
+    <w:p>
+      <w:pPr>
+        <w:pStyle w:val="Ttulo2"/>
+        <w:rPr>
+          <w:lang w:val="es-VE"/>
+        </w:rPr>
+      </w:pPr>
+      <w:r>
+        <w:rPr>
+          <w:lang w:val="es-VE"/>
+        </w:rPr>
+        <w:lastRenderedPageBreak/>
+        <w:t xml:space="preserve"> Acuerdos Iniciales</w:t>
+      </w:r>
+    </w:p>
+    <w:p>
+      <w:pPr>
+        <w:rPr>
+          <w:lang w:val="es-VE"/>
+        </w:rPr>
+      </w:pPr>
+      <w:r>
+        <w:rPr>
+          <w:lang w:val="es-VE"/>
+        </w:rPr>
+        <w:t>Antes de empezar a investigar o escribir, el equipo debe tener una breve reunión de inicio</w:t>
+      </w:r>
+      <w:r>
+        <w:rPr>
+          <w:lang w:val="es-VE"/>
+        </w:rPr>
+        <w:t xml:space="preserve"> </w:t>
+      </w:r>
+      <w:r>
+        <w:rPr>
+          <w:lang w:val="es-VE"/>
+        </w:rPr>
+        <w:t>para dejar por sentado lo siguiente:</w:t>
+      </w:r>
+    </w:p>
+    <w:p>
+      <w:pPr>
+        <w:pStyle w:val="Prrafodelista"/>
+        <w:numPr>
+          <w:ilvl w:val="0"/>
+          <w:numId w:val="7"/>
+        </w:numPr>
+        <w:rPr>
+          <w:lang w:val="es-VE"/>
+        </w:rPr>
+      </w:pPr>
+      <w:r>
+        <w:rPr>
+          <w:b/>
+          <w:bCs/>
+          <w:lang w:val="es-VE"/>
+        </w:rPr>
+        <w:t>Canales de comunicación oficiales:</w:t>
+      </w:r>
+      <w:r>
+        <w:rPr>
+          <w:lang w:val="es-VE"/>
+        </w:rPr>
+        <w:t xml:space="preserve"> Separar lo social de lo académico. Por ejemplo, usar WhatsApp para avisos rápidos, pero utilizar</w:t>
+      </w:r>
+      <w:r>
+        <w:rPr>
+          <w:lang w:val="es-VE"/>
+        </w:rPr>
+        <w:t xml:space="preserve"> grupos de</w:t>
+      </w:r>
+      <w:r>
+        <w:rPr>
+          <w:lang w:val="es-VE"/>
+        </w:rPr>
+        <w:t xml:space="preserve"> </w:t>
+      </w:r>
+      <w:proofErr w:type="spellStart"/>
+      <w:r>
+        <w:rPr>
+          <w:lang w:val="es-VE"/>
+        </w:rPr>
+        <w:t>telegram</w:t>
+      </w:r>
+      <w:proofErr w:type="spellEnd"/>
+      <w:r>
+        <w:rPr>
+          <w:lang w:val="es-VE"/>
+        </w:rPr>
+        <w:t xml:space="preserve"> o </w:t>
+      </w:r>
+      <w:proofErr w:type="spellStart"/>
+      <w:r>
+        <w:rPr>
+          <w:lang w:val="es-VE"/>
+        </w:rPr>
+        <w:t>Discord</w:t>
+      </w:r>
+      <w:proofErr w:type="spellEnd"/>
+      <w:r>
+        <w:rPr>
+          <w:lang w:val="es-VE"/>
+        </w:rPr>
+        <w:t xml:space="preserve"> para enviar archivos y discutir temas del proyecto.</w:t>
+      </w:r>
+    </w:p>
+    <w:p>
+      <w:pPr>
+        <w:pStyle w:val="Prrafodelista"/>
+        <w:numPr>
+          <w:ilvl w:val="0"/>
+          <w:numId w:val="7"/>
+        </w:numPr>
+        <w:rPr>
+          <w:lang w:val="es-VE"/>
+        </w:rPr>
+      </w:pPr>
+      <w:r>
+        <w:rPr>
+          <w:b/>
+          <w:bCs/>
+          <w:lang w:val="es-VE"/>
+        </w:rPr>
+        <w:t>Horarios y disponibilidad:</w:t>
+      </w:r>
+      <w:r>
+        <w:rPr>
+          <w:lang w:val="es-VE"/>
+        </w:rPr>
+        <w:t xml:space="preserve"> Sincronizar agendas para definir qué días y a qué horas se harán las reuniones de revisión</w:t>
+      </w:r>
+      <w:r>
+        <w:rPr>
+          <w:lang w:val="es-VE"/>
+        </w:rPr>
+        <w:t xml:space="preserve"> y ver a que hora puede cada integrante</w:t>
+      </w:r>
+    </w:p>
+    <w:p>
+      <w:pPr>
+        <w:pStyle w:val="Prrafodelista"/>
+        <w:numPr>
+          <w:ilvl w:val="0"/>
+          <w:numId w:val="7"/>
+        </w:numPr>
+        <w:rPr>
+          <w:lang w:val="es-VE"/>
+        </w:rPr>
+      </w:pPr>
+      <w:r>
+        <w:rPr>
+          <w:b/>
+          <w:bCs/>
+          <w:lang w:val="es-VE"/>
+        </w:rPr>
+        <w:t>Mecanismos de toma de decisiones:</w:t>
+      </w:r>
+      <w:r>
+        <w:rPr>
+          <w:lang w:val="es-VE"/>
+        </w:rPr>
+        <w:t xml:space="preserve"> Establecer cómo se resolverán los desacuerdos</w:t>
+      </w:r>
+    </w:p>
+    <w:p>
+      <w:pPr>
+        <w:pStyle w:val="Ttulo2"/>
+        <w:rPr>
+          <w:lang w:val="es-VE"/>
+        </w:rPr>
+      </w:pPr>
+      <w:r>
+        <w:rPr>
+          <w:lang w:val="es-VE"/>
+        </w:rPr>
+        <w:t>Herramientas Colaborativas</w:t>
+      </w:r>
+    </w:p>
+    <w:p>
+      <w:pPr>
+        <w:rPr>
+          <w:lang w:val="es-VE"/>
+        </w:rPr>
+      </w:pPr>
+      <w:r>
+        <w:rPr>
+          <w:lang w:val="es-VE"/>
+        </w:rPr>
+        <w:t>Para evitar el caos de enviarse archivos por correo electrónico con nombres como</w:t>
+      </w:r>
+      <w:r>
+        <w:rPr>
+          <w:lang w:val="es-VE"/>
+        </w:rPr>
+        <w:t xml:space="preserve"> que podrían confundir, es mejor</w:t>
+      </w:r>
+      <w:r>
+        <w:rPr>
+          <w:lang w:val="es-VE"/>
+        </w:rPr>
+        <w:t xml:space="preserve"> el uso de entornos colaborativos:</w:t>
+      </w:r>
+    </w:p>
+    <w:p>
+      <w:pPr>
+        <w:pStyle w:val="Prrafodelista"/>
+        <w:numPr>
+          <w:ilvl w:val="0"/>
+          <w:numId w:val="8"/>
+        </w:numPr>
+        <w:rPr>
+          <w:lang w:val="es-VE"/>
+        </w:rPr>
+      </w:pPr>
+      <w:r>
+        <w:rPr>
+          <w:b/>
+          <w:bCs/>
+          <w:lang w:val="es-VE"/>
+        </w:rPr>
+        <w:t>Para la redacción:</w:t>
+      </w:r>
+      <w:r>
+        <w:rPr>
+          <w:lang w:val="es-VE"/>
+        </w:rPr>
+        <w:t xml:space="preserve"> Microsoft Word online o Google Docs. Permiten la edición simultánea y guardan el historial de versiones para evitar la pérdida de información.</w:t>
+      </w:r>
+    </w:p>
+    <w:p>
+      <w:pPr>
+        <w:pStyle w:val="Prrafodelista"/>
+        <w:numPr>
+          <w:ilvl w:val="0"/>
+          <w:numId w:val="8"/>
+        </w:numPr>
+        <w:rPr>
+          <w:lang w:val="es-VE"/>
+        </w:rPr>
+      </w:pPr>
+      <w:r>
+        <w:rPr>
+          <w:b/>
+          <w:bCs/>
+          <w:lang w:val="es-VE"/>
+        </w:rPr>
+        <w:t>Para el almacenamiento:</w:t>
+      </w:r>
+      <w:r>
+        <w:rPr>
+          <w:lang w:val="es-VE"/>
+        </w:rPr>
+        <w:t xml:space="preserve"> Crear una carpeta compartida en Google Drive o </w:t>
+      </w:r>
+      <w:r>
+        <w:rPr>
+          <w:lang w:val="es-VE"/>
+        </w:rPr>
+        <w:t>d</w:t>
+      </w:r>
+      <w:r>
+        <w:rPr>
+          <w:lang w:val="es-VE"/>
+        </w:rPr>
+        <w:t xml:space="preserve">rive con subcarpetas estructuradas </w:t>
+      </w:r>
+    </w:p>
+    <w:p>
+      <w:pPr>
+        <w:pStyle w:val="Prrafodelista"/>
+        <w:numPr>
+          <w:ilvl w:val="0"/>
+          <w:numId w:val="8"/>
+        </w:numPr>
+        <w:rPr>
+          <w:lang w:val="es-VE"/>
+        </w:rPr>
+      </w:pPr>
+      <w:r>
+        <w:rPr>
+          <w:b/>
+          <w:bCs/>
+          <w:lang w:val="es-VE"/>
+        </w:rPr>
+        <w:t>Para la gestión de tareas y código:</w:t>
+      </w:r>
+      <w:r>
+        <w:rPr>
+          <w:lang w:val="es-VE"/>
+        </w:rPr>
+        <w:t xml:space="preserve"> GitHub (utilizando su sistema de Issues y Project </w:t>
+      </w:r>
+      <w:proofErr w:type="spellStart"/>
+      <w:r>
+        <w:rPr>
+          <w:lang w:val="es-VE"/>
+        </w:rPr>
+        <w:t>Boards</w:t>
+      </w:r>
+      <w:proofErr w:type="spellEnd"/>
+      <w:r>
+        <w:rPr>
+          <w:lang w:val="es-VE"/>
+        </w:rPr>
+        <w:t xml:space="preserve"> tipo Kanban) </w:t>
+      </w:r>
+      <w:r>
+        <w:rPr>
+          <w:lang w:val="es-VE"/>
+        </w:rPr>
+        <w:t xml:space="preserve">es </w:t>
+      </w:r>
+      <w:r>
+        <w:rPr>
+          <w:lang w:val="es-VE"/>
+        </w:rPr>
+        <w:t>ideal para saber qué está haciendo cada miembro en tiempo real</w:t>
+      </w:r>
+      <w:r>
+        <w:rPr>
+          <w:lang w:val="es-VE"/>
+        </w:rPr>
+        <w:t xml:space="preserve">, mas si es una carrera como Ingeniería en Computación, donde el uso de </w:t>
+      </w:r>
+      <w:proofErr w:type="spellStart"/>
+      <w:r>
+        <w:rPr>
+          <w:lang w:val="es-VE"/>
+        </w:rPr>
+        <w:t>github</w:t>
+      </w:r>
+      <w:proofErr w:type="spellEnd"/>
+      <w:r>
+        <w:rPr>
+          <w:lang w:val="es-VE"/>
+        </w:rPr>
+        <w:t xml:space="preserve"> es de mucho uso </w:t>
+      </w:r>
+    </w:p>
+    <w:p>
+      <w:pPr>
+        <w:rPr>
+          <w:lang w:val="es-VE"/>
+        </w:rPr>
+      </w:pPr>
+    </w:p>
+    <w:p>
+      <w:pPr>
+        <w:rPr>
+          <w:lang w:val="es-VE"/>
+        </w:rPr>
+      </w:pPr>
+    </w:p>
     <w:sectPr>
-      <w:headerReference w:type="default" r:id="rId7"/>
+      <w:headerReference w:type="default" r:id="rId8"/>
       <w:pgSz w:w="12240" w:h="15840"/>
       <w:pgMar w:top="1440" w:right="1440" w:bottom="1440" w:left="1440" w:header="708" w:footer="708" w:gutter="0"/>
       <w:cols w:space="708"/>
@@ -180,6 +1148,7 @@
         <w:docPartUnique/>
       </w:docPartObj>
     </w:sdtPr>
+    <w:sdtEndPr/>
     <w:sdtContent>
       <w:p>
         <w:pPr>
@@ -213,6 +1182,996 @@
     </w:pPr>
   </w:p>
 </w:hdr>
+</file>
+
+<file path=word/numbering.xml><?xml version="1.0" encoding="utf-8"?>
+<w:numbering xmlns:wpc="http://schemas.microsoft.com/office/word/2010/wordprocessingCanvas" xmlns:cx="http://schemas.microsoft.com/office/drawing/2014/chartex" xmlns:cx1="http://schemas.microsoft.com/office/drawing/2015/9/8/chartex" xmlns:cx2="http://schemas.microsoft.com/office/drawing/2015/10/21/chartex" xmlns:cx3="http://schemas.microsoft.com/office/drawing/2016/5/9/chartex" xmlns:cx4="http://schemas.microsoft.com/office/drawing/2016/5/10/chartex" xmlns:cx5="http://schemas.microsoft.com/office/drawing/2016/5/11/chartex" xmlns:cx6="http://schemas.microsoft.com/office/drawing/2016/5/12/chartex" xmlns:cx7="http://schemas.microsoft.com/office/drawing/2016/5/13/chartex" xmlns:cx8="http://schemas.microsoft.com/office/drawing/2016/5/14/chartex" xmlns:mc="http://schemas.openxmlformats.org/markup-compatibility/2006" xmlns:aink="http://schemas.microsoft.com/office/drawing/2016/ink" xmlns:am3d="http://schemas.microsoft.com/office/drawing/2017/model3d" xmlns:o="urn:schemas-microsoft-com:office:office" xmlns:r="http://schemas.openxmlformats.org/officeDocument/2006/relationships" xmlns:m="http://schemas.openxmlformats.org/officeDocument/2006/math" xmlns:v="urn:schemas-microsoft-com:vml" xmlns:wp14="http://schemas.microsoft.com/office/word/2010/wordprocessingDrawing" xmlns:wp="http://schemas.openxmlformats.org/drawingml/2006/wordprocessingDrawing" xmlns:w10="urn:schemas-microsoft-com:office:word" xmlns:w="http://schemas.openxmlformats.org/wordprocessingml/2006/main" xmlns:w14="http://schemas.microsoft.com/office/word/2010/wordml" xmlns:w15="http://schemas.microsoft.com/office/word/2012/wordml" xmlns:w16cex="http://schemas.microsoft.com/office/word/2018/wordml/cex" xmlns:w16cid="http://schemas.microsoft.com/office/word/2016/wordml/cid" xmlns:w16="http://schemas.microsoft.com/office/word/2018/wordml" xmlns:w16sdtdh="http://schemas.microsoft.com/office/word/2020/wordml/sdtdatahash" xmlns:w16se="http://schemas.microsoft.com/office/word/2015/wordml/symex" xmlns:wpg="http://schemas.microsoft.com/office/word/2010/wordprocessingGroup" xmlns:wpi="http://schemas.microsoft.com/office/word/2010/wordprocessingInk" xmlns:wne="http://schemas.microsoft.com/office/word/2006/wordml" xmlns:wps="http://schemas.microsoft.com/office/word/2010/wordprocessingShape" mc:Ignorable="w14 w15 w16se w16cid w16 w16cex w16sdtdh wp14">
+  <w:abstractNum w:abstractNumId="0" w15:restartNumberingAfterBreak="0">
+    <w:nsid w:val="010844F0"/>
+    <w:multiLevelType w:val="hybridMultilevel"/>
+    <w:tmpl w:val="F3BE4834"/>
+    <w:lvl w:ilvl="0" w:tplc="04090001">
+      <w:start w:val="1"/>
+      <w:numFmt w:val="bullet"/>
+      <w:lvlText w:val=""/>
+      <w:lvlJc w:val="left"/>
+      <w:pPr>
+        <w:ind w:left="1440" w:hanging="360"/>
+      </w:pPr>
+      <w:rPr>
+        <w:rFonts w:ascii="Symbol" w:hAnsi="Symbol" w:hint="default"/>
+      </w:rPr>
+    </w:lvl>
+    <w:lvl w:ilvl="1" w:tplc="04090003" w:tentative="1">
+      <w:start w:val="1"/>
+      <w:numFmt w:val="bullet"/>
+      <w:lvlText w:val="o"/>
+      <w:lvlJc w:val="left"/>
+      <w:pPr>
+        <w:ind w:left="2160" w:hanging="360"/>
+      </w:pPr>
+      <w:rPr>
+        <w:rFonts w:ascii="Courier New" w:hAnsi="Courier New" w:cs="Courier New" w:hint="default"/>
+      </w:rPr>
+    </w:lvl>
+    <w:lvl w:ilvl="2" w:tplc="04090005" w:tentative="1">
+      <w:start w:val="1"/>
+      <w:numFmt w:val="bullet"/>
+      <w:lvlText w:val=""/>
+      <w:lvlJc w:val="left"/>
+      <w:pPr>
+        <w:ind w:left="2880" w:hanging="360"/>
+      </w:pPr>
+      <w:rPr>
+        <w:rFonts w:ascii="Wingdings" w:hAnsi="Wingdings" w:hint="default"/>
+      </w:rPr>
+    </w:lvl>
+    <w:lvl w:ilvl="3" w:tplc="04090001" w:tentative="1">
+      <w:start w:val="1"/>
+      <w:numFmt w:val="bullet"/>
+      <w:lvlText w:val=""/>
+      <w:lvlJc w:val="left"/>
+      <w:pPr>
+        <w:ind w:left="3600" w:hanging="360"/>
+      </w:pPr>
+      <w:rPr>
+        <w:rFonts w:ascii="Symbol" w:hAnsi="Symbol" w:hint="default"/>
+      </w:rPr>
+    </w:lvl>
+    <w:lvl w:ilvl="4" w:tplc="04090003" w:tentative="1">
+      <w:start w:val="1"/>
+      <w:numFmt w:val="bullet"/>
+      <w:lvlText w:val="o"/>
+      <w:lvlJc w:val="left"/>
+      <w:pPr>
+        <w:ind w:left="4320" w:hanging="360"/>
+      </w:pPr>
+      <w:rPr>
+        <w:rFonts w:ascii="Courier New" w:hAnsi="Courier New" w:cs="Courier New" w:hint="default"/>
+      </w:rPr>
+    </w:lvl>
+    <w:lvl w:ilvl="5" w:tplc="04090005" w:tentative="1">
+      <w:start w:val="1"/>
+      <w:numFmt w:val="bullet"/>
+      <w:lvlText w:val=""/>
+      <w:lvlJc w:val="left"/>
+      <w:pPr>
+        <w:ind w:left="5040" w:hanging="360"/>
+      </w:pPr>
+      <w:rPr>
+        <w:rFonts w:ascii="Wingdings" w:hAnsi="Wingdings" w:hint="default"/>
+      </w:rPr>
+    </w:lvl>
+    <w:lvl w:ilvl="6" w:tplc="04090001" w:tentative="1">
+      <w:start w:val="1"/>
+      <w:numFmt w:val="bullet"/>
+      <w:lvlText w:val=""/>
+      <w:lvlJc w:val="left"/>
+      <w:pPr>
+        <w:ind w:left="5760" w:hanging="360"/>
+      </w:pPr>
+      <w:rPr>
+        <w:rFonts w:ascii="Symbol" w:hAnsi="Symbol" w:hint="default"/>
+      </w:rPr>
+    </w:lvl>
+    <w:lvl w:ilvl="7" w:tplc="04090003" w:tentative="1">
+      <w:start w:val="1"/>
+      <w:numFmt w:val="bullet"/>
+      <w:lvlText w:val="o"/>
+      <w:lvlJc w:val="left"/>
+      <w:pPr>
+        <w:ind w:left="6480" w:hanging="360"/>
+      </w:pPr>
+      <w:rPr>
+        <w:rFonts w:ascii="Courier New" w:hAnsi="Courier New" w:cs="Courier New" w:hint="default"/>
+      </w:rPr>
+    </w:lvl>
+    <w:lvl w:ilvl="8" w:tplc="04090005" w:tentative="1">
+      <w:start w:val="1"/>
+      <w:numFmt w:val="bullet"/>
+      <w:lvlText w:val=""/>
+      <w:lvlJc w:val="left"/>
+      <w:pPr>
+        <w:ind w:left="7200" w:hanging="360"/>
+      </w:pPr>
+      <w:rPr>
+        <w:rFonts w:ascii="Wingdings" w:hAnsi="Wingdings" w:hint="default"/>
+      </w:rPr>
+    </w:lvl>
+  </w:abstractNum>
+  <w:abstractNum w:abstractNumId="1" w15:restartNumberingAfterBreak="0">
+    <w:nsid w:val="06564D58"/>
+    <w:multiLevelType w:val="multilevel"/>
+    <w:tmpl w:val="C75CB73A"/>
+    <w:lvl w:ilvl="0">
+      <w:start w:val="1"/>
+      <w:numFmt w:val="bullet"/>
+      <w:lvlText w:val=""/>
+      <w:lvlJc w:val="left"/>
+      <w:pPr>
+        <w:tabs>
+          <w:tab w:val="num" w:pos="720"/>
+        </w:tabs>
+        <w:ind w:left="720" w:hanging="360"/>
+      </w:pPr>
+      <w:rPr>
+        <w:rFonts w:ascii="Symbol" w:hAnsi="Symbol" w:hint="default"/>
+        <w:sz w:val="20"/>
+      </w:rPr>
+    </w:lvl>
+    <w:lvl w:ilvl="1" w:tentative="1">
+      <w:start w:val="1"/>
+      <w:numFmt w:val="bullet"/>
+      <w:lvlText w:val="o"/>
+      <w:lvlJc w:val="left"/>
+      <w:pPr>
+        <w:tabs>
+          <w:tab w:val="num" w:pos="1440"/>
+        </w:tabs>
+        <w:ind w:left="1440" w:hanging="360"/>
+      </w:pPr>
+      <w:rPr>
+        <w:rFonts w:ascii="Courier New" w:hAnsi="Courier New" w:hint="default"/>
+        <w:sz w:val="20"/>
+      </w:rPr>
+    </w:lvl>
+    <w:lvl w:ilvl="2" w:tentative="1">
+      <w:start w:val="1"/>
+      <w:numFmt w:val="bullet"/>
+      <w:lvlText w:val=""/>
+      <w:lvlJc w:val="left"/>
+      <w:pPr>
+        <w:tabs>
+          <w:tab w:val="num" w:pos="2160"/>
+        </w:tabs>
+        <w:ind w:left="2160" w:hanging="360"/>
+      </w:pPr>
+      <w:rPr>
+        <w:rFonts w:ascii="Wingdings" w:hAnsi="Wingdings" w:hint="default"/>
+        <w:sz w:val="20"/>
+      </w:rPr>
+    </w:lvl>
+    <w:lvl w:ilvl="3" w:tentative="1">
+      <w:start w:val="1"/>
+      <w:numFmt w:val="bullet"/>
+      <w:lvlText w:val=""/>
+      <w:lvlJc w:val="left"/>
+      <w:pPr>
+        <w:tabs>
+          <w:tab w:val="num" w:pos="2880"/>
+        </w:tabs>
+        <w:ind w:left="2880" w:hanging="360"/>
+      </w:pPr>
+      <w:rPr>
+        <w:rFonts w:ascii="Wingdings" w:hAnsi="Wingdings" w:hint="default"/>
+        <w:sz w:val="20"/>
+      </w:rPr>
+    </w:lvl>
+    <w:lvl w:ilvl="4" w:tentative="1">
+      <w:start w:val="1"/>
+      <w:numFmt w:val="bullet"/>
+      <w:lvlText w:val=""/>
+      <w:lvlJc w:val="left"/>
+      <w:pPr>
+        <w:tabs>
+          <w:tab w:val="num" w:pos="3600"/>
+        </w:tabs>
+        <w:ind w:left="3600" w:hanging="360"/>
+      </w:pPr>
+      <w:rPr>
+        <w:rFonts w:ascii="Wingdings" w:hAnsi="Wingdings" w:hint="default"/>
+        <w:sz w:val="20"/>
+      </w:rPr>
+    </w:lvl>
+    <w:lvl w:ilvl="5" w:tentative="1">
+      <w:start w:val="1"/>
+      <w:numFmt w:val="bullet"/>
+      <w:lvlText w:val=""/>
+      <w:lvlJc w:val="left"/>
+      <w:pPr>
+        <w:tabs>
+          <w:tab w:val="num" w:pos="4320"/>
+        </w:tabs>
+        <w:ind w:left="4320" w:hanging="360"/>
+      </w:pPr>
+      <w:rPr>
+        <w:rFonts w:ascii="Wingdings" w:hAnsi="Wingdings" w:hint="default"/>
+        <w:sz w:val="20"/>
+      </w:rPr>
+    </w:lvl>
+    <w:lvl w:ilvl="6" w:tentative="1">
+      <w:start w:val="1"/>
+      <w:numFmt w:val="bullet"/>
+      <w:lvlText w:val=""/>
+      <w:lvlJc w:val="left"/>
+      <w:pPr>
+        <w:tabs>
+          <w:tab w:val="num" w:pos="5040"/>
+        </w:tabs>
+        <w:ind w:left="5040" w:hanging="360"/>
+      </w:pPr>
+      <w:rPr>
+        <w:rFonts w:ascii="Wingdings" w:hAnsi="Wingdings" w:hint="default"/>
+        <w:sz w:val="20"/>
+      </w:rPr>
+    </w:lvl>
+    <w:lvl w:ilvl="7" w:tentative="1">
+      <w:start w:val="1"/>
+      <w:numFmt w:val="bullet"/>
+      <w:lvlText w:val=""/>
+      <w:lvlJc w:val="left"/>
+      <w:pPr>
+        <w:tabs>
+          <w:tab w:val="num" w:pos="5760"/>
+        </w:tabs>
+        <w:ind w:left="5760" w:hanging="360"/>
+      </w:pPr>
+      <w:rPr>
+        <w:rFonts w:ascii="Wingdings" w:hAnsi="Wingdings" w:hint="default"/>
+        <w:sz w:val="20"/>
+      </w:rPr>
+    </w:lvl>
+    <w:lvl w:ilvl="8" w:tentative="1">
+      <w:start w:val="1"/>
+      <w:numFmt w:val="bullet"/>
+      <w:lvlText w:val=""/>
+      <w:lvlJc w:val="left"/>
+      <w:pPr>
+        <w:tabs>
+          <w:tab w:val="num" w:pos="6480"/>
+        </w:tabs>
+        <w:ind w:left="6480" w:hanging="360"/>
+      </w:pPr>
+      <w:rPr>
+        <w:rFonts w:ascii="Wingdings" w:hAnsi="Wingdings" w:hint="default"/>
+        <w:sz w:val="20"/>
+      </w:rPr>
+    </w:lvl>
+  </w:abstractNum>
+  <w:abstractNum w:abstractNumId="2" w15:restartNumberingAfterBreak="0">
+    <w:nsid w:val="21BA1B13"/>
+    <w:multiLevelType w:val="hybridMultilevel"/>
+    <w:tmpl w:val="8520873A"/>
+    <w:lvl w:ilvl="0" w:tplc="0409000F">
+      <w:start w:val="1"/>
+      <w:numFmt w:val="decimal"/>
+      <w:lvlText w:val="%1."/>
+      <w:lvlJc w:val="left"/>
+      <w:pPr>
+        <w:ind w:left="2160" w:hanging="360"/>
+      </w:pPr>
+    </w:lvl>
+    <w:lvl w:ilvl="1" w:tplc="04090019" w:tentative="1">
+      <w:start w:val="1"/>
+      <w:numFmt w:val="lowerLetter"/>
+      <w:lvlText w:val="%2."/>
+      <w:lvlJc w:val="left"/>
+      <w:pPr>
+        <w:ind w:left="2880" w:hanging="360"/>
+      </w:pPr>
+    </w:lvl>
+    <w:lvl w:ilvl="2" w:tplc="0409001B" w:tentative="1">
+      <w:start w:val="1"/>
+      <w:numFmt w:val="lowerRoman"/>
+      <w:lvlText w:val="%3."/>
+      <w:lvlJc w:val="right"/>
+      <w:pPr>
+        <w:ind w:left="3600" w:hanging="180"/>
+      </w:pPr>
+    </w:lvl>
+    <w:lvl w:ilvl="3" w:tplc="0409000F" w:tentative="1">
+      <w:start w:val="1"/>
+      <w:numFmt w:val="decimal"/>
+      <w:lvlText w:val="%4."/>
+      <w:lvlJc w:val="left"/>
+      <w:pPr>
+        <w:ind w:left="4320" w:hanging="360"/>
+      </w:pPr>
+    </w:lvl>
+    <w:lvl w:ilvl="4" w:tplc="04090019" w:tentative="1">
+      <w:start w:val="1"/>
+      <w:numFmt w:val="lowerLetter"/>
+      <w:lvlText w:val="%5."/>
+      <w:lvlJc w:val="left"/>
+      <w:pPr>
+        <w:ind w:left="5040" w:hanging="360"/>
+      </w:pPr>
+    </w:lvl>
+    <w:lvl w:ilvl="5" w:tplc="0409001B" w:tentative="1">
+      <w:start w:val="1"/>
+      <w:numFmt w:val="lowerRoman"/>
+      <w:lvlText w:val="%6."/>
+      <w:lvlJc w:val="right"/>
+      <w:pPr>
+        <w:ind w:left="5760" w:hanging="180"/>
+      </w:pPr>
+    </w:lvl>
+    <w:lvl w:ilvl="6" w:tplc="0409000F" w:tentative="1">
+      <w:start w:val="1"/>
+      <w:numFmt w:val="decimal"/>
+      <w:lvlText w:val="%7."/>
+      <w:lvlJc w:val="left"/>
+      <w:pPr>
+        <w:ind w:left="6480" w:hanging="360"/>
+      </w:pPr>
+    </w:lvl>
+    <w:lvl w:ilvl="7" w:tplc="04090019" w:tentative="1">
+      <w:start w:val="1"/>
+      <w:numFmt w:val="lowerLetter"/>
+      <w:lvlText w:val="%8."/>
+      <w:lvlJc w:val="left"/>
+      <w:pPr>
+        <w:ind w:left="7200" w:hanging="360"/>
+      </w:pPr>
+    </w:lvl>
+    <w:lvl w:ilvl="8" w:tplc="0409001B" w:tentative="1">
+      <w:start w:val="1"/>
+      <w:numFmt w:val="lowerRoman"/>
+      <w:lvlText w:val="%9."/>
+      <w:lvlJc w:val="right"/>
+      <w:pPr>
+        <w:ind w:left="7920" w:hanging="180"/>
+      </w:pPr>
+    </w:lvl>
+  </w:abstractNum>
+  <w:abstractNum w:abstractNumId="3" w15:restartNumberingAfterBreak="0">
+    <w:nsid w:val="3B241C37"/>
+    <w:multiLevelType w:val="hybridMultilevel"/>
+    <w:tmpl w:val="5CB02D7A"/>
+    <w:lvl w:ilvl="0" w:tplc="04090001">
+      <w:start w:val="1"/>
+      <w:numFmt w:val="bullet"/>
+      <w:lvlText w:val=""/>
+      <w:lvlJc w:val="left"/>
+      <w:pPr>
+        <w:ind w:left="1440" w:hanging="360"/>
+      </w:pPr>
+      <w:rPr>
+        <w:rFonts w:ascii="Symbol" w:hAnsi="Symbol" w:hint="default"/>
+      </w:rPr>
+    </w:lvl>
+    <w:lvl w:ilvl="1" w:tplc="04090003" w:tentative="1">
+      <w:start w:val="1"/>
+      <w:numFmt w:val="bullet"/>
+      <w:lvlText w:val="o"/>
+      <w:lvlJc w:val="left"/>
+      <w:pPr>
+        <w:ind w:left="2160" w:hanging="360"/>
+      </w:pPr>
+      <w:rPr>
+        <w:rFonts w:ascii="Courier New" w:hAnsi="Courier New" w:cs="Courier New" w:hint="default"/>
+      </w:rPr>
+    </w:lvl>
+    <w:lvl w:ilvl="2" w:tplc="04090005" w:tentative="1">
+      <w:start w:val="1"/>
+      <w:numFmt w:val="bullet"/>
+      <w:lvlText w:val=""/>
+      <w:lvlJc w:val="left"/>
+      <w:pPr>
+        <w:ind w:left="2880" w:hanging="360"/>
+      </w:pPr>
+      <w:rPr>
+        <w:rFonts w:ascii="Wingdings" w:hAnsi="Wingdings" w:hint="default"/>
+      </w:rPr>
+    </w:lvl>
+    <w:lvl w:ilvl="3" w:tplc="04090001" w:tentative="1">
+      <w:start w:val="1"/>
+      <w:numFmt w:val="bullet"/>
+      <w:lvlText w:val=""/>
+      <w:lvlJc w:val="left"/>
+      <w:pPr>
+        <w:ind w:left="3600" w:hanging="360"/>
+      </w:pPr>
+      <w:rPr>
+        <w:rFonts w:ascii="Symbol" w:hAnsi="Symbol" w:hint="default"/>
+      </w:rPr>
+    </w:lvl>
+    <w:lvl w:ilvl="4" w:tplc="04090003" w:tentative="1">
+      <w:start w:val="1"/>
+      <w:numFmt w:val="bullet"/>
+      <w:lvlText w:val="o"/>
+      <w:lvlJc w:val="left"/>
+      <w:pPr>
+        <w:ind w:left="4320" w:hanging="360"/>
+      </w:pPr>
+      <w:rPr>
+        <w:rFonts w:ascii="Courier New" w:hAnsi="Courier New" w:cs="Courier New" w:hint="default"/>
+      </w:rPr>
+    </w:lvl>
+    <w:lvl w:ilvl="5" w:tplc="04090005" w:tentative="1">
+      <w:start w:val="1"/>
+      <w:numFmt w:val="bullet"/>
+      <w:lvlText w:val=""/>
+      <w:lvlJc w:val="left"/>
+      <w:pPr>
+        <w:ind w:left="5040" w:hanging="360"/>
+      </w:pPr>
+      <w:rPr>
+        <w:rFonts w:ascii="Wingdings" w:hAnsi="Wingdings" w:hint="default"/>
+      </w:rPr>
+    </w:lvl>
+    <w:lvl w:ilvl="6" w:tplc="04090001" w:tentative="1">
+      <w:start w:val="1"/>
+      <w:numFmt w:val="bullet"/>
+      <w:lvlText w:val=""/>
+      <w:lvlJc w:val="left"/>
+      <w:pPr>
+        <w:ind w:left="5760" w:hanging="360"/>
+      </w:pPr>
+      <w:rPr>
+        <w:rFonts w:ascii="Symbol" w:hAnsi="Symbol" w:hint="default"/>
+      </w:rPr>
+    </w:lvl>
+    <w:lvl w:ilvl="7" w:tplc="04090003" w:tentative="1">
+      <w:start w:val="1"/>
+      <w:numFmt w:val="bullet"/>
+      <w:lvlText w:val="o"/>
+      <w:lvlJc w:val="left"/>
+      <w:pPr>
+        <w:ind w:left="6480" w:hanging="360"/>
+      </w:pPr>
+      <w:rPr>
+        <w:rFonts w:ascii="Courier New" w:hAnsi="Courier New" w:cs="Courier New" w:hint="default"/>
+      </w:rPr>
+    </w:lvl>
+    <w:lvl w:ilvl="8" w:tplc="04090005" w:tentative="1">
+      <w:start w:val="1"/>
+      <w:numFmt w:val="bullet"/>
+      <w:lvlText w:val=""/>
+      <w:lvlJc w:val="left"/>
+      <w:pPr>
+        <w:ind w:left="7200" w:hanging="360"/>
+      </w:pPr>
+      <w:rPr>
+        <w:rFonts w:ascii="Wingdings" w:hAnsi="Wingdings" w:hint="default"/>
+      </w:rPr>
+    </w:lvl>
+  </w:abstractNum>
+  <w:abstractNum w:abstractNumId="4" w15:restartNumberingAfterBreak="0">
+    <w:nsid w:val="5680300B"/>
+    <w:multiLevelType w:val="multilevel"/>
+    <w:tmpl w:val="AB92B60E"/>
+    <w:lvl w:ilvl="0">
+      <w:start w:val="1"/>
+      <w:numFmt w:val="bullet"/>
+      <w:lvlText w:val=""/>
+      <w:lvlJc w:val="left"/>
+      <w:pPr>
+        <w:tabs>
+          <w:tab w:val="num" w:pos="720"/>
+        </w:tabs>
+        <w:ind w:left="720" w:hanging="360"/>
+      </w:pPr>
+      <w:rPr>
+        <w:rFonts w:ascii="Symbol" w:hAnsi="Symbol" w:hint="default"/>
+        <w:sz w:val="20"/>
+      </w:rPr>
+    </w:lvl>
+    <w:lvl w:ilvl="1" w:tentative="1">
+      <w:start w:val="1"/>
+      <w:numFmt w:val="bullet"/>
+      <w:lvlText w:val="o"/>
+      <w:lvlJc w:val="left"/>
+      <w:pPr>
+        <w:tabs>
+          <w:tab w:val="num" w:pos="1440"/>
+        </w:tabs>
+        <w:ind w:left="1440" w:hanging="360"/>
+      </w:pPr>
+      <w:rPr>
+        <w:rFonts w:ascii="Courier New" w:hAnsi="Courier New" w:hint="default"/>
+        <w:sz w:val="20"/>
+      </w:rPr>
+    </w:lvl>
+    <w:lvl w:ilvl="2" w:tentative="1">
+      <w:start w:val="1"/>
+      <w:numFmt w:val="bullet"/>
+      <w:lvlText w:val=""/>
+      <w:lvlJc w:val="left"/>
+      <w:pPr>
+        <w:tabs>
+          <w:tab w:val="num" w:pos="2160"/>
+        </w:tabs>
+        <w:ind w:left="2160" w:hanging="360"/>
+      </w:pPr>
+      <w:rPr>
+        <w:rFonts w:ascii="Wingdings" w:hAnsi="Wingdings" w:hint="default"/>
+        <w:sz w:val="20"/>
+      </w:rPr>
+    </w:lvl>
+    <w:lvl w:ilvl="3" w:tentative="1">
+      <w:start w:val="1"/>
+      <w:numFmt w:val="bullet"/>
+      <w:lvlText w:val=""/>
+      <w:lvlJc w:val="left"/>
+      <w:pPr>
+        <w:tabs>
+          <w:tab w:val="num" w:pos="2880"/>
+        </w:tabs>
+        <w:ind w:left="2880" w:hanging="360"/>
+      </w:pPr>
+      <w:rPr>
+        <w:rFonts w:ascii="Wingdings" w:hAnsi="Wingdings" w:hint="default"/>
+        <w:sz w:val="20"/>
+      </w:rPr>
+    </w:lvl>
+    <w:lvl w:ilvl="4" w:tentative="1">
+      <w:start w:val="1"/>
+      <w:numFmt w:val="bullet"/>
+      <w:lvlText w:val=""/>
+      <w:lvlJc w:val="left"/>
+      <w:pPr>
+        <w:tabs>
+          <w:tab w:val="num" w:pos="3600"/>
+        </w:tabs>
+        <w:ind w:left="3600" w:hanging="360"/>
+      </w:pPr>
+      <w:rPr>
+        <w:rFonts w:ascii="Wingdings" w:hAnsi="Wingdings" w:hint="default"/>
+        <w:sz w:val="20"/>
+      </w:rPr>
+    </w:lvl>
+    <w:lvl w:ilvl="5" w:tentative="1">
+      <w:start w:val="1"/>
+      <w:numFmt w:val="bullet"/>
+      <w:lvlText w:val=""/>
+      <w:lvlJc w:val="left"/>
+      <w:pPr>
+        <w:tabs>
+          <w:tab w:val="num" w:pos="4320"/>
+        </w:tabs>
+        <w:ind w:left="4320" w:hanging="360"/>
+      </w:pPr>
+      <w:rPr>
+        <w:rFonts w:ascii="Wingdings" w:hAnsi="Wingdings" w:hint="default"/>
+        <w:sz w:val="20"/>
+      </w:rPr>
+    </w:lvl>
+    <w:lvl w:ilvl="6" w:tentative="1">
+      <w:start w:val="1"/>
+      <w:numFmt w:val="bullet"/>
+      <w:lvlText w:val=""/>
+      <w:lvlJc w:val="left"/>
+      <w:pPr>
+        <w:tabs>
+          <w:tab w:val="num" w:pos="5040"/>
+        </w:tabs>
+        <w:ind w:left="5040" w:hanging="360"/>
+      </w:pPr>
+      <w:rPr>
+        <w:rFonts w:ascii="Wingdings" w:hAnsi="Wingdings" w:hint="default"/>
+        <w:sz w:val="20"/>
+      </w:rPr>
+    </w:lvl>
+    <w:lvl w:ilvl="7" w:tentative="1">
+      <w:start w:val="1"/>
+      <w:numFmt w:val="bullet"/>
+      <w:lvlText w:val=""/>
+      <w:lvlJc w:val="left"/>
+      <w:pPr>
+        <w:tabs>
+          <w:tab w:val="num" w:pos="5760"/>
+        </w:tabs>
+        <w:ind w:left="5760" w:hanging="360"/>
+      </w:pPr>
+      <w:rPr>
+        <w:rFonts w:ascii="Wingdings" w:hAnsi="Wingdings" w:hint="default"/>
+        <w:sz w:val="20"/>
+      </w:rPr>
+    </w:lvl>
+    <w:lvl w:ilvl="8" w:tentative="1">
+      <w:start w:val="1"/>
+      <w:numFmt w:val="bullet"/>
+      <w:lvlText w:val=""/>
+      <w:lvlJc w:val="left"/>
+      <w:pPr>
+        <w:tabs>
+          <w:tab w:val="num" w:pos="6480"/>
+        </w:tabs>
+        <w:ind w:left="6480" w:hanging="360"/>
+      </w:pPr>
+      <w:rPr>
+        <w:rFonts w:ascii="Wingdings" w:hAnsi="Wingdings" w:hint="default"/>
+        <w:sz w:val="20"/>
+      </w:rPr>
+    </w:lvl>
+  </w:abstractNum>
+  <w:abstractNum w:abstractNumId="5" w15:restartNumberingAfterBreak="0">
+    <w:nsid w:val="66841202"/>
+    <w:multiLevelType w:val="multilevel"/>
+    <w:tmpl w:val="2618EDDE"/>
+    <w:lvl w:ilvl="0">
+      <w:start w:val="1"/>
+      <w:numFmt w:val="bullet"/>
+      <w:lvlText w:val=""/>
+      <w:lvlJc w:val="left"/>
+      <w:pPr>
+        <w:tabs>
+          <w:tab w:val="num" w:pos="720"/>
+        </w:tabs>
+        <w:ind w:left="720" w:hanging="360"/>
+      </w:pPr>
+      <w:rPr>
+        <w:rFonts w:ascii="Symbol" w:hAnsi="Symbol" w:hint="default"/>
+        <w:sz w:val="20"/>
+      </w:rPr>
+    </w:lvl>
+    <w:lvl w:ilvl="1" w:tentative="1">
+      <w:start w:val="1"/>
+      <w:numFmt w:val="bullet"/>
+      <w:lvlText w:val="o"/>
+      <w:lvlJc w:val="left"/>
+      <w:pPr>
+        <w:tabs>
+          <w:tab w:val="num" w:pos="1440"/>
+        </w:tabs>
+        <w:ind w:left="1440" w:hanging="360"/>
+      </w:pPr>
+      <w:rPr>
+        <w:rFonts w:ascii="Courier New" w:hAnsi="Courier New" w:hint="default"/>
+        <w:sz w:val="20"/>
+      </w:rPr>
+    </w:lvl>
+    <w:lvl w:ilvl="2" w:tentative="1">
+      <w:start w:val="1"/>
+      <w:numFmt w:val="bullet"/>
+      <w:lvlText w:val=""/>
+      <w:lvlJc w:val="left"/>
+      <w:pPr>
+        <w:tabs>
+          <w:tab w:val="num" w:pos="2160"/>
+        </w:tabs>
+        <w:ind w:left="2160" w:hanging="360"/>
+      </w:pPr>
+      <w:rPr>
+        <w:rFonts w:ascii="Wingdings" w:hAnsi="Wingdings" w:hint="default"/>
+        <w:sz w:val="20"/>
+      </w:rPr>
+    </w:lvl>
+    <w:lvl w:ilvl="3" w:tentative="1">
+      <w:start w:val="1"/>
+      <w:numFmt w:val="bullet"/>
+      <w:lvlText w:val=""/>
+      <w:lvlJc w:val="left"/>
+      <w:pPr>
+        <w:tabs>
+          <w:tab w:val="num" w:pos="2880"/>
+        </w:tabs>
+        <w:ind w:left="2880" w:hanging="360"/>
+      </w:pPr>
+      <w:rPr>
+        <w:rFonts w:ascii="Wingdings" w:hAnsi="Wingdings" w:hint="default"/>
+        <w:sz w:val="20"/>
+      </w:rPr>
+    </w:lvl>
+    <w:lvl w:ilvl="4" w:tentative="1">
+      <w:start w:val="1"/>
+      <w:numFmt w:val="bullet"/>
+      <w:lvlText w:val=""/>
+      <w:lvlJc w:val="left"/>
+      <w:pPr>
+        <w:tabs>
+          <w:tab w:val="num" w:pos="3600"/>
+        </w:tabs>
+        <w:ind w:left="3600" w:hanging="360"/>
+      </w:pPr>
+      <w:rPr>
+        <w:rFonts w:ascii="Wingdings" w:hAnsi="Wingdings" w:hint="default"/>
+        <w:sz w:val="20"/>
+      </w:rPr>
+    </w:lvl>
+    <w:lvl w:ilvl="5" w:tentative="1">
+      <w:start w:val="1"/>
+      <w:numFmt w:val="bullet"/>
+      <w:lvlText w:val=""/>
+      <w:lvlJc w:val="left"/>
+      <w:pPr>
+        <w:tabs>
+          <w:tab w:val="num" w:pos="4320"/>
+        </w:tabs>
+        <w:ind w:left="4320" w:hanging="360"/>
+      </w:pPr>
+      <w:rPr>
+        <w:rFonts w:ascii="Wingdings" w:hAnsi="Wingdings" w:hint="default"/>
+        <w:sz w:val="20"/>
+      </w:rPr>
+    </w:lvl>
+    <w:lvl w:ilvl="6" w:tentative="1">
+      <w:start w:val="1"/>
+      <w:numFmt w:val="bullet"/>
+      <w:lvlText w:val=""/>
+      <w:lvlJc w:val="left"/>
+      <w:pPr>
+        <w:tabs>
+          <w:tab w:val="num" w:pos="5040"/>
+        </w:tabs>
+        <w:ind w:left="5040" w:hanging="360"/>
+      </w:pPr>
+      <w:rPr>
+        <w:rFonts w:ascii="Wingdings" w:hAnsi="Wingdings" w:hint="default"/>
+        <w:sz w:val="20"/>
+      </w:rPr>
+    </w:lvl>
+    <w:lvl w:ilvl="7" w:tentative="1">
+      <w:start w:val="1"/>
+      <w:numFmt w:val="bullet"/>
+      <w:lvlText w:val=""/>
+      <w:lvlJc w:val="left"/>
+      <w:pPr>
+        <w:tabs>
+          <w:tab w:val="num" w:pos="5760"/>
+        </w:tabs>
+        <w:ind w:left="5760" w:hanging="360"/>
+      </w:pPr>
+      <w:rPr>
+        <w:rFonts w:ascii="Wingdings" w:hAnsi="Wingdings" w:hint="default"/>
+        <w:sz w:val="20"/>
+      </w:rPr>
+    </w:lvl>
+    <w:lvl w:ilvl="8" w:tentative="1">
+      <w:start w:val="1"/>
+      <w:numFmt w:val="bullet"/>
+      <w:lvlText w:val=""/>
+      <w:lvlJc w:val="left"/>
+      <w:pPr>
+        <w:tabs>
+          <w:tab w:val="num" w:pos="6480"/>
+        </w:tabs>
+        <w:ind w:left="6480" w:hanging="360"/>
+      </w:pPr>
+      <w:rPr>
+        <w:rFonts w:ascii="Wingdings" w:hAnsi="Wingdings" w:hint="default"/>
+        <w:sz w:val="20"/>
+      </w:rPr>
+    </w:lvl>
+  </w:abstractNum>
+  <w:abstractNum w:abstractNumId="6" w15:restartNumberingAfterBreak="0">
+    <w:nsid w:val="6D940B6B"/>
+    <w:multiLevelType w:val="hybridMultilevel"/>
+    <w:tmpl w:val="5658D946"/>
+    <w:lvl w:ilvl="0" w:tplc="09429044">
+      <w:start w:val="1"/>
+      <w:numFmt w:val="upperRoman"/>
+      <w:lvlText w:val="%1."/>
+      <w:lvlJc w:val="left"/>
+      <w:pPr>
+        <w:ind w:left="1440" w:hanging="720"/>
+      </w:pPr>
+      <w:rPr>
+        <w:rFonts w:hint="default"/>
+      </w:rPr>
+    </w:lvl>
+    <w:lvl w:ilvl="1" w:tplc="04090019" w:tentative="1">
+      <w:start w:val="1"/>
+      <w:numFmt w:val="lowerLetter"/>
+      <w:lvlText w:val="%2."/>
+      <w:lvlJc w:val="left"/>
+      <w:pPr>
+        <w:ind w:left="1800" w:hanging="360"/>
+      </w:pPr>
+    </w:lvl>
+    <w:lvl w:ilvl="2" w:tplc="0409001B" w:tentative="1">
+      <w:start w:val="1"/>
+      <w:numFmt w:val="lowerRoman"/>
+      <w:lvlText w:val="%3."/>
+      <w:lvlJc w:val="right"/>
+      <w:pPr>
+        <w:ind w:left="2520" w:hanging="180"/>
+      </w:pPr>
+    </w:lvl>
+    <w:lvl w:ilvl="3" w:tplc="0409000F" w:tentative="1">
+      <w:start w:val="1"/>
+      <w:numFmt w:val="decimal"/>
+      <w:lvlText w:val="%4."/>
+      <w:lvlJc w:val="left"/>
+      <w:pPr>
+        <w:ind w:left="3240" w:hanging="360"/>
+      </w:pPr>
+    </w:lvl>
+    <w:lvl w:ilvl="4" w:tplc="04090019" w:tentative="1">
+      <w:start w:val="1"/>
+      <w:numFmt w:val="lowerLetter"/>
+      <w:lvlText w:val="%5."/>
+      <w:lvlJc w:val="left"/>
+      <w:pPr>
+        <w:ind w:left="3960" w:hanging="360"/>
+      </w:pPr>
+    </w:lvl>
+    <w:lvl w:ilvl="5" w:tplc="0409001B" w:tentative="1">
+      <w:start w:val="1"/>
+      <w:numFmt w:val="lowerRoman"/>
+      <w:lvlText w:val="%6."/>
+      <w:lvlJc w:val="right"/>
+      <w:pPr>
+        <w:ind w:left="4680" w:hanging="180"/>
+      </w:pPr>
+    </w:lvl>
+    <w:lvl w:ilvl="6" w:tplc="0409000F" w:tentative="1">
+      <w:start w:val="1"/>
+      <w:numFmt w:val="decimal"/>
+      <w:lvlText w:val="%7."/>
+      <w:lvlJc w:val="left"/>
+      <w:pPr>
+        <w:ind w:left="5400" w:hanging="360"/>
+      </w:pPr>
+    </w:lvl>
+    <w:lvl w:ilvl="7" w:tplc="04090019" w:tentative="1">
+      <w:start w:val="1"/>
+      <w:numFmt w:val="lowerLetter"/>
+      <w:lvlText w:val="%8."/>
+      <w:lvlJc w:val="left"/>
+      <w:pPr>
+        <w:ind w:left="6120" w:hanging="360"/>
+      </w:pPr>
+    </w:lvl>
+    <w:lvl w:ilvl="8" w:tplc="0409001B" w:tentative="1">
+      <w:start w:val="1"/>
+      <w:numFmt w:val="lowerRoman"/>
+      <w:lvlText w:val="%9."/>
+      <w:lvlJc w:val="right"/>
+      <w:pPr>
+        <w:ind w:left="6840" w:hanging="180"/>
+      </w:pPr>
+    </w:lvl>
+  </w:abstractNum>
+  <w:abstractNum w:abstractNumId="7" w15:restartNumberingAfterBreak="0">
+    <w:nsid w:val="72347A5D"/>
+    <w:multiLevelType w:val="hybridMultilevel"/>
+    <w:tmpl w:val="5F1C5312"/>
+    <w:lvl w:ilvl="0" w:tplc="04090001">
+      <w:start w:val="1"/>
+      <w:numFmt w:val="bullet"/>
+      <w:lvlText w:val=""/>
+      <w:lvlJc w:val="left"/>
+      <w:pPr>
+        <w:ind w:left="1440" w:hanging="360"/>
+      </w:pPr>
+      <w:rPr>
+        <w:rFonts w:ascii="Symbol" w:hAnsi="Symbol" w:hint="default"/>
+      </w:rPr>
+    </w:lvl>
+    <w:lvl w:ilvl="1" w:tplc="04090003" w:tentative="1">
+      <w:start w:val="1"/>
+      <w:numFmt w:val="bullet"/>
+      <w:lvlText w:val="o"/>
+      <w:lvlJc w:val="left"/>
+      <w:pPr>
+        <w:ind w:left="2160" w:hanging="360"/>
+      </w:pPr>
+      <w:rPr>
+        <w:rFonts w:ascii="Courier New" w:hAnsi="Courier New" w:cs="Courier New" w:hint="default"/>
+      </w:rPr>
+    </w:lvl>
+    <w:lvl w:ilvl="2" w:tplc="04090005" w:tentative="1">
+      <w:start w:val="1"/>
+      <w:numFmt w:val="bullet"/>
+      <w:lvlText w:val=""/>
+      <w:lvlJc w:val="left"/>
+      <w:pPr>
+        <w:ind w:left="2880" w:hanging="360"/>
+      </w:pPr>
+      <w:rPr>
+        <w:rFonts w:ascii="Wingdings" w:hAnsi="Wingdings" w:hint="default"/>
+      </w:rPr>
+    </w:lvl>
+    <w:lvl w:ilvl="3" w:tplc="04090001" w:tentative="1">
+      <w:start w:val="1"/>
+      <w:numFmt w:val="bullet"/>
+      <w:lvlText w:val=""/>
+      <w:lvlJc w:val="left"/>
+      <w:pPr>
+        <w:ind w:left="3600" w:hanging="360"/>
+      </w:pPr>
+      <w:rPr>
+        <w:rFonts w:ascii="Symbol" w:hAnsi="Symbol" w:hint="default"/>
+      </w:rPr>
+    </w:lvl>
+    <w:lvl w:ilvl="4" w:tplc="04090003" w:tentative="1">
+      <w:start w:val="1"/>
+      <w:numFmt w:val="bullet"/>
+      <w:lvlText w:val="o"/>
+      <w:lvlJc w:val="left"/>
+      <w:pPr>
+        <w:ind w:left="4320" w:hanging="360"/>
+      </w:pPr>
+      <w:rPr>
+        <w:rFonts w:ascii="Courier New" w:hAnsi="Courier New" w:cs="Courier New" w:hint="default"/>
+      </w:rPr>
+    </w:lvl>
+    <w:lvl w:ilvl="5" w:tplc="04090005" w:tentative="1">
+      <w:start w:val="1"/>
+      <w:numFmt w:val="bullet"/>
+      <w:lvlText w:val=""/>
+      <w:lvlJc w:val="left"/>
+      <w:pPr>
+        <w:ind w:left="5040" w:hanging="360"/>
+      </w:pPr>
+      <w:rPr>
+        <w:rFonts w:ascii="Wingdings" w:hAnsi="Wingdings" w:hint="default"/>
+      </w:rPr>
+    </w:lvl>
+    <w:lvl w:ilvl="6" w:tplc="04090001" w:tentative="1">
+      <w:start w:val="1"/>
+      <w:numFmt w:val="bullet"/>
+      <w:lvlText w:val=""/>
+      <w:lvlJc w:val="left"/>
+      <w:pPr>
+        <w:ind w:left="5760" w:hanging="360"/>
+      </w:pPr>
+      <w:rPr>
+        <w:rFonts w:ascii="Symbol" w:hAnsi="Symbol" w:hint="default"/>
+      </w:rPr>
+    </w:lvl>
+    <w:lvl w:ilvl="7" w:tplc="04090003" w:tentative="1">
+      <w:start w:val="1"/>
+      <w:numFmt w:val="bullet"/>
+      <w:lvlText w:val="o"/>
+      <w:lvlJc w:val="left"/>
+      <w:pPr>
+        <w:ind w:left="6480" w:hanging="360"/>
+      </w:pPr>
+      <w:rPr>
+        <w:rFonts w:ascii="Courier New" w:hAnsi="Courier New" w:cs="Courier New" w:hint="default"/>
+      </w:rPr>
+    </w:lvl>
+    <w:lvl w:ilvl="8" w:tplc="04090005" w:tentative="1">
+      <w:start w:val="1"/>
+      <w:numFmt w:val="bullet"/>
+      <w:lvlText w:val=""/>
+      <w:lvlJc w:val="left"/>
+      <w:pPr>
+        <w:ind w:left="7200" w:hanging="360"/>
+      </w:pPr>
+      <w:rPr>
+        <w:rFonts w:ascii="Wingdings" w:hAnsi="Wingdings" w:hint="default"/>
+      </w:rPr>
+    </w:lvl>
+  </w:abstractNum>
+  <w:num w:numId="1">
+    <w:abstractNumId w:val="6"/>
+  </w:num>
+  <w:num w:numId="2">
+    <w:abstractNumId w:val="1"/>
+  </w:num>
+  <w:num w:numId="3">
+    <w:abstractNumId w:val="4"/>
+  </w:num>
+  <w:num w:numId="4">
+    <w:abstractNumId w:val="5"/>
+  </w:num>
+  <w:num w:numId="5">
+    <w:abstractNumId w:val="7"/>
+  </w:num>
+  <w:num w:numId="6">
+    <w:abstractNumId w:val="3"/>
+  </w:num>
+  <w:num w:numId="7">
+    <w:abstractNumId w:val="0"/>
+  </w:num>
+  <w:num w:numId="8">
+    <w:abstractNumId w:val="2"/>
+  </w:num>
+</w:numbering>
 </file>
 
 <file path=word/styles.xml><?xml version="1.0" encoding="utf-8"?>
@@ -648,10 +2607,52 @@
       <w:szCs w:val="32"/>
     </w:rPr>
   </w:style>
+  <w:style w:type="paragraph" w:styleId="Ttulo2">
+    <w:name w:val="heading 2"/>
+    <w:basedOn w:val="Normal"/>
+    <w:next w:val="Normal"/>
+    <w:link w:val="Ttulo2Car"/>
+    <w:uiPriority w:val="9"/>
+    <w:unhideWhenUsed/>
+    <w:qFormat/>
+    <w:rsid w:val="00F67A42"/>
+    <w:pPr>
+      <w:keepNext/>
+      <w:keepLines/>
+      <w:spacing w:before="40" w:after="0"/>
+      <w:outlineLvl w:val="1"/>
+    </w:pPr>
+    <w:rPr>
+      <w:rFonts w:eastAsiaTheme="majorEastAsia" w:cstheme="majorBidi"/>
+      <w:b/>
+      <w:szCs w:val="26"/>
+    </w:rPr>
+  </w:style>
+  <w:style w:type="paragraph" w:styleId="Ttulo3">
+    <w:name w:val="heading 3"/>
+    <w:basedOn w:val="Normal"/>
+    <w:next w:val="Normal"/>
+    <w:link w:val="Ttulo3Car"/>
+    <w:uiPriority w:val="9"/>
+    <w:semiHidden/>
+    <w:unhideWhenUsed/>
+    <w:qFormat/>
+    <w:rsid w:val="00F67A42"/>
+    <w:pPr>
+      <w:keepNext/>
+      <w:keepLines/>
+      <w:spacing w:before="40" w:after="0"/>
+      <w:outlineLvl w:val="2"/>
+    </w:pPr>
+    <w:rPr>
+      <w:rFonts w:asciiTheme="majorHAnsi" w:eastAsiaTheme="majorEastAsia" w:hAnsiTheme="majorHAnsi" w:cstheme="majorBidi"/>
+      <w:color w:val="1F3763" w:themeColor="accent1" w:themeShade="7F"/>
+      <w:szCs w:val="24"/>
+    </w:rPr>
+  </w:style>
   <w:style w:type="character" w:default="1" w:styleId="Fuentedeprrafopredeter">
     <w:name w:val="Default Paragraph Font"/>
     <w:uiPriority w:val="1"/>
-    <w:semiHidden/>
     <w:unhideWhenUsed/>
   </w:style>
   <w:style w:type="table" w:default="1" w:styleId="Tablanormal">
@@ -731,6 +2732,76 @@
       <w:sz w:val="32"/>
       <w:szCs w:val="32"/>
     </w:rPr>
+  </w:style>
+  <w:style w:type="character" w:customStyle="1" w:styleId="Ttulo3Car">
+    <w:name w:val="Título 3 Car"/>
+    <w:basedOn w:val="Fuentedeprrafopredeter"/>
+    <w:link w:val="Ttulo3"/>
+    <w:uiPriority w:val="9"/>
+    <w:semiHidden/>
+    <w:rsid w:val="00F67A42"/>
+    <w:rPr>
+      <w:rFonts w:asciiTheme="majorHAnsi" w:eastAsiaTheme="majorEastAsia" w:hAnsiTheme="majorHAnsi" w:cstheme="majorBidi"/>
+      <w:color w:val="1F3763" w:themeColor="accent1" w:themeShade="7F"/>
+      <w:sz w:val="24"/>
+      <w:szCs w:val="24"/>
+    </w:rPr>
+  </w:style>
+  <w:style w:type="paragraph" w:styleId="NormalWeb">
+    <w:name w:val="Normal (Web)"/>
+    <w:basedOn w:val="Normal"/>
+    <w:uiPriority w:val="99"/>
+    <w:semiHidden/>
+    <w:unhideWhenUsed/>
+    <w:rsid w:val="00F67A42"/>
+    <w:pPr>
+      <w:spacing w:before="100" w:beforeAutospacing="1" w:after="100" w:afterAutospacing="1" w:line="240" w:lineRule="auto"/>
+      <w:ind w:firstLine="0"/>
+      <w:jc w:val="left"/>
+    </w:pPr>
+    <w:rPr>
+      <w:rFonts w:eastAsia="Times New Roman" w:cs="Times New Roman"/>
+      <w:kern w:val="0"/>
+      <w:szCs w:val="24"/>
+      <w14:ligatures w14:val="none"/>
+    </w:rPr>
+  </w:style>
+  <w:style w:type="character" w:styleId="CdigoHTML">
+    <w:name w:val="HTML Code"/>
+    <w:basedOn w:val="Fuentedeprrafopredeter"/>
+    <w:uiPriority w:val="99"/>
+    <w:semiHidden/>
+    <w:unhideWhenUsed/>
+    <w:rsid w:val="00F67A42"/>
+    <w:rPr>
+      <w:rFonts w:ascii="Courier New" w:eastAsia="Times New Roman" w:hAnsi="Courier New" w:cs="Courier New"/>
+      <w:sz w:val="20"/>
+      <w:szCs w:val="20"/>
+    </w:rPr>
+  </w:style>
+  <w:style w:type="character" w:customStyle="1" w:styleId="Ttulo2Car">
+    <w:name w:val="Título 2 Car"/>
+    <w:basedOn w:val="Fuentedeprrafopredeter"/>
+    <w:link w:val="Ttulo2"/>
+    <w:uiPriority w:val="9"/>
+    <w:rsid w:val="00F67A42"/>
+    <w:rPr>
+      <w:rFonts w:ascii="Times New Roman" w:eastAsiaTheme="majorEastAsia" w:hAnsi="Times New Roman" w:cstheme="majorBidi"/>
+      <w:b/>
+      <w:sz w:val="24"/>
+      <w:szCs w:val="26"/>
+    </w:rPr>
+  </w:style>
+  <w:style w:type="paragraph" w:styleId="Prrafodelista">
+    <w:name w:val="List Paragraph"/>
+    <w:basedOn w:val="Normal"/>
+    <w:uiPriority w:val="34"/>
+    <w:qFormat/>
+    <w:rsid w:val="00F67A42"/>
+    <w:pPr>
+      <w:ind w:left="720"/>
+      <w:contextualSpacing/>
+    </w:pPr>
   </w:style>
 </w:styles>
 </file>

</xml_diff>

<commit_message>
Formatos y Estructuras del trabajo. relacionado al #4
</commit_message>
<xml_diff>
--- a/Documentos/Practicas.docx
+++ b/Documentos/Practicas.docx
@@ -1091,6 +1091,554 @@
     </w:p>
     <w:p>
       <w:pPr>
+        <w:rPr>
+          <w:lang w:val="es-VE"/>
+        </w:rPr>
+      </w:pPr>
+    </w:p>
+    <w:p>
+      <w:pPr>
+        <w:pStyle w:val="Ttulo1"/>
+      </w:pPr>
+      <w:r>
+        <w:t xml:space="preserve">II. </w:t>
+      </w:r>
+      <w:proofErr w:type="spellStart"/>
+      <w:r>
+        <w:t>Formatos</w:t>
+      </w:r>
+      <w:proofErr w:type="spellEnd"/>
+      <w:r>
+        <w:t xml:space="preserve"> y </w:t>
+      </w:r>
+      <w:proofErr w:type="spellStart"/>
+      <w:r>
+        <w:t>Estructura</w:t>
+      </w:r>
+      <w:proofErr w:type="spellEnd"/>
+      <w:r>
+        <w:t xml:space="preserve"> del </w:t>
+      </w:r>
+      <w:proofErr w:type="spellStart"/>
+      <w:r>
+        <w:t>Trabajo</w:t>
+      </w:r>
+      <w:proofErr w:type="spellEnd"/>
+    </w:p>
+    <w:p>
+      <w:pPr>
+        <w:rPr>
+          <w:lang w:val="es-VE"/>
+        </w:rPr>
+      </w:pPr>
+      <w:r>
+        <w:rPr>
+          <w:lang w:val="es-VE"/>
+        </w:rPr>
+        <w:t xml:space="preserve">La presentación visual y estructural de un documento refleja el nivel de profesionalismo del equipo. </w:t>
+      </w:r>
+      <w:r>
+        <w:rPr>
+          <w:lang w:val="es-VE"/>
+        </w:rPr>
+        <w:t xml:space="preserve">Hacer que </w:t>
+      </w:r>
+      <w:r>
+        <w:rPr>
+          <w:lang w:val="es-VE"/>
+        </w:rPr>
+        <w:t xml:space="preserve">el formato </w:t>
+      </w:r>
+      <w:r>
+        <w:rPr>
+          <w:lang w:val="es-VE"/>
+        </w:rPr>
+        <w:t xml:space="preserve">ese unificado </w:t>
+      </w:r>
+      <w:r>
+        <w:rPr>
+          <w:lang w:val="es-VE"/>
+        </w:rPr>
+        <w:t>desde el principio evita horas de corrección en la fase final del proyecto.</w:t>
+      </w:r>
+    </w:p>
+    <w:p>
+      <w:pPr>
+        <w:pStyle w:val="Ttulo2"/>
+        <w:ind w:firstLine="0"/>
+        <w:rPr>
+          <w:lang w:val="es-VE"/>
+        </w:rPr>
+      </w:pPr>
+      <w:r>
+        <w:rPr>
+          <w:lang w:val="es-VE"/>
+        </w:rPr>
+        <w:t xml:space="preserve"> Estructura Académica Estándar</w:t>
+      </w:r>
+    </w:p>
+    <w:p>
+      <w:pPr>
+        <w:rPr>
+          <w:lang w:val="es-VE"/>
+        </w:rPr>
+      </w:pPr>
+      <w:r>
+        <w:rPr>
+          <w:lang w:val="es-VE"/>
+        </w:rPr>
+        <w:t>Todo trabajo universitario debe seguir una jerarquía lógica que facilite su lectura y evaluación. Salvo que el docente especifique lo contrario, la estructura base debe incluir:</w:t>
+      </w:r>
+    </w:p>
+    <w:p>
+      <w:pPr>
+        <w:pStyle w:val="Prrafodelista"/>
+        <w:numPr>
+          <w:ilvl w:val="0"/>
+          <w:numId w:val="11"/>
+        </w:numPr>
+        <w:rPr>
+          <w:lang w:val="es-VE"/>
+        </w:rPr>
+      </w:pPr>
+      <w:r>
+        <w:rPr>
+          <w:b/>
+          <w:bCs/>
+          <w:lang w:val="es-VE"/>
+        </w:rPr>
+        <w:t xml:space="preserve">Página de </w:t>
+      </w:r>
+      <w:proofErr w:type="gramStart"/>
+      <w:r>
+        <w:rPr>
+          <w:b/>
+          <w:bCs/>
+          <w:lang w:val="es-VE"/>
+        </w:rPr>
+        <w:t xml:space="preserve">Presentación </w:t>
+      </w:r>
+      <w:r>
+        <w:rPr>
+          <w:b/>
+          <w:bCs/>
+          <w:lang w:val="es-VE"/>
+        </w:rPr>
+        <w:t>:</w:t>
+      </w:r>
+      <w:proofErr w:type="gramEnd"/>
+      <w:r>
+        <w:rPr>
+          <w:b/>
+          <w:bCs/>
+          <w:lang w:val="es-VE"/>
+        </w:rPr>
+        <w:t xml:space="preserve"> </w:t>
+      </w:r>
+      <w:r>
+        <w:rPr>
+          <w:lang w:val="es-VE"/>
+        </w:rPr>
+        <w:t xml:space="preserve">Título del proyecto, nombre de la institución, </w:t>
+      </w:r>
+      <w:proofErr w:type="spellStart"/>
+      <w:r>
+        <w:rPr>
+          <w:lang w:val="es-VE"/>
+        </w:rPr>
+        <w:t>integrantescon</w:t>
+      </w:r>
+      <w:proofErr w:type="spellEnd"/>
+      <w:r>
+        <w:rPr>
+          <w:lang w:val="es-VE"/>
+        </w:rPr>
+        <w:t xml:space="preserve"> sus respectivos roles o números de identidad</w:t>
+      </w:r>
+      <w:r>
+        <w:rPr>
+          <w:lang w:val="es-VE"/>
+        </w:rPr>
+        <w:t>,</w:t>
+      </w:r>
+      <w:r>
+        <w:rPr>
+          <w:lang w:val="es-VE"/>
+        </w:rPr>
+        <w:t xml:space="preserve"> fecha de entrega.</w:t>
+      </w:r>
+    </w:p>
+    <w:p>
+      <w:pPr>
+        <w:pStyle w:val="Prrafodelista"/>
+        <w:numPr>
+          <w:ilvl w:val="0"/>
+          <w:numId w:val="11"/>
+        </w:numPr>
+        <w:rPr>
+          <w:lang w:val="es-VE"/>
+        </w:rPr>
+      </w:pPr>
+      <w:r>
+        <w:rPr>
+          <w:b/>
+          <w:bCs/>
+          <w:lang w:val="es-VE"/>
+        </w:rPr>
+        <w:t>Tabla de Contenido:</w:t>
+      </w:r>
+      <w:r>
+        <w:rPr>
+          <w:lang w:val="es-VE"/>
+        </w:rPr>
+        <w:t xml:space="preserve"> Generada de forma automática (usando las herramientas de Word) para reflejar la paginación exacta.</w:t>
+      </w:r>
+    </w:p>
+    <w:p>
+      <w:pPr>
+        <w:pStyle w:val="Prrafodelista"/>
+        <w:numPr>
+          <w:ilvl w:val="0"/>
+          <w:numId w:val="11"/>
+        </w:numPr>
+        <w:rPr>
+          <w:lang w:val="es-VE"/>
+        </w:rPr>
+      </w:pPr>
+      <w:r>
+        <w:rPr>
+          <w:b/>
+          <w:bCs/>
+          <w:lang w:val="es-VE"/>
+        </w:rPr>
+        <w:t>Cuerpo del Documento:</w:t>
+      </w:r>
+      <w:r>
+        <w:rPr>
+          <w:lang w:val="es-VE"/>
+        </w:rPr>
+        <w:t xml:space="preserve"> Dividido en Introducción, Objetivos, Desarrollo (Marco Teórico/Metodología), Conclusiones y </w:t>
+      </w:r>
+      <w:r>
+        <w:rPr>
+          <w:lang w:val="es-VE"/>
+        </w:rPr>
+        <w:t>r</w:t>
+      </w:r>
+      <w:r>
+        <w:rPr>
+          <w:lang w:val="es-VE"/>
+        </w:rPr>
+        <w:t>ecomendaciones.</w:t>
+      </w:r>
+    </w:p>
+    <w:p>
+      <w:pPr>
+        <w:pStyle w:val="Prrafodelista"/>
+        <w:numPr>
+          <w:ilvl w:val="0"/>
+          <w:numId w:val="11"/>
+        </w:numPr>
+        <w:rPr>
+          <w:lang w:val="es-VE"/>
+        </w:rPr>
+      </w:pPr>
+      <w:r>
+        <w:rPr>
+          <w:b/>
+          <w:bCs/>
+          <w:lang w:val="es-VE"/>
+        </w:rPr>
+        <w:t>Anexos y Referencias:</w:t>
+      </w:r>
+      <w:r>
+        <w:rPr>
+          <w:lang w:val="es-VE"/>
+        </w:rPr>
+        <w:t xml:space="preserve"> Material de apoyo y listado de fuentes consultadas.</w:t>
+      </w:r>
+    </w:p>
+    <w:p>
+      <w:pPr>
+        <w:pStyle w:val="Ttulo2"/>
+        <w:rPr>
+          <w:lang w:val="es-VE"/>
+        </w:rPr>
+      </w:pPr>
+      <w:r>
+        <w:rPr>
+          <w:lang w:val="es-VE"/>
+        </w:rPr>
+        <w:t>Aplicación de Normas de Formato</w:t>
+      </w:r>
+    </w:p>
+    <w:p>
+      <w:pPr>
+        <w:rPr>
+          <w:lang w:val="es-VE"/>
+        </w:rPr>
+      </w:pPr>
+      <w:r>
+        <w:rPr>
+          <w:lang w:val="es-VE"/>
+        </w:rPr>
+        <w:t xml:space="preserve">Para garantizar la estandarización, todos los miembros del equipo deben configurar sus procesadores de texto con las mismas reglas antes de empezar a escribir. </w:t>
+      </w:r>
+      <w:r>
+        <w:rPr>
+          <w:lang w:val="es-VE"/>
+        </w:rPr>
+        <w:t xml:space="preserve">Se recomienda el uso de las </w:t>
+      </w:r>
+      <w:r>
+        <w:rPr>
+          <w:b/>
+          <w:bCs/>
+          <w:lang w:val="es-VE"/>
+        </w:rPr>
+        <w:t>Normas APA</w:t>
+      </w:r>
+      <w:r>
+        <w:rPr>
+          <w:b/>
+          <w:bCs/>
+          <w:lang w:val="es-VE"/>
+        </w:rPr>
+        <w:t xml:space="preserve"> </w:t>
+      </w:r>
+      <w:r>
+        <w:rPr>
+          <w:b/>
+          <w:bCs/>
+          <w:lang w:val="es-VE"/>
+        </w:rPr>
+        <w:t xml:space="preserve">7ma </w:t>
+      </w:r>
+      <w:proofErr w:type="gramStart"/>
+      <w:r>
+        <w:rPr>
+          <w:b/>
+          <w:bCs/>
+          <w:lang w:val="es-VE"/>
+        </w:rPr>
+        <w:t xml:space="preserve">edición </w:t>
+      </w:r>
+      <w:r>
+        <w:rPr>
+          <w:lang w:val="es-VE"/>
+        </w:rPr>
+        <w:t>:</w:t>
+      </w:r>
+      <w:proofErr w:type="gramEnd"/>
+    </w:p>
+    <w:p>
+      <w:pPr>
+        <w:pStyle w:val="Prrafodelista"/>
+        <w:numPr>
+          <w:ilvl w:val="0"/>
+          <w:numId w:val="13"/>
+        </w:numPr>
+        <w:rPr>
+          <w:lang w:val="es-VE"/>
+        </w:rPr>
+      </w:pPr>
+      <w:r>
+        <w:rPr>
+          <w:b/>
+          <w:bCs/>
+          <w:lang w:val="es-VE"/>
+        </w:rPr>
+        <w:t>Tipografía:</w:t>
+      </w:r>
+      <w:r>
+        <w:rPr>
+          <w:lang w:val="es-VE"/>
+        </w:rPr>
+        <w:t xml:space="preserve"> Times New </w:t>
+      </w:r>
+      <w:proofErr w:type="spellStart"/>
+      <w:r>
+        <w:rPr>
+          <w:lang w:val="es-VE"/>
+        </w:rPr>
+        <w:t>Roman</w:t>
+      </w:r>
+      <w:proofErr w:type="spellEnd"/>
+      <w:r>
+        <w:rPr>
+          <w:lang w:val="es-VE"/>
+        </w:rPr>
+        <w:t xml:space="preserve"> (12 </w:t>
+      </w:r>
+      <w:proofErr w:type="spellStart"/>
+      <w:r>
+        <w:rPr>
+          <w:lang w:val="es-VE"/>
+        </w:rPr>
+        <w:t>pts</w:t>
+      </w:r>
+      <w:proofErr w:type="spellEnd"/>
+      <w:r>
+        <w:rPr>
+          <w:lang w:val="es-VE"/>
+        </w:rPr>
+        <w:t xml:space="preserve">) o Arial (11 </w:t>
+      </w:r>
+      <w:proofErr w:type="spellStart"/>
+      <w:r>
+        <w:rPr>
+          <w:lang w:val="es-VE"/>
+        </w:rPr>
+        <w:t>pts</w:t>
+      </w:r>
+      <w:proofErr w:type="spellEnd"/>
+      <w:r>
+        <w:rPr>
+          <w:lang w:val="es-VE"/>
+        </w:rPr>
+        <w:t>).</w:t>
+      </w:r>
+    </w:p>
+    <w:p>
+      <w:pPr>
+        <w:pStyle w:val="Prrafodelista"/>
+        <w:numPr>
+          <w:ilvl w:val="0"/>
+          <w:numId w:val="13"/>
+        </w:numPr>
+        <w:rPr>
+          <w:lang w:val="es-VE"/>
+        </w:rPr>
+      </w:pPr>
+      <w:r>
+        <w:rPr>
+          <w:b/>
+          <w:bCs/>
+          <w:lang w:val="es-VE"/>
+        </w:rPr>
+        <w:t>Interlineado:</w:t>
+      </w:r>
+      <w:r>
+        <w:rPr>
+          <w:lang w:val="es-VE"/>
+        </w:rPr>
+        <w:t xml:space="preserve"> doble espacio, sin espacio extra entre párrafos.</w:t>
+      </w:r>
+    </w:p>
+    <w:p>
+      <w:pPr>
+        <w:pStyle w:val="Prrafodelista"/>
+        <w:numPr>
+          <w:ilvl w:val="0"/>
+          <w:numId w:val="13"/>
+        </w:numPr>
+        <w:rPr>
+          <w:lang w:val="es-VE"/>
+        </w:rPr>
+      </w:pPr>
+      <w:r>
+        <w:rPr>
+          <w:b/>
+          <w:bCs/>
+          <w:lang w:val="es-VE"/>
+        </w:rPr>
+        <w:lastRenderedPageBreak/>
+        <w:t>Márgenes:</w:t>
+      </w:r>
+      <w:r>
+        <w:rPr>
+          <w:lang w:val="es-VE"/>
+        </w:rPr>
+        <w:t xml:space="preserve"> 2.54 cm en todos los bordes de la página.</w:t>
+      </w:r>
+    </w:p>
+    <w:p>
+      <w:pPr>
+        <w:pStyle w:val="Prrafodelista"/>
+        <w:numPr>
+          <w:ilvl w:val="0"/>
+          <w:numId w:val="13"/>
+        </w:numPr>
+        <w:rPr>
+          <w:lang w:val="es-VE"/>
+        </w:rPr>
+      </w:pPr>
+      <w:r>
+        <w:rPr>
+          <w:b/>
+          <w:bCs/>
+          <w:lang w:val="es-VE"/>
+        </w:rPr>
+        <w:t>Alineación:</w:t>
+      </w:r>
+      <w:r>
+        <w:rPr>
+          <w:lang w:val="es-VE"/>
+        </w:rPr>
+        <w:t xml:space="preserve"> Justificada o alineada a la izquierda (según la exigencia del profesor), con sangría en la primera línea de cada párrafo.</w:t>
+      </w:r>
+    </w:p>
+    <w:p>
+      <w:pPr>
+        <w:pStyle w:val="Prrafodelista"/>
+        <w:numPr>
+          <w:ilvl w:val="0"/>
+          <w:numId w:val="13"/>
+        </w:numPr>
+        <w:rPr>
+          <w:lang w:val="es-VE"/>
+        </w:rPr>
+      </w:pPr>
+      <w:r>
+        <w:rPr>
+          <w:b/>
+          <w:bCs/>
+          <w:lang w:val="es-VE"/>
+        </w:rPr>
+        <w:t>Numeración de página:</w:t>
+      </w:r>
+      <w:r>
+        <w:rPr>
+          <w:lang w:val="es-VE"/>
+        </w:rPr>
+        <w:t xml:space="preserve"> 3ra opción en la parte </w:t>
+      </w:r>
+      <w:proofErr w:type="spellStart"/>
+      <w:r>
+        <w:rPr>
+          <w:lang w:val="es-VE"/>
+        </w:rPr>
+        <w:t>superiror</w:t>
+      </w:r>
+      <w:proofErr w:type="spellEnd"/>
+      <w:r>
+        <w:rPr>
+          <w:lang w:val="es-VE"/>
+        </w:rPr>
+        <w:t xml:space="preserve"> derecha.</w:t>
+      </w:r>
+    </w:p>
+    <w:p>
+      <w:pPr>
+        <w:pStyle w:val="Prrafodelista"/>
+        <w:numPr>
+          <w:ilvl w:val="0"/>
+          <w:numId w:val="13"/>
+        </w:numPr>
+        <w:rPr>
+          <w:lang w:val="es-VE"/>
+        </w:rPr>
+      </w:pPr>
+      <w:r>
+        <w:rPr>
+          <w:lang w:val="es-VE"/>
+        </w:rPr>
+        <w:t>Citas secundarias Se ponía la fecha de la cita primaria</w:t>
+      </w:r>
+    </w:p>
+    <w:p>
+      <w:pPr>
+        <w:pStyle w:val="Ttulo2"/>
         <w:rPr>
           <w:lang w:val="es-VE"/>
         </w:rPr>
@@ -1475,6 +2023,92 @@
     </w:lvl>
   </w:abstractNum>
   <w:abstractNum w:abstractNumId="2" w15:restartNumberingAfterBreak="0">
+    <w:nsid w:val="15FD2FEA"/>
+    <w:multiLevelType w:val="hybridMultilevel"/>
+    <w:tmpl w:val="BE844D2C"/>
+    <w:lvl w:ilvl="0" w:tplc="0409000F">
+      <w:start w:val="1"/>
+      <w:numFmt w:val="decimal"/>
+      <w:lvlText w:val="%1."/>
+      <w:lvlJc w:val="left"/>
+      <w:pPr>
+        <w:ind w:left="1440" w:hanging="360"/>
+      </w:pPr>
+    </w:lvl>
+    <w:lvl w:ilvl="1" w:tplc="04090019" w:tentative="1">
+      <w:start w:val="1"/>
+      <w:numFmt w:val="lowerLetter"/>
+      <w:lvlText w:val="%2."/>
+      <w:lvlJc w:val="left"/>
+      <w:pPr>
+        <w:ind w:left="2160" w:hanging="360"/>
+      </w:pPr>
+    </w:lvl>
+    <w:lvl w:ilvl="2" w:tplc="0409001B" w:tentative="1">
+      <w:start w:val="1"/>
+      <w:numFmt w:val="lowerRoman"/>
+      <w:lvlText w:val="%3."/>
+      <w:lvlJc w:val="right"/>
+      <w:pPr>
+        <w:ind w:left="2880" w:hanging="180"/>
+      </w:pPr>
+    </w:lvl>
+    <w:lvl w:ilvl="3" w:tplc="0409000F" w:tentative="1">
+      <w:start w:val="1"/>
+      <w:numFmt w:val="decimal"/>
+      <w:lvlText w:val="%4."/>
+      <w:lvlJc w:val="left"/>
+      <w:pPr>
+        <w:ind w:left="3600" w:hanging="360"/>
+      </w:pPr>
+    </w:lvl>
+    <w:lvl w:ilvl="4" w:tplc="04090019" w:tentative="1">
+      <w:start w:val="1"/>
+      <w:numFmt w:val="lowerLetter"/>
+      <w:lvlText w:val="%5."/>
+      <w:lvlJc w:val="left"/>
+      <w:pPr>
+        <w:ind w:left="4320" w:hanging="360"/>
+      </w:pPr>
+    </w:lvl>
+    <w:lvl w:ilvl="5" w:tplc="0409001B" w:tentative="1">
+      <w:start w:val="1"/>
+      <w:numFmt w:val="lowerRoman"/>
+      <w:lvlText w:val="%6."/>
+      <w:lvlJc w:val="right"/>
+      <w:pPr>
+        <w:ind w:left="5040" w:hanging="180"/>
+      </w:pPr>
+    </w:lvl>
+    <w:lvl w:ilvl="6" w:tplc="0409000F" w:tentative="1">
+      <w:start w:val="1"/>
+      <w:numFmt w:val="decimal"/>
+      <w:lvlText w:val="%7."/>
+      <w:lvlJc w:val="left"/>
+      <w:pPr>
+        <w:ind w:left="5760" w:hanging="360"/>
+      </w:pPr>
+    </w:lvl>
+    <w:lvl w:ilvl="7" w:tplc="04090019" w:tentative="1">
+      <w:start w:val="1"/>
+      <w:numFmt w:val="lowerLetter"/>
+      <w:lvlText w:val="%8."/>
+      <w:lvlJc w:val="left"/>
+      <w:pPr>
+        <w:ind w:left="6480" w:hanging="360"/>
+      </w:pPr>
+    </w:lvl>
+    <w:lvl w:ilvl="8" w:tplc="0409001B" w:tentative="1">
+      <w:start w:val="1"/>
+      <w:numFmt w:val="lowerRoman"/>
+      <w:lvlText w:val="%9."/>
+      <w:lvlJc w:val="right"/>
+      <w:pPr>
+        <w:ind w:left="7200" w:hanging="180"/>
+      </w:pPr>
+    </w:lvl>
+  </w:abstractNum>
+  <w:abstractNum w:abstractNumId="3" w15:restartNumberingAfterBreak="0">
     <w:nsid w:val="21BA1B13"/>
     <w:multiLevelType w:val="hybridMultilevel"/>
     <w:tmpl w:val="8520873A"/>
@@ -1560,7 +2194,156 @@
       </w:pPr>
     </w:lvl>
   </w:abstractNum>
-  <w:abstractNum w:abstractNumId="3" w15:restartNumberingAfterBreak="0">
+  <w:abstractNum w:abstractNumId="4" w15:restartNumberingAfterBreak="0">
+    <w:nsid w:val="301D7B33"/>
+    <w:multiLevelType w:val="multilevel"/>
+    <w:tmpl w:val="313E83AC"/>
+    <w:lvl w:ilvl="0">
+      <w:start w:val="1"/>
+      <w:numFmt w:val="bullet"/>
+      <w:lvlText w:val=""/>
+      <w:lvlJc w:val="left"/>
+      <w:pPr>
+        <w:tabs>
+          <w:tab w:val="num" w:pos="720"/>
+        </w:tabs>
+        <w:ind w:left="720" w:hanging="360"/>
+      </w:pPr>
+      <w:rPr>
+        <w:rFonts w:ascii="Symbol" w:hAnsi="Symbol" w:hint="default"/>
+        <w:sz w:val="20"/>
+      </w:rPr>
+    </w:lvl>
+    <w:lvl w:ilvl="1" w:tentative="1">
+      <w:start w:val="1"/>
+      <w:numFmt w:val="bullet"/>
+      <w:lvlText w:val="o"/>
+      <w:lvlJc w:val="left"/>
+      <w:pPr>
+        <w:tabs>
+          <w:tab w:val="num" w:pos="1440"/>
+        </w:tabs>
+        <w:ind w:left="1440" w:hanging="360"/>
+      </w:pPr>
+      <w:rPr>
+        <w:rFonts w:ascii="Courier New" w:hAnsi="Courier New" w:hint="default"/>
+        <w:sz w:val="20"/>
+      </w:rPr>
+    </w:lvl>
+    <w:lvl w:ilvl="2" w:tentative="1">
+      <w:start w:val="1"/>
+      <w:numFmt w:val="bullet"/>
+      <w:lvlText w:val=""/>
+      <w:lvlJc w:val="left"/>
+      <w:pPr>
+        <w:tabs>
+          <w:tab w:val="num" w:pos="2160"/>
+        </w:tabs>
+        <w:ind w:left="2160" w:hanging="360"/>
+      </w:pPr>
+      <w:rPr>
+        <w:rFonts w:ascii="Wingdings" w:hAnsi="Wingdings" w:hint="default"/>
+        <w:sz w:val="20"/>
+      </w:rPr>
+    </w:lvl>
+    <w:lvl w:ilvl="3" w:tentative="1">
+      <w:start w:val="1"/>
+      <w:numFmt w:val="bullet"/>
+      <w:lvlText w:val=""/>
+      <w:lvlJc w:val="left"/>
+      <w:pPr>
+        <w:tabs>
+          <w:tab w:val="num" w:pos="2880"/>
+        </w:tabs>
+        <w:ind w:left="2880" w:hanging="360"/>
+      </w:pPr>
+      <w:rPr>
+        <w:rFonts w:ascii="Wingdings" w:hAnsi="Wingdings" w:hint="default"/>
+        <w:sz w:val="20"/>
+      </w:rPr>
+    </w:lvl>
+    <w:lvl w:ilvl="4" w:tentative="1">
+      <w:start w:val="1"/>
+      <w:numFmt w:val="bullet"/>
+      <w:lvlText w:val=""/>
+      <w:lvlJc w:val="left"/>
+      <w:pPr>
+        <w:tabs>
+          <w:tab w:val="num" w:pos="3600"/>
+        </w:tabs>
+        <w:ind w:left="3600" w:hanging="360"/>
+      </w:pPr>
+      <w:rPr>
+        <w:rFonts w:ascii="Wingdings" w:hAnsi="Wingdings" w:hint="default"/>
+        <w:sz w:val="20"/>
+      </w:rPr>
+    </w:lvl>
+    <w:lvl w:ilvl="5" w:tentative="1">
+      <w:start w:val="1"/>
+      <w:numFmt w:val="bullet"/>
+      <w:lvlText w:val=""/>
+      <w:lvlJc w:val="left"/>
+      <w:pPr>
+        <w:tabs>
+          <w:tab w:val="num" w:pos="4320"/>
+        </w:tabs>
+        <w:ind w:left="4320" w:hanging="360"/>
+      </w:pPr>
+      <w:rPr>
+        <w:rFonts w:ascii="Wingdings" w:hAnsi="Wingdings" w:hint="default"/>
+        <w:sz w:val="20"/>
+      </w:rPr>
+    </w:lvl>
+    <w:lvl w:ilvl="6" w:tentative="1">
+      <w:start w:val="1"/>
+      <w:numFmt w:val="bullet"/>
+      <w:lvlText w:val=""/>
+      <w:lvlJc w:val="left"/>
+      <w:pPr>
+        <w:tabs>
+          <w:tab w:val="num" w:pos="5040"/>
+        </w:tabs>
+        <w:ind w:left="5040" w:hanging="360"/>
+      </w:pPr>
+      <w:rPr>
+        <w:rFonts w:ascii="Wingdings" w:hAnsi="Wingdings" w:hint="default"/>
+        <w:sz w:val="20"/>
+      </w:rPr>
+    </w:lvl>
+    <w:lvl w:ilvl="7" w:tentative="1">
+      <w:start w:val="1"/>
+      <w:numFmt w:val="bullet"/>
+      <w:lvlText w:val=""/>
+      <w:lvlJc w:val="left"/>
+      <w:pPr>
+        <w:tabs>
+          <w:tab w:val="num" w:pos="5760"/>
+        </w:tabs>
+        <w:ind w:left="5760" w:hanging="360"/>
+      </w:pPr>
+      <w:rPr>
+        <w:rFonts w:ascii="Wingdings" w:hAnsi="Wingdings" w:hint="default"/>
+        <w:sz w:val="20"/>
+      </w:rPr>
+    </w:lvl>
+    <w:lvl w:ilvl="8" w:tentative="1">
+      <w:start w:val="1"/>
+      <w:numFmt w:val="bullet"/>
+      <w:lvlText w:val=""/>
+      <w:lvlJc w:val="left"/>
+      <w:pPr>
+        <w:tabs>
+          <w:tab w:val="num" w:pos="6480"/>
+        </w:tabs>
+        <w:ind w:left="6480" w:hanging="360"/>
+      </w:pPr>
+      <w:rPr>
+        <w:rFonts w:ascii="Wingdings" w:hAnsi="Wingdings" w:hint="default"/>
+        <w:sz w:val="20"/>
+      </w:rPr>
+    </w:lvl>
+  </w:abstractNum>
+  <w:abstractNum w:abstractNumId="5" w15:restartNumberingAfterBreak="0">
     <w:nsid w:val="3B241C37"/>
     <w:multiLevelType w:val="hybridMultilevel"/>
     <w:tmpl w:val="5CB02D7A"/>
@@ -1673,7 +2456,120 @@
       </w:rPr>
     </w:lvl>
   </w:abstractNum>
-  <w:abstractNum w:abstractNumId="4" w15:restartNumberingAfterBreak="0">
+  <w:abstractNum w:abstractNumId="6" w15:restartNumberingAfterBreak="0">
+    <w:nsid w:val="54477EF6"/>
+    <w:multiLevelType w:val="hybridMultilevel"/>
+    <w:tmpl w:val="F0DE18D0"/>
+    <w:lvl w:ilvl="0" w:tplc="04090001">
+      <w:start w:val="1"/>
+      <w:numFmt w:val="bullet"/>
+      <w:lvlText w:val=""/>
+      <w:lvlJc w:val="left"/>
+      <w:pPr>
+        <w:ind w:left="1440" w:hanging="360"/>
+      </w:pPr>
+      <w:rPr>
+        <w:rFonts w:ascii="Symbol" w:hAnsi="Symbol" w:hint="default"/>
+      </w:rPr>
+    </w:lvl>
+    <w:lvl w:ilvl="1" w:tplc="04090003" w:tentative="1">
+      <w:start w:val="1"/>
+      <w:numFmt w:val="bullet"/>
+      <w:lvlText w:val="o"/>
+      <w:lvlJc w:val="left"/>
+      <w:pPr>
+        <w:ind w:left="2160" w:hanging="360"/>
+      </w:pPr>
+      <w:rPr>
+        <w:rFonts w:ascii="Courier New" w:hAnsi="Courier New" w:cs="Courier New" w:hint="default"/>
+      </w:rPr>
+    </w:lvl>
+    <w:lvl w:ilvl="2" w:tplc="04090005" w:tentative="1">
+      <w:start w:val="1"/>
+      <w:numFmt w:val="bullet"/>
+      <w:lvlText w:val=""/>
+      <w:lvlJc w:val="left"/>
+      <w:pPr>
+        <w:ind w:left="2880" w:hanging="360"/>
+      </w:pPr>
+      <w:rPr>
+        <w:rFonts w:ascii="Wingdings" w:hAnsi="Wingdings" w:hint="default"/>
+      </w:rPr>
+    </w:lvl>
+    <w:lvl w:ilvl="3" w:tplc="04090001" w:tentative="1">
+      <w:start w:val="1"/>
+      <w:numFmt w:val="bullet"/>
+      <w:lvlText w:val=""/>
+      <w:lvlJc w:val="left"/>
+      <w:pPr>
+        <w:ind w:left="3600" w:hanging="360"/>
+      </w:pPr>
+      <w:rPr>
+        <w:rFonts w:ascii="Symbol" w:hAnsi="Symbol" w:hint="default"/>
+      </w:rPr>
+    </w:lvl>
+    <w:lvl w:ilvl="4" w:tplc="04090003" w:tentative="1">
+      <w:start w:val="1"/>
+      <w:numFmt w:val="bullet"/>
+      <w:lvlText w:val="o"/>
+      <w:lvlJc w:val="left"/>
+      <w:pPr>
+        <w:ind w:left="4320" w:hanging="360"/>
+      </w:pPr>
+      <w:rPr>
+        <w:rFonts w:ascii="Courier New" w:hAnsi="Courier New" w:cs="Courier New" w:hint="default"/>
+      </w:rPr>
+    </w:lvl>
+    <w:lvl w:ilvl="5" w:tplc="04090005" w:tentative="1">
+      <w:start w:val="1"/>
+      <w:numFmt w:val="bullet"/>
+      <w:lvlText w:val=""/>
+      <w:lvlJc w:val="left"/>
+      <w:pPr>
+        <w:ind w:left="5040" w:hanging="360"/>
+      </w:pPr>
+      <w:rPr>
+        <w:rFonts w:ascii="Wingdings" w:hAnsi="Wingdings" w:hint="default"/>
+      </w:rPr>
+    </w:lvl>
+    <w:lvl w:ilvl="6" w:tplc="04090001" w:tentative="1">
+      <w:start w:val="1"/>
+      <w:numFmt w:val="bullet"/>
+      <w:lvlText w:val=""/>
+      <w:lvlJc w:val="left"/>
+      <w:pPr>
+        <w:ind w:left="5760" w:hanging="360"/>
+      </w:pPr>
+      <w:rPr>
+        <w:rFonts w:ascii="Symbol" w:hAnsi="Symbol" w:hint="default"/>
+      </w:rPr>
+    </w:lvl>
+    <w:lvl w:ilvl="7" w:tplc="04090003" w:tentative="1">
+      <w:start w:val="1"/>
+      <w:numFmt w:val="bullet"/>
+      <w:lvlText w:val="o"/>
+      <w:lvlJc w:val="left"/>
+      <w:pPr>
+        <w:ind w:left="6480" w:hanging="360"/>
+      </w:pPr>
+      <w:rPr>
+        <w:rFonts w:ascii="Courier New" w:hAnsi="Courier New" w:cs="Courier New" w:hint="default"/>
+      </w:rPr>
+    </w:lvl>
+    <w:lvl w:ilvl="8" w:tplc="04090005" w:tentative="1">
+      <w:start w:val="1"/>
+      <w:numFmt w:val="bullet"/>
+      <w:lvlText w:val=""/>
+      <w:lvlJc w:val="left"/>
+      <w:pPr>
+        <w:ind w:left="7200" w:hanging="360"/>
+      </w:pPr>
+      <w:rPr>
+        <w:rFonts w:ascii="Wingdings" w:hAnsi="Wingdings" w:hint="default"/>
+      </w:rPr>
+    </w:lvl>
+  </w:abstractNum>
+  <w:abstractNum w:abstractNumId="7" w15:restartNumberingAfterBreak="0">
     <w:nsid w:val="5680300B"/>
     <w:multiLevelType w:val="multilevel"/>
     <w:tmpl w:val="AB92B60E"/>
@@ -1822,7 +2718,7 @@
       </w:rPr>
     </w:lvl>
   </w:abstractNum>
-  <w:abstractNum w:abstractNumId="5" w15:restartNumberingAfterBreak="0">
+  <w:abstractNum w:abstractNumId="8" w15:restartNumberingAfterBreak="0">
     <w:nsid w:val="66841202"/>
     <w:multiLevelType w:val="multilevel"/>
     <w:tmpl w:val="2618EDDE"/>
@@ -1971,7 +2867,7 @@
       </w:rPr>
     </w:lvl>
   </w:abstractNum>
-  <w:abstractNum w:abstractNumId="6" w15:restartNumberingAfterBreak="0">
+  <w:abstractNum w:abstractNumId="9" w15:restartNumberingAfterBreak="0">
     <w:nsid w:val="6D940B6B"/>
     <w:multiLevelType w:val="hybridMultilevel"/>
     <w:tmpl w:val="5658D946"/>
@@ -2060,7 +2956,93 @@
       </w:pPr>
     </w:lvl>
   </w:abstractNum>
-  <w:abstractNum w:abstractNumId="7" w15:restartNumberingAfterBreak="0">
+  <w:abstractNum w:abstractNumId="10" w15:restartNumberingAfterBreak="0">
+    <w:nsid w:val="6E615836"/>
+    <w:multiLevelType w:val="hybridMultilevel"/>
+    <w:tmpl w:val="A0045F34"/>
+    <w:lvl w:ilvl="0" w:tplc="0409000F">
+      <w:start w:val="1"/>
+      <w:numFmt w:val="decimal"/>
+      <w:lvlText w:val="%1."/>
+      <w:lvlJc w:val="left"/>
+      <w:pPr>
+        <w:ind w:left="1440" w:hanging="360"/>
+      </w:pPr>
+    </w:lvl>
+    <w:lvl w:ilvl="1" w:tplc="04090019" w:tentative="1">
+      <w:start w:val="1"/>
+      <w:numFmt w:val="lowerLetter"/>
+      <w:lvlText w:val="%2."/>
+      <w:lvlJc w:val="left"/>
+      <w:pPr>
+        <w:ind w:left="2160" w:hanging="360"/>
+      </w:pPr>
+    </w:lvl>
+    <w:lvl w:ilvl="2" w:tplc="0409001B" w:tentative="1">
+      <w:start w:val="1"/>
+      <w:numFmt w:val="lowerRoman"/>
+      <w:lvlText w:val="%3."/>
+      <w:lvlJc w:val="right"/>
+      <w:pPr>
+        <w:ind w:left="2880" w:hanging="180"/>
+      </w:pPr>
+    </w:lvl>
+    <w:lvl w:ilvl="3" w:tplc="0409000F" w:tentative="1">
+      <w:start w:val="1"/>
+      <w:numFmt w:val="decimal"/>
+      <w:lvlText w:val="%4."/>
+      <w:lvlJc w:val="left"/>
+      <w:pPr>
+        <w:ind w:left="3600" w:hanging="360"/>
+      </w:pPr>
+    </w:lvl>
+    <w:lvl w:ilvl="4" w:tplc="04090019" w:tentative="1">
+      <w:start w:val="1"/>
+      <w:numFmt w:val="lowerLetter"/>
+      <w:lvlText w:val="%5."/>
+      <w:lvlJc w:val="left"/>
+      <w:pPr>
+        <w:ind w:left="4320" w:hanging="360"/>
+      </w:pPr>
+    </w:lvl>
+    <w:lvl w:ilvl="5" w:tplc="0409001B" w:tentative="1">
+      <w:start w:val="1"/>
+      <w:numFmt w:val="lowerRoman"/>
+      <w:lvlText w:val="%6."/>
+      <w:lvlJc w:val="right"/>
+      <w:pPr>
+        <w:ind w:left="5040" w:hanging="180"/>
+      </w:pPr>
+    </w:lvl>
+    <w:lvl w:ilvl="6" w:tplc="0409000F" w:tentative="1">
+      <w:start w:val="1"/>
+      <w:numFmt w:val="decimal"/>
+      <w:lvlText w:val="%7."/>
+      <w:lvlJc w:val="left"/>
+      <w:pPr>
+        <w:ind w:left="5760" w:hanging="360"/>
+      </w:pPr>
+    </w:lvl>
+    <w:lvl w:ilvl="7" w:tplc="04090019" w:tentative="1">
+      <w:start w:val="1"/>
+      <w:numFmt w:val="lowerLetter"/>
+      <w:lvlText w:val="%8."/>
+      <w:lvlJc w:val="left"/>
+      <w:pPr>
+        <w:ind w:left="6480" w:hanging="360"/>
+      </w:pPr>
+    </w:lvl>
+    <w:lvl w:ilvl="8" w:tplc="0409001B" w:tentative="1">
+      <w:start w:val="1"/>
+      <w:numFmt w:val="lowerRoman"/>
+      <w:lvlText w:val="%9."/>
+      <w:lvlJc w:val="right"/>
+      <w:pPr>
+        <w:ind w:left="7200" w:hanging="180"/>
+      </w:pPr>
+    </w:lvl>
+  </w:abstractNum>
+  <w:abstractNum w:abstractNumId="11" w15:restartNumberingAfterBreak="0">
     <w:nsid w:val="72347A5D"/>
     <w:multiLevelType w:val="hybridMultilevel"/>
     <w:tmpl w:val="5F1C5312"/>
@@ -2173,29 +3155,193 @@
       </w:rPr>
     </w:lvl>
   </w:abstractNum>
+  <w:abstractNum w:abstractNumId="12" w15:restartNumberingAfterBreak="0">
+    <w:nsid w:val="774B47E9"/>
+    <w:multiLevelType w:val="multilevel"/>
+    <w:tmpl w:val="1902AA58"/>
+    <w:lvl w:ilvl="0">
+      <w:start w:val="1"/>
+      <w:numFmt w:val="bullet"/>
+      <w:lvlText w:val=""/>
+      <w:lvlJc w:val="left"/>
+      <w:pPr>
+        <w:tabs>
+          <w:tab w:val="num" w:pos="720"/>
+        </w:tabs>
+        <w:ind w:left="720" w:hanging="360"/>
+      </w:pPr>
+      <w:rPr>
+        <w:rFonts w:ascii="Symbol" w:hAnsi="Symbol" w:hint="default"/>
+        <w:sz w:val="20"/>
+      </w:rPr>
+    </w:lvl>
+    <w:lvl w:ilvl="1" w:tentative="1">
+      <w:start w:val="1"/>
+      <w:numFmt w:val="bullet"/>
+      <w:lvlText w:val="o"/>
+      <w:lvlJc w:val="left"/>
+      <w:pPr>
+        <w:tabs>
+          <w:tab w:val="num" w:pos="1440"/>
+        </w:tabs>
+        <w:ind w:left="1440" w:hanging="360"/>
+      </w:pPr>
+      <w:rPr>
+        <w:rFonts w:ascii="Courier New" w:hAnsi="Courier New" w:hint="default"/>
+        <w:sz w:val="20"/>
+      </w:rPr>
+    </w:lvl>
+    <w:lvl w:ilvl="2" w:tentative="1">
+      <w:start w:val="1"/>
+      <w:numFmt w:val="bullet"/>
+      <w:lvlText w:val=""/>
+      <w:lvlJc w:val="left"/>
+      <w:pPr>
+        <w:tabs>
+          <w:tab w:val="num" w:pos="2160"/>
+        </w:tabs>
+        <w:ind w:left="2160" w:hanging="360"/>
+      </w:pPr>
+      <w:rPr>
+        <w:rFonts w:ascii="Wingdings" w:hAnsi="Wingdings" w:hint="default"/>
+        <w:sz w:val="20"/>
+      </w:rPr>
+    </w:lvl>
+    <w:lvl w:ilvl="3" w:tentative="1">
+      <w:start w:val="1"/>
+      <w:numFmt w:val="bullet"/>
+      <w:lvlText w:val=""/>
+      <w:lvlJc w:val="left"/>
+      <w:pPr>
+        <w:tabs>
+          <w:tab w:val="num" w:pos="2880"/>
+        </w:tabs>
+        <w:ind w:left="2880" w:hanging="360"/>
+      </w:pPr>
+      <w:rPr>
+        <w:rFonts w:ascii="Wingdings" w:hAnsi="Wingdings" w:hint="default"/>
+        <w:sz w:val="20"/>
+      </w:rPr>
+    </w:lvl>
+    <w:lvl w:ilvl="4" w:tentative="1">
+      <w:start w:val="1"/>
+      <w:numFmt w:val="bullet"/>
+      <w:lvlText w:val=""/>
+      <w:lvlJc w:val="left"/>
+      <w:pPr>
+        <w:tabs>
+          <w:tab w:val="num" w:pos="3600"/>
+        </w:tabs>
+        <w:ind w:left="3600" w:hanging="360"/>
+      </w:pPr>
+      <w:rPr>
+        <w:rFonts w:ascii="Wingdings" w:hAnsi="Wingdings" w:hint="default"/>
+        <w:sz w:val="20"/>
+      </w:rPr>
+    </w:lvl>
+    <w:lvl w:ilvl="5" w:tentative="1">
+      <w:start w:val="1"/>
+      <w:numFmt w:val="bullet"/>
+      <w:lvlText w:val=""/>
+      <w:lvlJc w:val="left"/>
+      <w:pPr>
+        <w:tabs>
+          <w:tab w:val="num" w:pos="4320"/>
+        </w:tabs>
+        <w:ind w:left="4320" w:hanging="360"/>
+      </w:pPr>
+      <w:rPr>
+        <w:rFonts w:ascii="Wingdings" w:hAnsi="Wingdings" w:hint="default"/>
+        <w:sz w:val="20"/>
+      </w:rPr>
+    </w:lvl>
+    <w:lvl w:ilvl="6" w:tentative="1">
+      <w:start w:val="1"/>
+      <w:numFmt w:val="bullet"/>
+      <w:lvlText w:val=""/>
+      <w:lvlJc w:val="left"/>
+      <w:pPr>
+        <w:tabs>
+          <w:tab w:val="num" w:pos="5040"/>
+        </w:tabs>
+        <w:ind w:left="5040" w:hanging="360"/>
+      </w:pPr>
+      <w:rPr>
+        <w:rFonts w:ascii="Wingdings" w:hAnsi="Wingdings" w:hint="default"/>
+        <w:sz w:val="20"/>
+      </w:rPr>
+    </w:lvl>
+    <w:lvl w:ilvl="7" w:tentative="1">
+      <w:start w:val="1"/>
+      <w:numFmt w:val="bullet"/>
+      <w:lvlText w:val=""/>
+      <w:lvlJc w:val="left"/>
+      <w:pPr>
+        <w:tabs>
+          <w:tab w:val="num" w:pos="5760"/>
+        </w:tabs>
+        <w:ind w:left="5760" w:hanging="360"/>
+      </w:pPr>
+      <w:rPr>
+        <w:rFonts w:ascii="Wingdings" w:hAnsi="Wingdings" w:hint="default"/>
+        <w:sz w:val="20"/>
+      </w:rPr>
+    </w:lvl>
+    <w:lvl w:ilvl="8" w:tentative="1">
+      <w:start w:val="1"/>
+      <w:numFmt w:val="bullet"/>
+      <w:lvlText w:val=""/>
+      <w:lvlJc w:val="left"/>
+      <w:pPr>
+        <w:tabs>
+          <w:tab w:val="num" w:pos="6480"/>
+        </w:tabs>
+        <w:ind w:left="6480" w:hanging="360"/>
+      </w:pPr>
+      <w:rPr>
+        <w:rFonts w:ascii="Wingdings" w:hAnsi="Wingdings" w:hint="default"/>
+        <w:sz w:val="20"/>
+      </w:rPr>
+    </w:lvl>
+  </w:abstractNum>
   <w:num w:numId="1">
-    <w:abstractNumId w:val="6"/>
+    <w:abstractNumId w:val="9"/>
   </w:num>
   <w:num w:numId="2">
     <w:abstractNumId w:val="1"/>
   </w:num>
   <w:num w:numId="3">
-    <w:abstractNumId w:val="4"/>
+    <w:abstractNumId w:val="7"/>
   </w:num>
   <w:num w:numId="4">
-    <w:abstractNumId w:val="5"/>
+    <w:abstractNumId w:val="8"/>
   </w:num>
   <w:num w:numId="5">
-    <w:abstractNumId w:val="7"/>
+    <w:abstractNumId w:val="11"/>
   </w:num>
   <w:num w:numId="6">
-    <w:abstractNumId w:val="3"/>
+    <w:abstractNumId w:val="5"/>
   </w:num>
   <w:num w:numId="7">
     <w:abstractNumId w:val="0"/>
   </w:num>
   <w:num w:numId="8">
+    <w:abstractNumId w:val="3"/>
+  </w:num>
+  <w:num w:numId="9">
+    <w:abstractNumId w:val="12"/>
+  </w:num>
+  <w:num w:numId="10">
+    <w:abstractNumId w:val="4"/>
+  </w:num>
+  <w:num w:numId="11">
+    <w:abstractNumId w:val="6"/>
+  </w:num>
+  <w:num w:numId="12">
     <w:abstractNumId w:val="2"/>
+  </w:num>
+  <w:num w:numId="13">
+    <w:abstractNumId w:val="10"/>
   </w:num>
 </w:numbering>
 </file>
@@ -2679,7 +3825,6 @@
   <w:style w:type="character" w:default="1" w:styleId="Fuentedeprrafopredeter">
     <w:name w:val="Default Paragraph Font"/>
     <w:uiPriority w:val="1"/>
-    <w:semiHidden/>
     <w:unhideWhenUsed/>
   </w:style>
   <w:style w:type="table" w:default="1" w:styleId="Tablanormal">

</xml_diff>

<commit_message>
revision y Entrega #5
</commit_message>
<xml_diff>
--- a/Documentos/Practicas.docx
+++ b/Documentos/Practicas.docx
@@ -1737,6 +1737,183 @@
           <w:lang w:val="es-VE"/>
         </w:rPr>
         <w:t>ea idéntico en todas las secciones.</w:t>
+      </w:r>
+    </w:p>
+    <w:p>
+      <w:pPr>
+        <w:pStyle w:val="Ttulo1"/>
+        <w:rPr>
+          <w:lang w:val="es-VE"/>
+        </w:rPr>
+      </w:pPr>
+    </w:p>
+    <w:p>
+      <w:pPr>
+        <w:pStyle w:val="Ttulo1"/>
+        <w:rPr>
+          <w:lang w:val="es-VE"/>
+        </w:rPr>
+      </w:pPr>
+    </w:p>
+    <w:p>
+      <w:pPr>
+        <w:pStyle w:val="Ttulo1"/>
+        <w:rPr>
+          <w:lang w:val="es-VE"/>
+        </w:rPr>
+      </w:pPr>
+    </w:p>
+    <w:p>
+      <w:pPr>
+        <w:pStyle w:val="Ttulo1"/>
+        <w:rPr>
+          <w:lang w:val="es-VE"/>
+        </w:rPr>
+      </w:pPr>
+    </w:p>
+    <w:p>
+      <w:pPr>
+        <w:rPr>
+          <w:lang w:val="es-VE"/>
+        </w:rPr>
+      </w:pPr>
+    </w:p>
+    <w:p>
+      <w:pPr>
+        <w:pStyle w:val="Ttulo1"/>
+        <w:rPr>
+          <w:sz w:val="48"/>
+          <w:lang w:val="es-VE"/>
+        </w:rPr>
+      </w:pPr>
+      <w:r>
+        <w:rPr>
+          <w:lang w:val="es-VE"/>
+        </w:rPr>
+        <w:lastRenderedPageBreak/>
+        <w:t>III. Revisión y Entrega</w:t>
+      </w:r>
+    </w:p>
+    <w:p>
+      <w:pPr>
+        <w:rPr>
+          <w:lang w:val="es-VE"/>
+        </w:rPr>
+      </w:pPr>
+      <w:r>
+        <w:rPr>
+          <w:lang w:val="es-VE"/>
+        </w:rPr>
+        <w:t>El principal error de los trabajos grupales es asumir que el proyecto está terminado en el momento en que se escribe el último párrafo. La fase de revisión es crítica para garantizar la calidad y evitar incoherencias.</w:t>
+      </w:r>
+      <w:r>
+        <w:rPr>
+          <w:lang w:val="es-VE"/>
+        </w:rPr>
+        <w:t xml:space="preserve"> Todos en conjunto deben revisarlo de pies a cabeza para asegurarse que todo </w:t>
+      </w:r>
+      <w:proofErr w:type="spellStart"/>
+      <w:r>
+        <w:rPr>
+          <w:lang w:val="es-VE"/>
+        </w:rPr>
+        <w:t>este</w:t>
+      </w:r>
+      <w:proofErr w:type="spellEnd"/>
+      <w:r>
+        <w:rPr>
+          <w:lang w:val="es-VE"/>
+        </w:rPr>
+        <w:t xml:space="preserve"> bien.</w:t>
+      </w:r>
+    </w:p>
+    <w:p>
+      <w:pPr>
+        <w:pStyle w:val="Ttulo2"/>
+        <w:rPr>
+          <w:lang w:val="es-VE"/>
+        </w:rPr>
+      </w:pPr>
+      <w:r>
+        <w:rPr>
+          <w:lang w:val="es-VE"/>
+        </w:rPr>
+        <w:t xml:space="preserve">Revisión </w:t>
+      </w:r>
+    </w:p>
+    <w:p>
+      <w:pPr>
+        <w:rPr>
+          <w:lang w:val="es-VE"/>
+        </w:rPr>
+      </w:pPr>
+      <w:r>
+        <w:rPr>
+          <w:lang w:val="es-VE"/>
+        </w:rPr>
+        <w:t xml:space="preserve">Ningún integrante debe ser el único revisor de su propia sección. Se debe implementar un sistema de revisión cruzada donde </w:t>
+      </w:r>
+      <w:r>
+        <w:rPr>
+          <w:lang w:val="es-VE"/>
+        </w:rPr>
+        <w:t>uno</w:t>
+      </w:r>
+      <w:r>
+        <w:rPr>
+          <w:lang w:val="es-VE"/>
+        </w:rPr>
+        <w:t xml:space="preserve"> lee y corrige la parte del </w:t>
+      </w:r>
+      <w:r>
+        <w:rPr>
+          <w:lang w:val="es-VE"/>
+        </w:rPr>
+        <w:t>otro miembro</w:t>
+      </w:r>
+      <w:r>
+        <w:rPr>
+          <w:lang w:val="es-VE"/>
+        </w:rPr>
+        <w:t xml:space="preserve">, y viceversa. Esto permite detectar errores de redacción, fallas de lógica o conceptos incompletos que el autor original podría pasar por alto </w:t>
+      </w:r>
+      <w:r>
+        <w:rPr>
+          <w:lang w:val="es-VE"/>
+        </w:rPr>
+        <w:t>debido a no r</w:t>
+      </w:r>
+      <w:r>
+        <w:rPr>
+          <w:lang w:val="es-VE"/>
+        </w:rPr>
+        <w:t>evisar</w:t>
+      </w:r>
+      <w:r>
+        <w:rPr>
+          <w:lang w:val="es-VE"/>
+        </w:rPr>
+        <w:t>.</w:t>
+      </w:r>
+      <w:r>
+        <w:rPr>
+          <w:lang w:val="es-VE"/>
+        </w:rPr>
+        <w:t xml:space="preserve"> Es incluso mejor si hacen un meeting para revisar que todo </w:t>
+      </w:r>
+      <w:proofErr w:type="spellStart"/>
+      <w:r>
+        <w:rPr>
+          <w:lang w:val="es-VE"/>
+        </w:rPr>
+        <w:t>este</w:t>
+      </w:r>
+      <w:proofErr w:type="spellEnd"/>
+      <w:r>
+        <w:rPr>
+          <w:lang w:val="es-VE"/>
+        </w:rPr>
+        <w:t xml:space="preserve"> en orden.</w:t>
       </w:r>
     </w:p>
     <w:p>
@@ -2119,6 +2296,155 @@
     </w:lvl>
   </w:abstractNum>
   <w:abstractNum w:abstractNumId="2" w15:restartNumberingAfterBreak="0">
+    <w:nsid w:val="12FB6BDB"/>
+    <w:multiLevelType w:val="multilevel"/>
+    <w:tmpl w:val="0FC8F1F8"/>
+    <w:lvl w:ilvl="0">
+      <w:start w:val="1"/>
+      <w:numFmt w:val="bullet"/>
+      <w:lvlText w:val=""/>
+      <w:lvlJc w:val="left"/>
+      <w:pPr>
+        <w:tabs>
+          <w:tab w:val="num" w:pos="720"/>
+        </w:tabs>
+        <w:ind w:left="720" w:hanging="360"/>
+      </w:pPr>
+      <w:rPr>
+        <w:rFonts w:ascii="Symbol" w:hAnsi="Symbol" w:hint="default"/>
+        <w:sz w:val="20"/>
+      </w:rPr>
+    </w:lvl>
+    <w:lvl w:ilvl="1" w:tentative="1">
+      <w:start w:val="1"/>
+      <w:numFmt w:val="bullet"/>
+      <w:lvlText w:val="o"/>
+      <w:lvlJc w:val="left"/>
+      <w:pPr>
+        <w:tabs>
+          <w:tab w:val="num" w:pos="1440"/>
+        </w:tabs>
+        <w:ind w:left="1440" w:hanging="360"/>
+      </w:pPr>
+      <w:rPr>
+        <w:rFonts w:ascii="Courier New" w:hAnsi="Courier New" w:hint="default"/>
+        <w:sz w:val="20"/>
+      </w:rPr>
+    </w:lvl>
+    <w:lvl w:ilvl="2" w:tentative="1">
+      <w:start w:val="1"/>
+      <w:numFmt w:val="bullet"/>
+      <w:lvlText w:val=""/>
+      <w:lvlJc w:val="left"/>
+      <w:pPr>
+        <w:tabs>
+          <w:tab w:val="num" w:pos="2160"/>
+        </w:tabs>
+        <w:ind w:left="2160" w:hanging="360"/>
+      </w:pPr>
+      <w:rPr>
+        <w:rFonts w:ascii="Wingdings" w:hAnsi="Wingdings" w:hint="default"/>
+        <w:sz w:val="20"/>
+      </w:rPr>
+    </w:lvl>
+    <w:lvl w:ilvl="3" w:tentative="1">
+      <w:start w:val="1"/>
+      <w:numFmt w:val="bullet"/>
+      <w:lvlText w:val=""/>
+      <w:lvlJc w:val="left"/>
+      <w:pPr>
+        <w:tabs>
+          <w:tab w:val="num" w:pos="2880"/>
+        </w:tabs>
+        <w:ind w:left="2880" w:hanging="360"/>
+      </w:pPr>
+      <w:rPr>
+        <w:rFonts w:ascii="Wingdings" w:hAnsi="Wingdings" w:hint="default"/>
+        <w:sz w:val="20"/>
+      </w:rPr>
+    </w:lvl>
+    <w:lvl w:ilvl="4" w:tentative="1">
+      <w:start w:val="1"/>
+      <w:numFmt w:val="bullet"/>
+      <w:lvlText w:val=""/>
+      <w:lvlJc w:val="left"/>
+      <w:pPr>
+        <w:tabs>
+          <w:tab w:val="num" w:pos="3600"/>
+        </w:tabs>
+        <w:ind w:left="3600" w:hanging="360"/>
+      </w:pPr>
+      <w:rPr>
+        <w:rFonts w:ascii="Wingdings" w:hAnsi="Wingdings" w:hint="default"/>
+        <w:sz w:val="20"/>
+      </w:rPr>
+    </w:lvl>
+    <w:lvl w:ilvl="5" w:tentative="1">
+      <w:start w:val="1"/>
+      <w:numFmt w:val="bullet"/>
+      <w:lvlText w:val=""/>
+      <w:lvlJc w:val="left"/>
+      <w:pPr>
+        <w:tabs>
+          <w:tab w:val="num" w:pos="4320"/>
+        </w:tabs>
+        <w:ind w:left="4320" w:hanging="360"/>
+      </w:pPr>
+      <w:rPr>
+        <w:rFonts w:ascii="Wingdings" w:hAnsi="Wingdings" w:hint="default"/>
+        <w:sz w:val="20"/>
+      </w:rPr>
+    </w:lvl>
+    <w:lvl w:ilvl="6" w:tentative="1">
+      <w:start w:val="1"/>
+      <w:numFmt w:val="bullet"/>
+      <w:lvlText w:val=""/>
+      <w:lvlJc w:val="left"/>
+      <w:pPr>
+        <w:tabs>
+          <w:tab w:val="num" w:pos="5040"/>
+        </w:tabs>
+        <w:ind w:left="5040" w:hanging="360"/>
+      </w:pPr>
+      <w:rPr>
+        <w:rFonts w:ascii="Wingdings" w:hAnsi="Wingdings" w:hint="default"/>
+        <w:sz w:val="20"/>
+      </w:rPr>
+    </w:lvl>
+    <w:lvl w:ilvl="7" w:tentative="1">
+      <w:start w:val="1"/>
+      <w:numFmt w:val="bullet"/>
+      <w:lvlText w:val=""/>
+      <w:lvlJc w:val="left"/>
+      <w:pPr>
+        <w:tabs>
+          <w:tab w:val="num" w:pos="5760"/>
+        </w:tabs>
+        <w:ind w:left="5760" w:hanging="360"/>
+      </w:pPr>
+      <w:rPr>
+        <w:rFonts w:ascii="Wingdings" w:hAnsi="Wingdings" w:hint="default"/>
+        <w:sz w:val="20"/>
+      </w:rPr>
+    </w:lvl>
+    <w:lvl w:ilvl="8" w:tentative="1">
+      <w:start w:val="1"/>
+      <w:numFmt w:val="bullet"/>
+      <w:lvlText w:val=""/>
+      <w:lvlJc w:val="left"/>
+      <w:pPr>
+        <w:tabs>
+          <w:tab w:val="num" w:pos="6480"/>
+        </w:tabs>
+        <w:ind w:left="6480" w:hanging="360"/>
+      </w:pPr>
+      <w:rPr>
+        <w:rFonts w:ascii="Wingdings" w:hAnsi="Wingdings" w:hint="default"/>
+        <w:sz w:val="20"/>
+      </w:rPr>
+    </w:lvl>
+  </w:abstractNum>
+  <w:abstractNum w:abstractNumId="3" w15:restartNumberingAfterBreak="0">
     <w:nsid w:val="15FD2FEA"/>
     <w:multiLevelType w:val="hybridMultilevel"/>
     <w:tmpl w:val="BE844D2C"/>
@@ -2204,7 +2530,7 @@
       </w:pPr>
     </w:lvl>
   </w:abstractNum>
-  <w:abstractNum w:abstractNumId="3" w15:restartNumberingAfterBreak="0">
+  <w:abstractNum w:abstractNumId="4" w15:restartNumberingAfterBreak="0">
     <w:nsid w:val="21BA1B13"/>
     <w:multiLevelType w:val="hybridMultilevel"/>
     <w:tmpl w:val="8520873A"/>
@@ -2290,7 +2616,7 @@
       </w:pPr>
     </w:lvl>
   </w:abstractNum>
-  <w:abstractNum w:abstractNumId="4" w15:restartNumberingAfterBreak="0">
+  <w:abstractNum w:abstractNumId="5" w15:restartNumberingAfterBreak="0">
     <w:nsid w:val="301D7B33"/>
     <w:multiLevelType w:val="multilevel"/>
     <w:tmpl w:val="313E83AC"/>
@@ -2439,7 +2765,7 @@
       </w:rPr>
     </w:lvl>
   </w:abstractNum>
-  <w:abstractNum w:abstractNumId="5" w15:restartNumberingAfterBreak="0">
+  <w:abstractNum w:abstractNumId="6" w15:restartNumberingAfterBreak="0">
     <w:nsid w:val="3B241C37"/>
     <w:multiLevelType w:val="hybridMultilevel"/>
     <w:tmpl w:val="5CB02D7A"/>
@@ -2552,7 +2878,7 @@
       </w:rPr>
     </w:lvl>
   </w:abstractNum>
-  <w:abstractNum w:abstractNumId="6" w15:restartNumberingAfterBreak="0">
+  <w:abstractNum w:abstractNumId="7" w15:restartNumberingAfterBreak="0">
     <w:nsid w:val="54477EF6"/>
     <w:multiLevelType w:val="hybridMultilevel"/>
     <w:tmpl w:val="F0DE18D0"/>
@@ -2665,7 +2991,7 @@
       </w:rPr>
     </w:lvl>
   </w:abstractNum>
-  <w:abstractNum w:abstractNumId="7" w15:restartNumberingAfterBreak="0">
+  <w:abstractNum w:abstractNumId="8" w15:restartNumberingAfterBreak="0">
     <w:nsid w:val="5680300B"/>
     <w:multiLevelType w:val="multilevel"/>
     <w:tmpl w:val="AB92B60E"/>
@@ -2814,7 +3140,7 @@
       </w:rPr>
     </w:lvl>
   </w:abstractNum>
-  <w:abstractNum w:abstractNumId="8" w15:restartNumberingAfterBreak="0">
+  <w:abstractNum w:abstractNumId="9" w15:restartNumberingAfterBreak="0">
     <w:nsid w:val="66841202"/>
     <w:multiLevelType w:val="multilevel"/>
     <w:tmpl w:val="2618EDDE"/>
@@ -2963,7 +3289,7 @@
       </w:rPr>
     </w:lvl>
   </w:abstractNum>
-  <w:abstractNum w:abstractNumId="9" w15:restartNumberingAfterBreak="0">
+  <w:abstractNum w:abstractNumId="10" w15:restartNumberingAfterBreak="0">
     <w:nsid w:val="6D940B6B"/>
     <w:multiLevelType w:val="hybridMultilevel"/>
     <w:tmpl w:val="5658D946"/>
@@ -3052,7 +3378,7 @@
       </w:pPr>
     </w:lvl>
   </w:abstractNum>
-  <w:abstractNum w:abstractNumId="10" w15:restartNumberingAfterBreak="0">
+  <w:abstractNum w:abstractNumId="11" w15:restartNumberingAfterBreak="0">
     <w:nsid w:val="6E615836"/>
     <w:multiLevelType w:val="hybridMultilevel"/>
     <w:tmpl w:val="A0045F34"/>
@@ -3138,7 +3464,7 @@
       </w:pPr>
     </w:lvl>
   </w:abstractNum>
-  <w:abstractNum w:abstractNumId="11" w15:restartNumberingAfterBreak="0">
+  <w:abstractNum w:abstractNumId="12" w15:restartNumberingAfterBreak="0">
     <w:nsid w:val="72347A5D"/>
     <w:multiLevelType w:val="hybridMultilevel"/>
     <w:tmpl w:val="5F1C5312"/>
@@ -3251,7 +3577,7 @@
       </w:rPr>
     </w:lvl>
   </w:abstractNum>
-  <w:abstractNum w:abstractNumId="12" w15:restartNumberingAfterBreak="0">
+  <w:abstractNum w:abstractNumId="13" w15:restartNumberingAfterBreak="0">
     <w:nsid w:val="774B47E9"/>
     <w:multiLevelType w:val="multilevel"/>
     <w:tmpl w:val="1902AA58"/>
@@ -3401,43 +3727,46 @@
     </w:lvl>
   </w:abstractNum>
   <w:num w:numId="1">
-    <w:abstractNumId w:val="9"/>
+    <w:abstractNumId w:val="10"/>
   </w:num>
   <w:num w:numId="2">
     <w:abstractNumId w:val="1"/>
   </w:num>
   <w:num w:numId="3">
-    <w:abstractNumId w:val="7"/>
+    <w:abstractNumId w:val="8"/>
   </w:num>
   <w:num w:numId="4">
-    <w:abstractNumId w:val="8"/>
+    <w:abstractNumId w:val="9"/>
   </w:num>
   <w:num w:numId="5">
-    <w:abstractNumId w:val="11"/>
+    <w:abstractNumId w:val="12"/>
   </w:num>
   <w:num w:numId="6">
-    <w:abstractNumId w:val="5"/>
+    <w:abstractNumId w:val="6"/>
   </w:num>
   <w:num w:numId="7">
     <w:abstractNumId w:val="0"/>
   </w:num>
   <w:num w:numId="8">
+    <w:abstractNumId w:val="4"/>
+  </w:num>
+  <w:num w:numId="9">
+    <w:abstractNumId w:val="13"/>
+  </w:num>
+  <w:num w:numId="10">
+    <w:abstractNumId w:val="5"/>
+  </w:num>
+  <w:num w:numId="11">
+    <w:abstractNumId w:val="7"/>
+  </w:num>
+  <w:num w:numId="12">
     <w:abstractNumId w:val="3"/>
   </w:num>
-  <w:num w:numId="9">
-    <w:abstractNumId w:val="12"/>
+  <w:num w:numId="13">
+    <w:abstractNumId w:val="11"/>
   </w:num>
-  <w:num w:numId="10">
-    <w:abstractNumId w:val="4"/>
-  </w:num>
-  <w:num w:numId="11">
-    <w:abstractNumId w:val="6"/>
-  </w:num>
-  <w:num w:numId="12">
+  <w:num w:numId="14">
     <w:abstractNumId w:val="2"/>
-  </w:num>
-  <w:num w:numId="13">
-    <w:abstractNumId w:val="10"/>
   </w:num>
 </w:numbering>
 </file>

</xml_diff>

<commit_message>
revision y entrga arreglos finales #5
</commit_message>
<xml_diff>
--- a/Documentos/Practicas.docx
+++ b/Documentos/Practicas.docx
@@ -1914,6 +1914,97 @@
           <w:lang w:val="es-VE"/>
         </w:rPr>
         <w:t xml:space="preserve"> en orden.</w:t>
+      </w:r>
+    </w:p>
+    <w:p>
+      <w:pPr>
+        <w:pStyle w:val="Ttulo2"/>
+        <w:rPr>
+          <w:lang w:val="es-VE"/>
+        </w:rPr>
+      </w:pPr>
+      <w:r>
+        <w:rPr>
+          <w:lang w:val="es-VE"/>
+        </w:rPr>
+        <w:t xml:space="preserve"> Cohesión y Estilo</w:t>
+      </w:r>
+    </w:p>
+    <w:p>
+      <w:pPr>
+        <w:rPr>
+          <w:lang w:val="es-VE"/>
+        </w:rPr>
+      </w:pPr>
+      <w:r>
+        <w:rPr>
+          <w:lang w:val="es-VE"/>
+        </w:rPr>
+        <w:t xml:space="preserve">Durante la revisión cruzada, los </w:t>
+      </w:r>
+      <w:r>
+        <w:rPr>
+          <w:lang w:val="es-VE"/>
+        </w:rPr>
+        <w:t>alumnos</w:t>
+      </w:r>
+      <w:r>
+        <w:rPr>
+          <w:lang w:val="es-VE"/>
+        </w:rPr>
+        <w:t xml:space="preserve"> deben verificar:</w:t>
+      </w:r>
+    </w:p>
+    <w:p>
+      <w:pPr>
+        <w:pStyle w:val="Prrafodelista"/>
+        <w:numPr>
+          <w:ilvl w:val="0"/>
+          <w:numId w:val="15"/>
+        </w:numPr>
+        <w:rPr>
+          <w:lang w:val="es-VE"/>
+        </w:rPr>
+      </w:pPr>
+      <w:r>
+        <w:rPr>
+          <w:b/>
+          <w:bCs/>
+          <w:lang w:val="es-VE"/>
+        </w:rPr>
+        <w:t>Tono del texto:</w:t>
+      </w:r>
+      <w:r>
+        <w:rPr>
+          <w:lang w:val="es-VE"/>
+        </w:rPr>
+        <w:t xml:space="preserve"> Que no haya saltos abruptos entre un lenguaje excesivamente formal en un párrafo y uno coloquial en el siguiente.</w:t>
+      </w:r>
+    </w:p>
+    <w:p>
+      <w:pPr>
+        <w:pStyle w:val="Prrafodelista"/>
+        <w:numPr>
+          <w:ilvl w:val="0"/>
+          <w:numId w:val="15"/>
+        </w:numPr>
+        <w:rPr>
+          <w:lang w:val="es-VE"/>
+        </w:rPr>
+      </w:pPr>
+      <w:r>
+        <w:rPr>
+          <w:b/>
+          <w:bCs/>
+          <w:lang w:val="es-VE"/>
+        </w:rPr>
+        <w:t>Transiciones:</w:t>
+      </w:r>
+      <w:r>
+        <w:rPr>
+          <w:lang w:val="es-VE"/>
+        </w:rPr>
+        <w:t xml:space="preserve"> Añadir frases conectoras entre el final de la sección de un compañero y el inicio de la siguiente para que el documento fluya de manera natural.</w:t>
       </w:r>
     </w:p>
     <w:p>
@@ -2879,6 +2970,92 @@
     </w:lvl>
   </w:abstractNum>
   <w:abstractNum w:abstractNumId="7" w15:restartNumberingAfterBreak="0">
+    <w:nsid w:val="3D897148"/>
+    <w:multiLevelType w:val="hybridMultilevel"/>
+    <w:tmpl w:val="5F246F42"/>
+    <w:lvl w:ilvl="0" w:tplc="0409000F">
+      <w:start w:val="1"/>
+      <w:numFmt w:val="decimal"/>
+      <w:lvlText w:val="%1."/>
+      <w:lvlJc w:val="left"/>
+      <w:pPr>
+        <w:ind w:left="1440" w:hanging="360"/>
+      </w:pPr>
+    </w:lvl>
+    <w:lvl w:ilvl="1" w:tplc="04090019" w:tentative="1">
+      <w:start w:val="1"/>
+      <w:numFmt w:val="lowerLetter"/>
+      <w:lvlText w:val="%2."/>
+      <w:lvlJc w:val="left"/>
+      <w:pPr>
+        <w:ind w:left="2160" w:hanging="360"/>
+      </w:pPr>
+    </w:lvl>
+    <w:lvl w:ilvl="2" w:tplc="0409001B" w:tentative="1">
+      <w:start w:val="1"/>
+      <w:numFmt w:val="lowerRoman"/>
+      <w:lvlText w:val="%3."/>
+      <w:lvlJc w:val="right"/>
+      <w:pPr>
+        <w:ind w:left="2880" w:hanging="180"/>
+      </w:pPr>
+    </w:lvl>
+    <w:lvl w:ilvl="3" w:tplc="0409000F" w:tentative="1">
+      <w:start w:val="1"/>
+      <w:numFmt w:val="decimal"/>
+      <w:lvlText w:val="%4."/>
+      <w:lvlJc w:val="left"/>
+      <w:pPr>
+        <w:ind w:left="3600" w:hanging="360"/>
+      </w:pPr>
+    </w:lvl>
+    <w:lvl w:ilvl="4" w:tplc="04090019" w:tentative="1">
+      <w:start w:val="1"/>
+      <w:numFmt w:val="lowerLetter"/>
+      <w:lvlText w:val="%5."/>
+      <w:lvlJc w:val="left"/>
+      <w:pPr>
+        <w:ind w:left="4320" w:hanging="360"/>
+      </w:pPr>
+    </w:lvl>
+    <w:lvl w:ilvl="5" w:tplc="0409001B" w:tentative="1">
+      <w:start w:val="1"/>
+      <w:numFmt w:val="lowerRoman"/>
+      <w:lvlText w:val="%6."/>
+      <w:lvlJc w:val="right"/>
+      <w:pPr>
+        <w:ind w:left="5040" w:hanging="180"/>
+      </w:pPr>
+    </w:lvl>
+    <w:lvl w:ilvl="6" w:tplc="0409000F" w:tentative="1">
+      <w:start w:val="1"/>
+      <w:numFmt w:val="decimal"/>
+      <w:lvlText w:val="%7."/>
+      <w:lvlJc w:val="left"/>
+      <w:pPr>
+        <w:ind w:left="5760" w:hanging="360"/>
+      </w:pPr>
+    </w:lvl>
+    <w:lvl w:ilvl="7" w:tplc="04090019" w:tentative="1">
+      <w:start w:val="1"/>
+      <w:numFmt w:val="lowerLetter"/>
+      <w:lvlText w:val="%8."/>
+      <w:lvlJc w:val="left"/>
+      <w:pPr>
+        <w:ind w:left="6480" w:hanging="360"/>
+      </w:pPr>
+    </w:lvl>
+    <w:lvl w:ilvl="8" w:tplc="0409001B" w:tentative="1">
+      <w:start w:val="1"/>
+      <w:numFmt w:val="lowerRoman"/>
+      <w:lvlText w:val="%9."/>
+      <w:lvlJc w:val="right"/>
+      <w:pPr>
+        <w:ind w:left="7200" w:hanging="180"/>
+      </w:pPr>
+    </w:lvl>
+  </w:abstractNum>
+  <w:abstractNum w:abstractNumId="8" w15:restartNumberingAfterBreak="0">
     <w:nsid w:val="54477EF6"/>
     <w:multiLevelType w:val="hybridMultilevel"/>
     <w:tmpl w:val="F0DE18D0"/>
@@ -2991,7 +3168,7 @@
       </w:rPr>
     </w:lvl>
   </w:abstractNum>
-  <w:abstractNum w:abstractNumId="8" w15:restartNumberingAfterBreak="0">
+  <w:abstractNum w:abstractNumId="9" w15:restartNumberingAfterBreak="0">
     <w:nsid w:val="5680300B"/>
     <w:multiLevelType w:val="multilevel"/>
     <w:tmpl w:val="AB92B60E"/>
@@ -3140,7 +3317,7 @@
       </w:rPr>
     </w:lvl>
   </w:abstractNum>
-  <w:abstractNum w:abstractNumId="9" w15:restartNumberingAfterBreak="0">
+  <w:abstractNum w:abstractNumId="10" w15:restartNumberingAfterBreak="0">
     <w:nsid w:val="66841202"/>
     <w:multiLevelType w:val="multilevel"/>
     <w:tmpl w:val="2618EDDE"/>
@@ -3289,7 +3466,7 @@
       </w:rPr>
     </w:lvl>
   </w:abstractNum>
-  <w:abstractNum w:abstractNumId="10" w15:restartNumberingAfterBreak="0">
+  <w:abstractNum w:abstractNumId="11" w15:restartNumberingAfterBreak="0">
     <w:nsid w:val="6D940B6B"/>
     <w:multiLevelType w:val="hybridMultilevel"/>
     <w:tmpl w:val="5658D946"/>
@@ -3378,7 +3555,7 @@
       </w:pPr>
     </w:lvl>
   </w:abstractNum>
-  <w:abstractNum w:abstractNumId="11" w15:restartNumberingAfterBreak="0">
+  <w:abstractNum w:abstractNumId="12" w15:restartNumberingAfterBreak="0">
     <w:nsid w:val="6E615836"/>
     <w:multiLevelType w:val="hybridMultilevel"/>
     <w:tmpl w:val="A0045F34"/>
@@ -3464,7 +3641,7 @@
       </w:pPr>
     </w:lvl>
   </w:abstractNum>
-  <w:abstractNum w:abstractNumId="12" w15:restartNumberingAfterBreak="0">
+  <w:abstractNum w:abstractNumId="13" w15:restartNumberingAfterBreak="0">
     <w:nsid w:val="72347A5D"/>
     <w:multiLevelType w:val="hybridMultilevel"/>
     <w:tmpl w:val="5F1C5312"/>
@@ -3577,7 +3754,7 @@
       </w:rPr>
     </w:lvl>
   </w:abstractNum>
-  <w:abstractNum w:abstractNumId="13" w15:restartNumberingAfterBreak="0">
+  <w:abstractNum w:abstractNumId="14" w15:restartNumberingAfterBreak="0">
     <w:nsid w:val="774B47E9"/>
     <w:multiLevelType w:val="multilevel"/>
     <w:tmpl w:val="1902AA58"/>
@@ -3727,19 +3904,19 @@
     </w:lvl>
   </w:abstractNum>
   <w:num w:numId="1">
-    <w:abstractNumId w:val="10"/>
+    <w:abstractNumId w:val="11"/>
   </w:num>
   <w:num w:numId="2">
     <w:abstractNumId w:val="1"/>
   </w:num>
   <w:num w:numId="3">
-    <w:abstractNumId w:val="8"/>
+    <w:abstractNumId w:val="9"/>
   </w:num>
   <w:num w:numId="4">
-    <w:abstractNumId w:val="9"/>
+    <w:abstractNumId w:val="10"/>
   </w:num>
   <w:num w:numId="5">
-    <w:abstractNumId w:val="12"/>
+    <w:abstractNumId w:val="13"/>
   </w:num>
   <w:num w:numId="6">
     <w:abstractNumId w:val="6"/>
@@ -3751,22 +3928,25 @@
     <w:abstractNumId w:val="4"/>
   </w:num>
   <w:num w:numId="9">
-    <w:abstractNumId w:val="13"/>
+    <w:abstractNumId w:val="14"/>
   </w:num>
   <w:num w:numId="10">
     <w:abstractNumId w:val="5"/>
   </w:num>
   <w:num w:numId="11">
-    <w:abstractNumId w:val="7"/>
+    <w:abstractNumId w:val="8"/>
   </w:num>
   <w:num w:numId="12">
     <w:abstractNumId w:val="3"/>
   </w:num>
   <w:num w:numId="13">
-    <w:abstractNumId w:val="11"/>
+    <w:abstractNumId w:val="12"/>
   </w:num>
   <w:num w:numId="14">
     <w:abstractNumId w:val="2"/>
+  </w:num>
+  <w:num w:numId="15">
+    <w:abstractNumId w:val="7"/>
   </w:num>
 </w:numbering>
 </file>

</xml_diff>

<commit_message>
Unificacion y edicion final #6
</commit_message>
<xml_diff>
--- a/Documentos/Practicas.docx
+++ b/Documentos/Practicas.docx
@@ -221,16 +221,8 @@
         <w:rPr>
           <w:lang w:val="es-VE"/>
         </w:rPr>
-        <w:t xml:space="preserve">es fundamental establecer roles, reglas claras y elegir las </w:t>
-      </w:r>
-      <w:proofErr w:type="gramStart"/>
-      <w:r>
-        <w:rPr>
-          <w:lang w:val="es-VE"/>
-        </w:rPr>
-        <w:t>herramientas adecuada</w:t>
-      </w:r>
-      <w:proofErr w:type="gramEnd"/>
+        <w:t>es fundamental establecer roles, reglas claras y elegir las herramientas adecuada</w:t>
+      </w:r>
     </w:p>
     <w:p>
       <w:pPr>
@@ -1207,33 +1199,15 @@
           <w:bCs/>
           <w:lang w:val="es-VE"/>
         </w:rPr>
-        <w:t xml:space="preserve">Página de </w:t>
-      </w:r>
-      <w:proofErr w:type="gramStart"/>
+        <w:t xml:space="preserve">Página de Presentación </w:t>
+      </w:r>
       <w:r>
         <w:rPr>
           <w:b/>
           <w:bCs/>
           <w:lang w:val="es-VE"/>
         </w:rPr>
-        <w:t xml:space="preserve">Presentación </w:t>
-      </w:r>
-      <w:r>
-        <w:rPr>
-          <w:b/>
-          <w:bCs/>
-          <w:lang w:val="es-VE"/>
-        </w:rPr>
-        <w:t>:</w:t>
-      </w:r>
-      <w:proofErr w:type="gramEnd"/>
-      <w:r>
-        <w:rPr>
-          <w:b/>
-          <w:bCs/>
-          <w:lang w:val="es-VE"/>
-        </w:rPr>
-        <w:t xml:space="preserve"> </w:t>
+        <w:t xml:space="preserve">: </w:t>
       </w:r>
       <w:r>
         <w:rPr>
@@ -1412,16 +1386,7 @@
           <w:bCs/>
           <w:lang w:val="es-VE"/>
         </w:rPr>
-        <w:t xml:space="preserve">7ma </w:t>
-      </w:r>
-      <w:proofErr w:type="gramStart"/>
-      <w:r>
-        <w:rPr>
-          <w:b/>
-          <w:bCs/>
-          <w:lang w:val="es-VE"/>
-        </w:rPr>
-        <w:t xml:space="preserve">edición </w:t>
+        <w:t xml:space="preserve">7ma edición </w:t>
       </w:r>
       <w:r>
         <w:rPr>
@@ -1429,7 +1394,6 @@
         </w:rPr>
         <w:t>:</w:t>
       </w:r>
-      <w:proofErr w:type="gramEnd"/>
     </w:p>
     <w:p>
       <w:pPr>
@@ -1790,21 +1754,27 @@
         <w:rPr>
           <w:lang w:val="es-VE"/>
         </w:rPr>
+        <w:t>III. Revisión y Entrega</w:t>
+      </w:r>
+    </w:p>
+    <w:p>
+      <w:pPr>
+        <w:rPr>
+          <w:lang w:val="es-VE"/>
+        </w:rPr>
+      </w:pPr>
+      <w:r>
+        <w:rPr>
+          <w:lang w:val="es-VE"/>
+        </w:rPr>
+        <w:t xml:space="preserve">El principal error de los trabajos grupales es asumir que el proyecto está terminado en el momento en que se escribe el último párrafo. La fase de revisión es crítica para garantizar la calidad </w:t>
+      </w:r>
+      <w:r>
+        <w:rPr>
+          <w:lang w:val="es-VE"/>
+        </w:rPr>
         <w:lastRenderedPageBreak/>
-        <w:t>III. Revisión y Entrega</w:t>
-      </w:r>
-    </w:p>
-    <w:p>
-      <w:pPr>
-        <w:rPr>
-          <w:lang w:val="es-VE"/>
-        </w:rPr>
-      </w:pPr>
-      <w:r>
-        <w:rPr>
-          <w:lang w:val="es-VE"/>
-        </w:rPr>
-        <w:t>El principal error de los trabajos grupales es asumir que el proyecto está terminado en el momento en que se escribe el último párrafo. La fase de revisión es crítica para garantizar la calidad y evitar incoherencias.</w:t>
+        <w:t>y evitar incoherencias.</w:t>
       </w:r>
       <w:r>
         <w:rPr>
@@ -2006,6 +1976,121 @@
         </w:rPr>
         <w:t xml:space="preserve"> Añadir frases conectoras entre el final de la sección de un compañero y el inicio de la siguiente para que el documento fluya de manera natural.</w:t>
       </w:r>
+    </w:p>
+    <w:p>
+      <w:pPr>
+        <w:rPr>
+          <w:lang w:val="es-VE"/>
+        </w:rPr>
+      </w:pPr>
+    </w:p>
+    <w:p>
+      <w:pPr>
+        <w:rPr>
+          <w:lang w:val="es-VE"/>
+        </w:rPr>
+      </w:pPr>
+    </w:p>
+    <w:p>
+      <w:pPr>
+        <w:rPr>
+          <w:lang w:val="es-VE"/>
+        </w:rPr>
+      </w:pPr>
+    </w:p>
+    <w:p>
+      <w:pPr>
+        <w:pStyle w:val="Ttulo1"/>
+        <w:rPr>
+          <w:lang w:val="es-VE"/>
+        </w:rPr>
+      </w:pPr>
+    </w:p>
+    <w:p>
+      <w:pPr>
+        <w:pStyle w:val="Ttulo1"/>
+        <w:rPr>
+          <w:sz w:val="48"/>
+          <w:lang w:val="es-VE"/>
+        </w:rPr>
+      </w:pPr>
+      <w:r>
+        <w:rPr>
+          <w:lang w:val="es-VE"/>
+        </w:rPr>
+        <w:t>IV. Unificación y Edición Final del Manual</w:t>
+      </w:r>
+    </w:p>
+    <w:p>
+      <w:pPr>
+        <w:rPr>
+          <w:lang w:val="es-VE"/>
+        </w:rPr>
+      </w:pPr>
+      <w:r>
+        <w:rPr>
+          <w:lang w:val="es-VE"/>
+        </w:rPr>
+        <w:t>Esta es la última barrera de control de calidad antes de presentar el proyecto ante el profesor o cliente.</w:t>
+      </w:r>
+    </w:p>
+    <w:p>
+      <w:pPr>
+        <w:pStyle w:val="Ttulo2"/>
+        <w:rPr>
+          <w:lang w:val="es-VE"/>
+        </w:rPr>
+      </w:pPr>
+      <w:r>
+        <w:rPr>
+          <w:lang w:val="es-VE"/>
+        </w:rPr>
+        <w:t>Ensamblaje del Documento</w:t>
+      </w:r>
+    </w:p>
+    <w:p>
+      <w:pPr>
+        <w:rPr>
+          <w:lang w:val="es-VE"/>
+        </w:rPr>
+      </w:pPr>
+      <w:r>
+        <w:rPr>
+          <w:lang w:val="es-VE"/>
+        </w:rPr>
+        <w:t>Se debe asignar a un único responsable</w:t>
+      </w:r>
+      <w:r>
+        <w:rPr>
+          <w:lang w:val="es-VE"/>
+        </w:rPr>
+        <w:t xml:space="preserve">, el coordinador </w:t>
+      </w:r>
+      <w:r>
+        <w:rPr>
+          <w:lang w:val="es-VE"/>
+        </w:rPr>
+        <w:t>para recopilar todas las secciones aprobadas. Esta persona será la encargada de unir los textos en un document</w:t>
+      </w:r>
+      <w:r>
+        <w:rPr>
+          <w:lang w:val="es-VE"/>
+        </w:rPr>
+        <w:t>o</w:t>
+      </w:r>
+      <w:r>
+        <w:rPr>
+          <w:lang w:val="es-VE"/>
+        </w:rPr>
+        <w:t>, actualizar la tabla de contenido automática y verificar que la numeración de las páginas sea correlativa.</w:t>
+      </w:r>
+    </w:p>
+    <w:p>
+      <w:pPr>
+        <w:rPr>
+          <w:lang w:val="es-VE"/>
+        </w:rPr>
+      </w:pPr>
     </w:p>
     <w:p>
       <w:pPr>
@@ -3056,6 +3141,155 @@
     </w:lvl>
   </w:abstractNum>
   <w:abstractNum w:abstractNumId="8" w15:restartNumberingAfterBreak="0">
+    <w:nsid w:val="4F787A5F"/>
+    <w:multiLevelType w:val="multilevel"/>
+    <w:tmpl w:val="CEECADE8"/>
+    <w:lvl w:ilvl="0">
+      <w:start w:val="1"/>
+      <w:numFmt w:val="bullet"/>
+      <w:lvlText w:val=""/>
+      <w:lvlJc w:val="left"/>
+      <w:pPr>
+        <w:tabs>
+          <w:tab w:val="num" w:pos="720"/>
+        </w:tabs>
+        <w:ind w:left="720" w:hanging="360"/>
+      </w:pPr>
+      <w:rPr>
+        <w:rFonts w:ascii="Symbol" w:hAnsi="Symbol" w:hint="default"/>
+        <w:sz w:val="20"/>
+      </w:rPr>
+    </w:lvl>
+    <w:lvl w:ilvl="1" w:tentative="1">
+      <w:start w:val="1"/>
+      <w:numFmt w:val="bullet"/>
+      <w:lvlText w:val="o"/>
+      <w:lvlJc w:val="left"/>
+      <w:pPr>
+        <w:tabs>
+          <w:tab w:val="num" w:pos="1440"/>
+        </w:tabs>
+        <w:ind w:left="1440" w:hanging="360"/>
+      </w:pPr>
+      <w:rPr>
+        <w:rFonts w:ascii="Courier New" w:hAnsi="Courier New" w:hint="default"/>
+        <w:sz w:val="20"/>
+      </w:rPr>
+    </w:lvl>
+    <w:lvl w:ilvl="2" w:tentative="1">
+      <w:start w:val="1"/>
+      <w:numFmt w:val="bullet"/>
+      <w:lvlText w:val=""/>
+      <w:lvlJc w:val="left"/>
+      <w:pPr>
+        <w:tabs>
+          <w:tab w:val="num" w:pos="2160"/>
+        </w:tabs>
+        <w:ind w:left="2160" w:hanging="360"/>
+      </w:pPr>
+      <w:rPr>
+        <w:rFonts w:ascii="Wingdings" w:hAnsi="Wingdings" w:hint="default"/>
+        <w:sz w:val="20"/>
+      </w:rPr>
+    </w:lvl>
+    <w:lvl w:ilvl="3" w:tentative="1">
+      <w:start w:val="1"/>
+      <w:numFmt w:val="bullet"/>
+      <w:lvlText w:val=""/>
+      <w:lvlJc w:val="left"/>
+      <w:pPr>
+        <w:tabs>
+          <w:tab w:val="num" w:pos="2880"/>
+        </w:tabs>
+        <w:ind w:left="2880" w:hanging="360"/>
+      </w:pPr>
+      <w:rPr>
+        <w:rFonts w:ascii="Wingdings" w:hAnsi="Wingdings" w:hint="default"/>
+        <w:sz w:val="20"/>
+      </w:rPr>
+    </w:lvl>
+    <w:lvl w:ilvl="4" w:tentative="1">
+      <w:start w:val="1"/>
+      <w:numFmt w:val="bullet"/>
+      <w:lvlText w:val=""/>
+      <w:lvlJc w:val="left"/>
+      <w:pPr>
+        <w:tabs>
+          <w:tab w:val="num" w:pos="3600"/>
+        </w:tabs>
+        <w:ind w:left="3600" w:hanging="360"/>
+      </w:pPr>
+      <w:rPr>
+        <w:rFonts w:ascii="Wingdings" w:hAnsi="Wingdings" w:hint="default"/>
+        <w:sz w:val="20"/>
+      </w:rPr>
+    </w:lvl>
+    <w:lvl w:ilvl="5" w:tentative="1">
+      <w:start w:val="1"/>
+      <w:numFmt w:val="bullet"/>
+      <w:lvlText w:val=""/>
+      <w:lvlJc w:val="left"/>
+      <w:pPr>
+        <w:tabs>
+          <w:tab w:val="num" w:pos="4320"/>
+        </w:tabs>
+        <w:ind w:left="4320" w:hanging="360"/>
+      </w:pPr>
+      <w:rPr>
+        <w:rFonts w:ascii="Wingdings" w:hAnsi="Wingdings" w:hint="default"/>
+        <w:sz w:val="20"/>
+      </w:rPr>
+    </w:lvl>
+    <w:lvl w:ilvl="6" w:tentative="1">
+      <w:start w:val="1"/>
+      <w:numFmt w:val="bullet"/>
+      <w:lvlText w:val=""/>
+      <w:lvlJc w:val="left"/>
+      <w:pPr>
+        <w:tabs>
+          <w:tab w:val="num" w:pos="5040"/>
+        </w:tabs>
+        <w:ind w:left="5040" w:hanging="360"/>
+      </w:pPr>
+      <w:rPr>
+        <w:rFonts w:ascii="Wingdings" w:hAnsi="Wingdings" w:hint="default"/>
+        <w:sz w:val="20"/>
+      </w:rPr>
+    </w:lvl>
+    <w:lvl w:ilvl="7" w:tentative="1">
+      <w:start w:val="1"/>
+      <w:numFmt w:val="bullet"/>
+      <w:lvlText w:val=""/>
+      <w:lvlJc w:val="left"/>
+      <w:pPr>
+        <w:tabs>
+          <w:tab w:val="num" w:pos="5760"/>
+        </w:tabs>
+        <w:ind w:left="5760" w:hanging="360"/>
+      </w:pPr>
+      <w:rPr>
+        <w:rFonts w:ascii="Wingdings" w:hAnsi="Wingdings" w:hint="default"/>
+        <w:sz w:val="20"/>
+      </w:rPr>
+    </w:lvl>
+    <w:lvl w:ilvl="8" w:tentative="1">
+      <w:start w:val="1"/>
+      <w:numFmt w:val="bullet"/>
+      <w:lvlText w:val=""/>
+      <w:lvlJc w:val="left"/>
+      <w:pPr>
+        <w:tabs>
+          <w:tab w:val="num" w:pos="6480"/>
+        </w:tabs>
+        <w:ind w:left="6480" w:hanging="360"/>
+      </w:pPr>
+      <w:rPr>
+        <w:rFonts w:ascii="Wingdings" w:hAnsi="Wingdings" w:hint="default"/>
+        <w:sz w:val="20"/>
+      </w:rPr>
+    </w:lvl>
+  </w:abstractNum>
+  <w:abstractNum w:abstractNumId="9" w15:restartNumberingAfterBreak="0">
     <w:nsid w:val="54477EF6"/>
     <w:multiLevelType w:val="hybridMultilevel"/>
     <w:tmpl w:val="F0DE18D0"/>
@@ -3168,7 +3402,7 @@
       </w:rPr>
     </w:lvl>
   </w:abstractNum>
-  <w:abstractNum w:abstractNumId="9" w15:restartNumberingAfterBreak="0">
+  <w:abstractNum w:abstractNumId="10" w15:restartNumberingAfterBreak="0">
     <w:nsid w:val="5680300B"/>
     <w:multiLevelType w:val="multilevel"/>
     <w:tmpl w:val="AB92B60E"/>
@@ -3317,7 +3551,7 @@
       </w:rPr>
     </w:lvl>
   </w:abstractNum>
-  <w:abstractNum w:abstractNumId="10" w15:restartNumberingAfterBreak="0">
+  <w:abstractNum w:abstractNumId="11" w15:restartNumberingAfterBreak="0">
     <w:nsid w:val="66841202"/>
     <w:multiLevelType w:val="multilevel"/>
     <w:tmpl w:val="2618EDDE"/>
@@ -3466,7 +3700,7 @@
       </w:rPr>
     </w:lvl>
   </w:abstractNum>
-  <w:abstractNum w:abstractNumId="11" w15:restartNumberingAfterBreak="0">
+  <w:abstractNum w:abstractNumId="12" w15:restartNumberingAfterBreak="0">
     <w:nsid w:val="6D940B6B"/>
     <w:multiLevelType w:val="hybridMultilevel"/>
     <w:tmpl w:val="5658D946"/>
@@ -3555,7 +3789,7 @@
       </w:pPr>
     </w:lvl>
   </w:abstractNum>
-  <w:abstractNum w:abstractNumId="12" w15:restartNumberingAfterBreak="0">
+  <w:abstractNum w:abstractNumId="13" w15:restartNumberingAfterBreak="0">
     <w:nsid w:val="6E615836"/>
     <w:multiLevelType w:val="hybridMultilevel"/>
     <w:tmpl w:val="A0045F34"/>
@@ -3641,7 +3875,7 @@
       </w:pPr>
     </w:lvl>
   </w:abstractNum>
-  <w:abstractNum w:abstractNumId="13" w15:restartNumberingAfterBreak="0">
+  <w:abstractNum w:abstractNumId="14" w15:restartNumberingAfterBreak="0">
     <w:nsid w:val="72347A5D"/>
     <w:multiLevelType w:val="hybridMultilevel"/>
     <w:tmpl w:val="5F1C5312"/>
@@ -3754,7 +3988,7 @@
       </w:rPr>
     </w:lvl>
   </w:abstractNum>
-  <w:abstractNum w:abstractNumId="14" w15:restartNumberingAfterBreak="0">
+  <w:abstractNum w:abstractNumId="15" w15:restartNumberingAfterBreak="0">
     <w:nsid w:val="774B47E9"/>
     <w:multiLevelType w:val="multilevel"/>
     <w:tmpl w:val="1902AA58"/>
@@ -3904,19 +4138,19 @@
     </w:lvl>
   </w:abstractNum>
   <w:num w:numId="1">
-    <w:abstractNumId w:val="11"/>
+    <w:abstractNumId w:val="12"/>
   </w:num>
   <w:num w:numId="2">
     <w:abstractNumId w:val="1"/>
   </w:num>
   <w:num w:numId="3">
-    <w:abstractNumId w:val="9"/>
+    <w:abstractNumId w:val="10"/>
   </w:num>
   <w:num w:numId="4">
-    <w:abstractNumId w:val="10"/>
+    <w:abstractNumId w:val="11"/>
   </w:num>
   <w:num w:numId="5">
-    <w:abstractNumId w:val="13"/>
+    <w:abstractNumId w:val="14"/>
   </w:num>
   <w:num w:numId="6">
     <w:abstractNumId w:val="6"/>
@@ -3928,25 +4162,28 @@
     <w:abstractNumId w:val="4"/>
   </w:num>
   <w:num w:numId="9">
-    <w:abstractNumId w:val="14"/>
+    <w:abstractNumId w:val="15"/>
   </w:num>
   <w:num w:numId="10">
     <w:abstractNumId w:val="5"/>
   </w:num>
   <w:num w:numId="11">
-    <w:abstractNumId w:val="8"/>
+    <w:abstractNumId w:val="9"/>
   </w:num>
   <w:num w:numId="12">
     <w:abstractNumId w:val="3"/>
   </w:num>
   <w:num w:numId="13">
-    <w:abstractNumId w:val="12"/>
+    <w:abstractNumId w:val="13"/>
   </w:num>
   <w:num w:numId="14">
     <w:abstractNumId w:val="2"/>
   </w:num>
   <w:num w:numId="15">
     <w:abstractNumId w:val="7"/>
+  </w:num>
+  <w:num w:numId="16">
+    <w:abstractNumId w:val="8"/>
   </w:num>
 </w:numbering>
 </file>

</xml_diff>

<commit_message>
Unificacion y edicion final arreglos ultimos del #6
</commit_message>
<xml_diff>
--- a/Documentos/Practicas.docx
+++ b/Documentos/Practicas.docx
@@ -221,8 +221,16 @@
         <w:rPr>
           <w:lang w:val="es-VE"/>
         </w:rPr>
-        <w:t>es fundamental establecer roles, reglas claras y elegir las herramientas adecuada</w:t>
-      </w:r>
+        <w:t xml:space="preserve">es fundamental establecer roles, reglas claras y elegir las </w:t>
+      </w:r>
+      <w:proofErr w:type="gramStart"/>
+      <w:r>
+        <w:rPr>
+          <w:lang w:val="es-VE"/>
+        </w:rPr>
+        <w:t>herramientas adecuada</w:t>
+      </w:r>
+      <w:proofErr w:type="gramEnd"/>
     </w:p>
     <w:p>
       <w:pPr>
@@ -1199,15 +1207,33 @@
           <w:bCs/>
           <w:lang w:val="es-VE"/>
         </w:rPr>
-        <w:t xml:space="preserve">Página de Presentación </w:t>
-      </w:r>
+        <w:t xml:space="preserve">Página de </w:t>
+      </w:r>
+      <w:proofErr w:type="gramStart"/>
       <w:r>
         <w:rPr>
           <w:b/>
           <w:bCs/>
           <w:lang w:val="es-VE"/>
         </w:rPr>
-        <w:t xml:space="preserve">: </w:t>
+        <w:t xml:space="preserve">Presentación </w:t>
+      </w:r>
+      <w:r>
+        <w:rPr>
+          <w:b/>
+          <w:bCs/>
+          <w:lang w:val="es-VE"/>
+        </w:rPr>
+        <w:t>:</w:t>
+      </w:r>
+      <w:proofErr w:type="gramEnd"/>
+      <w:r>
+        <w:rPr>
+          <w:b/>
+          <w:bCs/>
+          <w:lang w:val="es-VE"/>
+        </w:rPr>
+        <w:t xml:space="preserve"> </w:t>
       </w:r>
       <w:r>
         <w:rPr>
@@ -1386,7 +1412,16 @@
           <w:bCs/>
           <w:lang w:val="es-VE"/>
         </w:rPr>
-        <w:t xml:space="preserve">7ma edición </w:t>
+        <w:t xml:space="preserve">7ma </w:t>
+      </w:r>
+      <w:proofErr w:type="gramStart"/>
+      <w:r>
+        <w:rPr>
+          <w:b/>
+          <w:bCs/>
+          <w:lang w:val="es-VE"/>
+        </w:rPr>
+        <w:t xml:space="preserve">edición </w:t>
       </w:r>
       <w:r>
         <w:rPr>
@@ -1394,6 +1429,7 @@
         </w:rPr>
         <w:t>:</w:t>
       </w:r>
+      <w:proofErr w:type="gramEnd"/>
     </w:p>
     <w:p>
       <w:pPr>
@@ -2087,7 +2123,109 @@
     </w:p>
     <w:p>
       <w:pPr>
-        <w:rPr>
+        <w:pStyle w:val="Ttulo2"/>
+        <w:rPr>
+          <w:lang w:val="es-VE"/>
+        </w:rPr>
+      </w:pPr>
+      <w:r>
+        <w:rPr>
+          <w:lang w:val="es-VE"/>
+        </w:rPr>
+        <w:t>Exportación y Congelamiento</w:t>
+      </w:r>
+    </w:p>
+    <w:p>
+      <w:pPr>
+        <w:rPr>
+          <w:lang w:val="es-VE"/>
+        </w:rPr>
+      </w:pPr>
+      <w:r>
+        <w:rPr>
+          <w:lang w:val="es-VE"/>
+        </w:rPr>
+        <w:t xml:space="preserve">Una vez que el documento maestro esté unificado y aprobado por todos, se declara </w:t>
+      </w:r>
+      <w:r>
+        <w:rPr>
+          <w:lang w:val="es-VE"/>
+        </w:rPr>
+        <w:t xml:space="preserve">que ya no se hagan modificaciones y </w:t>
+      </w:r>
+      <w:proofErr w:type="spellStart"/>
+      <w:r>
+        <w:rPr>
+          <w:lang w:val="es-VE"/>
+        </w:rPr>
+        <w:t>este</w:t>
+      </w:r>
+      <w:proofErr w:type="spellEnd"/>
+      <w:r>
+        <w:rPr>
+          <w:lang w:val="es-VE"/>
+        </w:rPr>
+        <w:t xml:space="preserve"> listo para enviar al profesor</w:t>
+      </w:r>
+    </w:p>
+    <w:p>
+      <w:pPr>
+        <w:rPr>
+          <w:lang w:val="es-VE"/>
+        </w:rPr>
+      </w:pPr>
+      <w:r>
+        <w:rPr>
+          <w:lang w:val="es-VE"/>
+        </w:rPr>
+        <w:t xml:space="preserve">El archivo final en Word debe exportarse a formato </w:t>
+      </w:r>
+      <w:r>
+        <w:rPr>
+          <w:b/>
+          <w:bCs/>
+          <w:highlight w:val="yellow"/>
+          <w:lang w:val="es-VE"/>
+        </w:rPr>
+        <w:t>PDF</w:t>
+      </w:r>
+      <w:r>
+        <w:rPr>
+          <w:highlight w:val="yellow"/>
+          <w:lang w:val="es-VE"/>
+        </w:rPr>
+        <w:t>.</w:t>
+      </w:r>
+    </w:p>
+    <w:p>
+      <w:pPr>
+        <w:rPr>
+          <w:lang w:val="es-VE"/>
+        </w:rPr>
+      </w:pPr>
+      <w:r>
+        <w:rPr>
+          <w:lang w:val="es-VE"/>
+        </w:rPr>
+        <w:t xml:space="preserve">El envío o carga del documento (ya sea en un repositorio como GitHub o </w:t>
+      </w:r>
+      <w:r>
+        <w:rPr>
+          <w:lang w:val="es-VE"/>
+        </w:rPr>
+        <w:t xml:space="preserve">en el aula virtual) </w:t>
+      </w:r>
+      <w:r>
+        <w:rPr>
+          <w:lang w:val="es-VE"/>
+        </w:rPr>
+        <w:t>debe hacerse utilizando siempre la versión en PDF. Esto garantiza que la estructura, las fuentes y los márgenes no se desconfiguren al ser abiertos en la computadora del evaluador.</w:t>
+      </w:r>
+    </w:p>
+    <w:p>
+      <w:pPr>
+        <w:rPr>
+          <w:u w:val="single"/>
           <w:lang w:val="es-VE"/>
         </w:rPr>
       </w:pPr>

</xml_diff>

<commit_message>
Gestión de Tiempos #7
</commit_message>
<xml_diff>
--- a/Documentos/Practicas.docx
+++ b/Documentos/Practicas.docx
@@ -221,16 +221,8 @@
         <w:rPr>
           <w:lang w:val="es-VE"/>
         </w:rPr>
-        <w:t xml:space="preserve">es fundamental establecer roles, reglas claras y elegir las </w:t>
-      </w:r>
-      <w:proofErr w:type="gramStart"/>
-      <w:r>
-        <w:rPr>
-          <w:lang w:val="es-VE"/>
-        </w:rPr>
-        <w:t>herramientas adecuada</w:t>
-      </w:r>
-      <w:proofErr w:type="gramEnd"/>
+        <w:t>es fundamental establecer roles, reglas claras y elegir las herramientas adecuada</w:t>
+      </w:r>
     </w:p>
     <w:p>
       <w:pPr>
@@ -1099,31 +1091,16 @@
     <w:p>
       <w:pPr>
         <w:pStyle w:val="Ttulo1"/>
-      </w:pPr>
-      <w:r>
-        <w:t xml:space="preserve">II. </w:t>
-      </w:r>
-      <w:proofErr w:type="spellStart"/>
-      <w:r>
-        <w:t>Formatos</w:t>
-      </w:r>
-      <w:proofErr w:type="spellEnd"/>
-      <w:r>
-        <w:t xml:space="preserve"> y </w:t>
-      </w:r>
-      <w:proofErr w:type="spellStart"/>
-      <w:r>
-        <w:t>Estructura</w:t>
-      </w:r>
-      <w:proofErr w:type="spellEnd"/>
-      <w:r>
-        <w:t xml:space="preserve"> del </w:t>
-      </w:r>
-      <w:proofErr w:type="spellStart"/>
-      <w:r>
-        <w:t>Trabajo</w:t>
-      </w:r>
-      <w:proofErr w:type="spellEnd"/>
+        <w:rPr>
+          <w:lang w:val="es-MX"/>
+        </w:rPr>
+      </w:pPr>
+      <w:r>
+        <w:rPr>
+          <w:lang w:val="es-MX"/>
+        </w:rPr>
+        <w:t>II. Formatos y Estructura del Trabajo</w:t>
+      </w:r>
     </w:p>
     <w:p>
       <w:pPr>
@@ -1207,33 +1184,7 @@
           <w:bCs/>
           <w:lang w:val="es-VE"/>
         </w:rPr>
-        <w:t xml:space="preserve">Página de </w:t>
-      </w:r>
-      <w:proofErr w:type="gramStart"/>
-      <w:r>
-        <w:rPr>
-          <w:b/>
-          <w:bCs/>
-          <w:lang w:val="es-VE"/>
-        </w:rPr>
-        <w:t xml:space="preserve">Presentación </w:t>
-      </w:r>
-      <w:r>
-        <w:rPr>
-          <w:b/>
-          <w:bCs/>
-          <w:lang w:val="es-VE"/>
-        </w:rPr>
-        <w:t>:</w:t>
-      </w:r>
-      <w:proofErr w:type="gramEnd"/>
-      <w:r>
-        <w:rPr>
-          <w:b/>
-          <w:bCs/>
-          <w:lang w:val="es-VE"/>
-        </w:rPr>
-        <w:t xml:space="preserve"> </w:t>
+        <w:t xml:space="preserve">Página de Presentación : </w:t>
       </w:r>
       <w:r>
         <w:rPr>
@@ -1253,19 +1204,7 @@
         <w:rPr>
           <w:lang w:val="es-VE"/>
         </w:rPr>
-        <w:t xml:space="preserve"> sus respectivos roles o números de identidad</w:t>
-      </w:r>
-      <w:r>
-        <w:rPr>
-          <w:lang w:val="es-VE"/>
-        </w:rPr>
-        <w:t>,</w:t>
-      </w:r>
-      <w:r>
-        <w:rPr>
-          <w:lang w:val="es-VE"/>
-        </w:rPr>
-        <w:t xml:space="preserve"> fecha de entrega.</w:t>
+        <w:t xml:space="preserve"> sus respectivos roles o números de identidad, fecha de entrega.</w:t>
       </w:r>
     </w:p>
     <w:p>
@@ -1412,16 +1351,7 @@
           <w:bCs/>
           <w:lang w:val="es-VE"/>
         </w:rPr>
-        <w:t xml:space="preserve">7ma </w:t>
-      </w:r>
-      <w:proofErr w:type="gramStart"/>
-      <w:r>
-        <w:rPr>
-          <w:b/>
-          <w:bCs/>
-          <w:lang w:val="es-VE"/>
-        </w:rPr>
-        <w:t xml:space="preserve">edición </w:t>
+        <w:t xml:space="preserve">7ma edición </w:t>
       </w:r>
       <w:r>
         <w:rPr>
@@ -1429,7 +1359,6 @@
         </w:rPr>
         <w:t>:</w:t>
       </w:r>
-      <w:proofErr w:type="gramEnd"/>
     </w:p>
     <w:p>
       <w:pPr>
@@ -2220,6 +2149,181 @@
           <w:lang w:val="es-VE"/>
         </w:rPr>
         <w:t>debe hacerse utilizando siempre la versión en PDF. Esto garantiza que la estructura, las fuentes y los márgenes no se desconfiguren al ser abiertos en la computadora del evaluador.</w:t>
+      </w:r>
+    </w:p>
+    <w:p>
+      <w:pPr>
+        <w:rPr>
+          <w:lang w:val="es-VE"/>
+        </w:rPr>
+      </w:pPr>
+    </w:p>
+    <w:p>
+      <w:pPr>
+        <w:rPr>
+          <w:lang w:val="es-VE"/>
+        </w:rPr>
+      </w:pPr>
+    </w:p>
+    <w:p>
+      <w:pPr>
+        <w:rPr>
+          <w:lang w:val="es-VE"/>
+        </w:rPr>
+      </w:pPr>
+    </w:p>
+    <w:p>
+      <w:pPr>
+        <w:rPr>
+          <w:lang w:val="es-VE"/>
+        </w:rPr>
+      </w:pPr>
+    </w:p>
+    <w:p>
+      <w:pPr>
+        <w:rPr>
+          <w:lang w:val="es-VE"/>
+        </w:rPr>
+      </w:pPr>
+    </w:p>
+    <w:p>
+      <w:pPr>
+        <w:pStyle w:val="Ttulo1"/>
+        <w:rPr>
+          <w:lang w:val="es-VE"/>
+        </w:rPr>
+      </w:pPr>
+      <w:r>
+        <w:rPr>
+          <w:lang w:val="es-VE"/>
+        </w:rPr>
+        <w:lastRenderedPageBreak/>
+        <w:t>V. Gestión de Tiempos</w:t>
+      </w:r>
+    </w:p>
+    <w:p>
+      <w:pPr>
+        <w:rPr>
+          <w:lang w:val="es-VE"/>
+        </w:rPr>
+      </w:pPr>
+      <w:r>
+        <w:rPr>
+          <w:lang w:val="es-VE"/>
+        </w:rPr>
+        <w:t>El tiempo es el recurso más crítico y el que más rápido se agota. Para evitar hacer los trabajos a último minuto y las entregas mediocres, el equipo debe pasar de una gestión reactiva a una planificación proactiva:</w:t>
+      </w:r>
+    </w:p>
+    <w:p>
+      <w:pPr>
+        <w:pStyle w:val="Prrafodelista"/>
+        <w:numPr>
+          <w:ilvl w:val="0"/>
+          <w:numId w:val="17"/>
+        </w:numPr>
+        <w:rPr>
+          <w:lang w:val="es-VE"/>
+        </w:rPr>
+      </w:pPr>
+      <w:r>
+        <w:rPr>
+          <w:lang w:val="es-VE"/>
+        </w:rPr>
+        <w:t>Definición de Hitos: No basta con saber la fecha final. Se deben establecer fechas de entrega intermedias. Por ejemplo: cierre de investigación, primer borrador del cuerpo, revisión cruzada y edición final.</w:t>
+      </w:r>
+    </w:p>
+    <w:p>
+      <w:pPr>
+        <w:pStyle w:val="Prrafodelista"/>
+        <w:numPr>
+          <w:ilvl w:val="0"/>
+          <w:numId w:val="17"/>
+        </w:numPr>
+        <w:rPr>
+          <w:lang w:val="es-VE"/>
+        </w:rPr>
+      </w:pPr>
+      <w:r>
+        <w:rPr>
+          <w:lang w:val="es-VE"/>
+        </w:rPr>
+        <w:t xml:space="preserve">La Regla del Margen de Error: No se puede planificar todo al último  el día de la entrega. El desarrollo del documento debe ocurrir al menos 48 horas antes de la fecha límite. Esto permite reaccionar ante fallos de internet, </w:t>
+      </w:r>
+      <w:r>
+        <w:rPr>
+          <w:lang w:val="es-VE"/>
+        </w:rPr>
+        <w:t>apagones de luz</w:t>
+      </w:r>
+      <w:r>
+        <w:rPr>
+          <w:lang w:val="es-VE"/>
+        </w:rPr>
+        <w:t xml:space="preserve"> o emergencias personales.</w:t>
+      </w:r>
+    </w:p>
+    <w:p>
+      <w:pPr>
+        <w:pStyle w:val="Prrafodelista"/>
+        <w:numPr>
+          <w:ilvl w:val="0"/>
+          <w:numId w:val="17"/>
+        </w:numPr>
+        <w:rPr>
+          <w:lang w:val="es-VE"/>
+        </w:rPr>
+      </w:pPr>
+      <w:r>
+        <w:rPr>
+          <w:lang w:val="es-VE"/>
+        </w:rPr>
+        <w:t xml:space="preserve">Uso de Tableros Kanban: Implementar herramientas como los Project </w:t>
+      </w:r>
+      <w:proofErr w:type="spellStart"/>
+      <w:r>
+        <w:rPr>
+          <w:lang w:val="es-VE"/>
+        </w:rPr>
+        <w:t>Boards</w:t>
+      </w:r>
+      <w:proofErr w:type="spellEnd"/>
+      <w:r>
+        <w:rPr>
+          <w:lang w:val="es-VE"/>
+        </w:rPr>
+        <w:t xml:space="preserve"> de GitHub o Trello. Visualizar las tareas en columnas de "Por hacer", "En proceso" y "Finalizado" permite que el coordinador detecte cuellos de botella sin tener que preguntar constantemente a cada integrante.</w:t>
+      </w:r>
+    </w:p>
+    <w:p>
+      <w:pPr>
+        <w:pStyle w:val="Prrafodelista"/>
+        <w:numPr>
+          <w:ilvl w:val="0"/>
+          <w:numId w:val="17"/>
+        </w:numPr>
+        <w:rPr>
+          <w:lang w:val="es-VE"/>
+        </w:rPr>
+      </w:pPr>
+      <w:r>
+        <w:rPr>
+          <w:lang w:val="es-VE"/>
+        </w:rPr>
+        <w:t>Técnica de Time-</w:t>
+      </w:r>
+      <w:proofErr w:type="spellStart"/>
+      <w:r>
+        <w:rPr>
+          <w:lang w:val="es-VE"/>
+        </w:rPr>
+        <w:t>Blocking</w:t>
+      </w:r>
+      <w:proofErr w:type="spellEnd"/>
+      <w:r>
+        <w:rPr>
+          <w:lang w:val="es-VE"/>
+        </w:rPr>
+        <w:t>: Se recomienda que el equipo acuerde bloques de tiempo específicos a la semana donde todos estén conectados simultáneamente (aunque sea en silencio) para resolver dudas inmediatas.</w:t>
       </w:r>
     </w:p>
     <w:p>
@@ -3080,6 +3184,95 @@
     </w:lvl>
   </w:abstractNum>
   <w:abstractNum w:abstractNumId="6" w15:restartNumberingAfterBreak="0">
+    <w:nsid w:val="33B32A9C"/>
+    <w:multiLevelType w:val="hybridMultilevel"/>
+    <w:tmpl w:val="61C65292"/>
+    <w:lvl w:ilvl="0" w:tplc="148C94AE">
+      <w:start w:val="1"/>
+      <w:numFmt w:val="decimal"/>
+      <w:lvlText w:val="%1)"/>
+      <w:lvlJc w:val="left"/>
+      <w:pPr>
+        <w:ind w:left="1080" w:hanging="360"/>
+      </w:pPr>
+      <w:rPr>
+        <w:rFonts w:hint="default"/>
+      </w:rPr>
+    </w:lvl>
+    <w:lvl w:ilvl="1" w:tplc="04150019" w:tentative="1">
+      <w:start w:val="1"/>
+      <w:numFmt w:val="lowerLetter"/>
+      <w:lvlText w:val="%2."/>
+      <w:lvlJc w:val="left"/>
+      <w:pPr>
+        <w:ind w:left="1800" w:hanging="360"/>
+      </w:pPr>
+    </w:lvl>
+    <w:lvl w:ilvl="2" w:tplc="0415001B" w:tentative="1">
+      <w:start w:val="1"/>
+      <w:numFmt w:val="lowerRoman"/>
+      <w:lvlText w:val="%3."/>
+      <w:lvlJc w:val="right"/>
+      <w:pPr>
+        <w:ind w:left="2520" w:hanging="180"/>
+      </w:pPr>
+    </w:lvl>
+    <w:lvl w:ilvl="3" w:tplc="0415000F" w:tentative="1">
+      <w:start w:val="1"/>
+      <w:numFmt w:val="decimal"/>
+      <w:lvlText w:val="%4."/>
+      <w:lvlJc w:val="left"/>
+      <w:pPr>
+        <w:ind w:left="3240" w:hanging="360"/>
+      </w:pPr>
+    </w:lvl>
+    <w:lvl w:ilvl="4" w:tplc="04150019" w:tentative="1">
+      <w:start w:val="1"/>
+      <w:numFmt w:val="lowerLetter"/>
+      <w:lvlText w:val="%5."/>
+      <w:lvlJc w:val="left"/>
+      <w:pPr>
+        <w:ind w:left="3960" w:hanging="360"/>
+      </w:pPr>
+    </w:lvl>
+    <w:lvl w:ilvl="5" w:tplc="0415001B" w:tentative="1">
+      <w:start w:val="1"/>
+      <w:numFmt w:val="lowerRoman"/>
+      <w:lvlText w:val="%6."/>
+      <w:lvlJc w:val="right"/>
+      <w:pPr>
+        <w:ind w:left="4680" w:hanging="180"/>
+      </w:pPr>
+    </w:lvl>
+    <w:lvl w:ilvl="6" w:tplc="0415000F" w:tentative="1">
+      <w:start w:val="1"/>
+      <w:numFmt w:val="decimal"/>
+      <w:lvlText w:val="%7."/>
+      <w:lvlJc w:val="left"/>
+      <w:pPr>
+        <w:ind w:left="5400" w:hanging="360"/>
+      </w:pPr>
+    </w:lvl>
+    <w:lvl w:ilvl="7" w:tplc="04150019" w:tentative="1">
+      <w:start w:val="1"/>
+      <w:numFmt w:val="lowerLetter"/>
+      <w:lvlText w:val="%8."/>
+      <w:lvlJc w:val="left"/>
+      <w:pPr>
+        <w:ind w:left="6120" w:hanging="360"/>
+      </w:pPr>
+    </w:lvl>
+    <w:lvl w:ilvl="8" w:tplc="0415001B" w:tentative="1">
+      <w:start w:val="1"/>
+      <w:numFmt w:val="lowerRoman"/>
+      <w:lvlText w:val="%9."/>
+      <w:lvlJc w:val="right"/>
+      <w:pPr>
+        <w:ind w:left="6840" w:hanging="180"/>
+      </w:pPr>
+    </w:lvl>
+  </w:abstractNum>
+  <w:abstractNum w:abstractNumId="7" w15:restartNumberingAfterBreak="0">
     <w:nsid w:val="3B241C37"/>
     <w:multiLevelType w:val="hybridMultilevel"/>
     <w:tmpl w:val="5CB02D7A"/>
@@ -3192,7 +3385,7 @@
       </w:rPr>
     </w:lvl>
   </w:abstractNum>
-  <w:abstractNum w:abstractNumId="7" w15:restartNumberingAfterBreak="0">
+  <w:abstractNum w:abstractNumId="8" w15:restartNumberingAfterBreak="0">
     <w:nsid w:val="3D897148"/>
     <w:multiLevelType w:val="hybridMultilevel"/>
     <w:tmpl w:val="5F246F42"/>
@@ -3278,7 +3471,7 @@
       </w:pPr>
     </w:lvl>
   </w:abstractNum>
-  <w:abstractNum w:abstractNumId="8" w15:restartNumberingAfterBreak="0">
+  <w:abstractNum w:abstractNumId="9" w15:restartNumberingAfterBreak="0">
     <w:nsid w:val="4F787A5F"/>
     <w:multiLevelType w:val="multilevel"/>
     <w:tmpl w:val="CEECADE8"/>
@@ -3427,7 +3620,7 @@
       </w:rPr>
     </w:lvl>
   </w:abstractNum>
-  <w:abstractNum w:abstractNumId="9" w15:restartNumberingAfterBreak="0">
+  <w:abstractNum w:abstractNumId="10" w15:restartNumberingAfterBreak="0">
     <w:nsid w:val="54477EF6"/>
     <w:multiLevelType w:val="hybridMultilevel"/>
     <w:tmpl w:val="F0DE18D0"/>
@@ -3540,7 +3733,7 @@
       </w:rPr>
     </w:lvl>
   </w:abstractNum>
-  <w:abstractNum w:abstractNumId="10" w15:restartNumberingAfterBreak="0">
+  <w:abstractNum w:abstractNumId="11" w15:restartNumberingAfterBreak="0">
     <w:nsid w:val="5680300B"/>
     <w:multiLevelType w:val="multilevel"/>
     <w:tmpl w:val="AB92B60E"/>
@@ -3689,7 +3882,7 @@
       </w:rPr>
     </w:lvl>
   </w:abstractNum>
-  <w:abstractNum w:abstractNumId="11" w15:restartNumberingAfterBreak="0">
+  <w:abstractNum w:abstractNumId="12" w15:restartNumberingAfterBreak="0">
     <w:nsid w:val="66841202"/>
     <w:multiLevelType w:val="multilevel"/>
     <w:tmpl w:val="2618EDDE"/>
@@ -3838,7 +4031,7 @@
       </w:rPr>
     </w:lvl>
   </w:abstractNum>
-  <w:abstractNum w:abstractNumId="12" w15:restartNumberingAfterBreak="0">
+  <w:abstractNum w:abstractNumId="13" w15:restartNumberingAfterBreak="0">
     <w:nsid w:val="6D940B6B"/>
     <w:multiLevelType w:val="hybridMultilevel"/>
     <w:tmpl w:val="5658D946"/>
@@ -3927,7 +4120,7 @@
       </w:pPr>
     </w:lvl>
   </w:abstractNum>
-  <w:abstractNum w:abstractNumId="13" w15:restartNumberingAfterBreak="0">
+  <w:abstractNum w:abstractNumId="14" w15:restartNumberingAfterBreak="0">
     <w:nsid w:val="6E615836"/>
     <w:multiLevelType w:val="hybridMultilevel"/>
     <w:tmpl w:val="A0045F34"/>
@@ -4013,7 +4206,7 @@
       </w:pPr>
     </w:lvl>
   </w:abstractNum>
-  <w:abstractNum w:abstractNumId="14" w15:restartNumberingAfterBreak="0">
+  <w:abstractNum w:abstractNumId="15" w15:restartNumberingAfterBreak="0">
     <w:nsid w:val="72347A5D"/>
     <w:multiLevelType w:val="hybridMultilevel"/>
     <w:tmpl w:val="5F1C5312"/>
@@ -4126,7 +4319,7 @@
       </w:rPr>
     </w:lvl>
   </w:abstractNum>
-  <w:abstractNum w:abstractNumId="15" w15:restartNumberingAfterBreak="0">
+  <w:abstractNum w:abstractNumId="16" w15:restartNumberingAfterBreak="0">
     <w:nsid w:val="774B47E9"/>
     <w:multiLevelType w:val="multilevel"/>
     <w:tmpl w:val="1902AA58"/>
@@ -4276,22 +4469,22 @@
     </w:lvl>
   </w:abstractNum>
   <w:num w:numId="1">
-    <w:abstractNumId w:val="12"/>
+    <w:abstractNumId w:val="13"/>
   </w:num>
   <w:num w:numId="2">
     <w:abstractNumId w:val="1"/>
   </w:num>
   <w:num w:numId="3">
-    <w:abstractNumId w:val="10"/>
+    <w:abstractNumId w:val="11"/>
   </w:num>
   <w:num w:numId="4">
-    <w:abstractNumId w:val="11"/>
+    <w:abstractNumId w:val="12"/>
   </w:num>
   <w:num w:numId="5">
-    <w:abstractNumId w:val="14"/>
+    <w:abstractNumId w:val="15"/>
   </w:num>
   <w:num w:numId="6">
-    <w:abstractNumId w:val="6"/>
+    <w:abstractNumId w:val="7"/>
   </w:num>
   <w:num w:numId="7">
     <w:abstractNumId w:val="0"/>
@@ -4300,28 +4493,31 @@
     <w:abstractNumId w:val="4"/>
   </w:num>
   <w:num w:numId="9">
-    <w:abstractNumId w:val="15"/>
+    <w:abstractNumId w:val="16"/>
   </w:num>
   <w:num w:numId="10">
     <w:abstractNumId w:val="5"/>
   </w:num>
   <w:num w:numId="11">
-    <w:abstractNumId w:val="9"/>
+    <w:abstractNumId w:val="10"/>
   </w:num>
   <w:num w:numId="12">
     <w:abstractNumId w:val="3"/>
   </w:num>
   <w:num w:numId="13">
-    <w:abstractNumId w:val="13"/>
+    <w:abstractNumId w:val="14"/>
   </w:num>
   <w:num w:numId="14">
     <w:abstractNumId w:val="2"/>
   </w:num>
   <w:num w:numId="15">
-    <w:abstractNumId w:val="7"/>
+    <w:abstractNumId w:val="8"/>
   </w:num>
   <w:num w:numId="16">
-    <w:abstractNumId w:val="8"/>
+    <w:abstractNumId w:val="9"/>
+  </w:num>
+  <w:num w:numId="17">
+    <w:abstractNumId w:val="6"/>
   </w:num>
 </w:numbering>
 </file>
@@ -4805,6 +5001,7 @@
   <w:style w:type="character" w:default="1" w:styleId="Fuentedeprrafopredeter">
     <w:name w:val="Default Paragraph Font"/>
     <w:uiPriority w:val="1"/>
+    <w:semiHidden/>
     <w:unhideWhenUsed/>
   </w:style>
   <w:style w:type="table" w:default="1" w:styleId="Tablanormal">

</xml_diff>

<commit_message>
Citación y Referencias Bibliográficas primera parte #8
</commit_message>
<xml_diff>
--- a/Documentos/Practicas.docx
+++ b/Documentos/Practicas.docx
@@ -2324,6 +2324,100 @@
           <w:lang w:val="es-VE"/>
         </w:rPr>
         <w:t>: Se recomienda que el equipo acuerde bloques de tiempo específicos a la semana donde todos estén conectados simultáneamente (aunque sea en silencio) para resolver dudas inmediatas.</w:t>
+      </w:r>
+    </w:p>
+    <w:p>
+      <w:pPr>
+        <w:rPr>
+          <w:lang w:val="es-VE"/>
+        </w:rPr>
+      </w:pPr>
+    </w:p>
+    <w:p>
+      <w:pPr>
+        <w:rPr>
+          <w:lang w:val="es-VE"/>
+        </w:rPr>
+      </w:pPr>
+    </w:p>
+    <w:p>
+      <w:pPr>
+        <w:rPr>
+          <w:lang w:val="es-VE"/>
+        </w:rPr>
+      </w:pPr>
+    </w:p>
+    <w:p>
+      <w:pPr>
+        <w:rPr>
+          <w:lang w:val="es-VE"/>
+        </w:rPr>
+      </w:pPr>
+    </w:p>
+    <w:p>
+      <w:pPr>
+        <w:pStyle w:val="Ttulo1"/>
+        <w:rPr>
+          <w:lang w:val="es-VE"/>
+        </w:rPr>
+      </w:pPr>
+      <w:r>
+        <w:rPr>
+          <w:lang w:val="es-VE"/>
+        </w:rPr>
+        <w:lastRenderedPageBreak/>
+        <w:t>VI. Citación y Referencias Bibliográficas</w:t>
+      </w:r>
+    </w:p>
+    <w:p>
+      <w:pPr>
+        <w:rPr>
+          <w:lang w:val="es-VE"/>
+        </w:rPr>
+      </w:pPr>
+      <w:r>
+        <w:rPr>
+          <w:lang w:val="es-VE"/>
+        </w:rPr>
+        <w:t>En el ámbito universitario, el rigor académico se mide por la calidad de las fuentes. El plagio, incluso si es accidental por mala citación, puede invalidar todo el esfuerzo del equipo</w:t>
+      </w:r>
+      <w:r>
+        <w:rPr>
+          <w:lang w:val="es-VE"/>
+        </w:rPr>
+        <w:t>:</w:t>
+      </w:r>
+    </w:p>
+    <w:p>
+      <w:pPr>
+        <w:pStyle w:val="Prrafodelista"/>
+        <w:numPr>
+          <w:ilvl w:val="0"/>
+          <w:numId w:val="18"/>
+        </w:numPr>
+        <w:rPr>
+          <w:lang w:val="es-VE"/>
+        </w:rPr>
+      </w:pPr>
+      <w:r>
+        <w:rPr>
+          <w:lang w:val="es-VE"/>
+        </w:rPr>
+        <w:t xml:space="preserve">Uso de Gestores Bibliográficos: Para proyectos de ingeniería y sistemas, es altamente recomendable usar herramientas como Zotero o Mendeley. Estas permiten compartir una librería común donde todos los integrantes depositan los </w:t>
+      </w:r>
+      <w:proofErr w:type="spellStart"/>
+      <w:r>
+        <w:rPr>
+          <w:lang w:val="es-VE"/>
+        </w:rPr>
+        <w:t>PDFs</w:t>
+      </w:r>
+      <w:proofErr w:type="spellEnd"/>
+      <w:r>
+        <w:rPr>
+          <w:lang w:val="es-VE"/>
+        </w:rPr>
+        <w:t xml:space="preserve"> y artículos encontrados.</w:t>
       </w:r>
     </w:p>
     <w:p>
@@ -4468,6 +4562,95 @@
       </w:rPr>
     </w:lvl>
   </w:abstractNum>
+  <w:abstractNum w:abstractNumId="17" w15:restartNumberingAfterBreak="0">
+    <w:nsid w:val="791A39F6"/>
+    <w:multiLevelType w:val="hybridMultilevel"/>
+    <w:tmpl w:val="140A212A"/>
+    <w:lvl w:ilvl="0" w:tplc="A310110A">
+      <w:start w:val="1"/>
+      <w:numFmt w:val="decimal"/>
+      <w:lvlText w:val="%1)"/>
+      <w:lvlJc w:val="left"/>
+      <w:pPr>
+        <w:ind w:left="1080" w:hanging="360"/>
+      </w:pPr>
+      <w:rPr>
+        <w:rFonts w:hint="default"/>
+      </w:rPr>
+    </w:lvl>
+    <w:lvl w:ilvl="1" w:tplc="04150019" w:tentative="1">
+      <w:start w:val="1"/>
+      <w:numFmt w:val="lowerLetter"/>
+      <w:lvlText w:val="%2."/>
+      <w:lvlJc w:val="left"/>
+      <w:pPr>
+        <w:ind w:left="1800" w:hanging="360"/>
+      </w:pPr>
+    </w:lvl>
+    <w:lvl w:ilvl="2" w:tplc="0415001B" w:tentative="1">
+      <w:start w:val="1"/>
+      <w:numFmt w:val="lowerRoman"/>
+      <w:lvlText w:val="%3."/>
+      <w:lvlJc w:val="right"/>
+      <w:pPr>
+        <w:ind w:left="2520" w:hanging="180"/>
+      </w:pPr>
+    </w:lvl>
+    <w:lvl w:ilvl="3" w:tplc="0415000F" w:tentative="1">
+      <w:start w:val="1"/>
+      <w:numFmt w:val="decimal"/>
+      <w:lvlText w:val="%4."/>
+      <w:lvlJc w:val="left"/>
+      <w:pPr>
+        <w:ind w:left="3240" w:hanging="360"/>
+      </w:pPr>
+    </w:lvl>
+    <w:lvl w:ilvl="4" w:tplc="04150019" w:tentative="1">
+      <w:start w:val="1"/>
+      <w:numFmt w:val="lowerLetter"/>
+      <w:lvlText w:val="%5."/>
+      <w:lvlJc w:val="left"/>
+      <w:pPr>
+        <w:ind w:left="3960" w:hanging="360"/>
+      </w:pPr>
+    </w:lvl>
+    <w:lvl w:ilvl="5" w:tplc="0415001B" w:tentative="1">
+      <w:start w:val="1"/>
+      <w:numFmt w:val="lowerRoman"/>
+      <w:lvlText w:val="%6."/>
+      <w:lvlJc w:val="right"/>
+      <w:pPr>
+        <w:ind w:left="4680" w:hanging="180"/>
+      </w:pPr>
+    </w:lvl>
+    <w:lvl w:ilvl="6" w:tplc="0415000F" w:tentative="1">
+      <w:start w:val="1"/>
+      <w:numFmt w:val="decimal"/>
+      <w:lvlText w:val="%7."/>
+      <w:lvlJc w:val="left"/>
+      <w:pPr>
+        <w:ind w:left="5400" w:hanging="360"/>
+      </w:pPr>
+    </w:lvl>
+    <w:lvl w:ilvl="7" w:tplc="04150019" w:tentative="1">
+      <w:start w:val="1"/>
+      <w:numFmt w:val="lowerLetter"/>
+      <w:lvlText w:val="%8."/>
+      <w:lvlJc w:val="left"/>
+      <w:pPr>
+        <w:ind w:left="6120" w:hanging="360"/>
+      </w:pPr>
+    </w:lvl>
+    <w:lvl w:ilvl="8" w:tplc="0415001B" w:tentative="1">
+      <w:start w:val="1"/>
+      <w:numFmt w:val="lowerRoman"/>
+      <w:lvlText w:val="%9."/>
+      <w:lvlJc w:val="right"/>
+      <w:pPr>
+        <w:ind w:left="6840" w:hanging="180"/>
+      </w:pPr>
+    </w:lvl>
+  </w:abstractNum>
   <w:num w:numId="1">
     <w:abstractNumId w:val="13"/>
   </w:num>
@@ -4518,6 +4701,9 @@
   </w:num>
   <w:num w:numId="17">
     <w:abstractNumId w:val="6"/>
+  </w:num>
+  <w:num w:numId="18">
+    <w:abstractNumId w:val="17"/>
   </w:num>
 </w:numbering>
 </file>

</xml_diff>

<commit_message>
Citación y Referencias Bibliográficas segunda parte #8
</commit_message>
<xml_diff>
--- a/Documentos/Practicas.docx
+++ b/Documentos/Practicas.docx
@@ -2229,7 +2229,13 @@
         <w:rPr>
           <w:lang w:val="es-VE"/>
         </w:rPr>
-        <w:t>Definición de Hitos: No basta con saber la fecha final. Se deben establecer fechas de entrega intermedias. Por ejemplo: cierre de investigación, primer borrador del cuerpo, revisión cruzada y edición final.</w:t>
+        <w:t>Definición de Hitos: No basta con saber la fecha final. Se deben establecer fechas de entrega intermedias. Por ejemplo: cierre de investigación, primer borrador del cuerpo, revisión cruzada y edición final</w:t>
+      </w:r>
+      <w:r>
+        <w:rPr>
+          <w:lang w:val="es-VE"/>
+        </w:rPr>
+        <w:t>.</w:t>
       </w:r>
     </w:p>
     <w:p>
@@ -2419,6 +2425,387 @@
         </w:rPr>
         <w:t xml:space="preserve"> y artículos encontrados.</w:t>
       </w:r>
+    </w:p>
+    <w:p>
+      <w:pPr>
+        <w:pStyle w:val="Prrafodelista"/>
+        <w:ind w:left="1080" w:firstLine="0"/>
+        <w:rPr>
+          <w:lang w:val="es-VE"/>
+        </w:rPr>
+      </w:pPr>
+    </w:p>
+    <w:p>
+      <w:pPr>
+        <w:pStyle w:val="Prrafodelista"/>
+        <w:numPr>
+          <w:ilvl w:val="0"/>
+          <w:numId w:val="18"/>
+        </w:numPr>
+        <w:rPr>
+          <w:lang w:val="es-VE"/>
+        </w:rPr>
+      </w:pPr>
+      <w:r>
+        <w:rPr>
+          <w:lang w:val="es-VE"/>
+        </w:rPr>
+        <w:t>Citas Textuales vs. Paráfrasis:</w:t>
+      </w:r>
+    </w:p>
+    <w:p>
+      <w:pPr>
+        <w:pStyle w:val="Prrafodelista"/>
+        <w:numPr>
+          <w:ilvl w:val="0"/>
+          <w:numId w:val="19"/>
+        </w:numPr>
+        <w:rPr>
+          <w:lang w:val="es-VE"/>
+        </w:rPr>
+      </w:pPr>
+      <w:r>
+        <w:rPr>
+          <w:lang w:val="es-VE"/>
+        </w:rPr>
+        <w:t>Citas Textuales:</w:t>
+      </w:r>
+      <w:r>
+        <w:rPr>
+          <w:lang w:val="es-VE"/>
+        </w:rPr>
+        <w:t xml:space="preserve"> E</w:t>
+      </w:r>
+      <w:r>
+        <w:rPr>
+          <w:lang w:val="es-VE"/>
+        </w:rPr>
+        <w:t>s la reproducción exacta y literal de las palabras de otro autor dentro de un trabajo propio, fundamental para respaldar argumentos y evitar el plagio. Requiere comillas si es corta, el apellido del autor, año y página, siguiendo normas como APA o MLA</w:t>
+      </w:r>
+      <w:r>
+        <w:rPr>
+          <w:lang w:val="es-VE"/>
+        </w:rPr>
+        <w:t xml:space="preserve">, si son </w:t>
+      </w:r>
+      <w:r>
+        <w:rPr>
+          <w:lang w:val="es-VE"/>
+        </w:rPr>
+        <w:t>menos de 40 palabras se integran en el texto entre comillas</w:t>
+      </w:r>
+      <w:r>
+        <w:rPr>
+          <w:lang w:val="es-VE"/>
+        </w:rPr>
+        <w:t xml:space="preserve"> pero si son </w:t>
+      </w:r>
+      <w:r>
+        <w:rPr>
+          <w:lang w:val="es-VE"/>
+        </w:rPr>
+        <w:t>más de 40 palabras se colocan en un bloque aparte, sin comillas y con sangría.</w:t>
+      </w:r>
+    </w:p>
+    <w:p>
+      <w:pPr>
+        <w:pStyle w:val="Prrafodelista"/>
+        <w:ind w:left="1440" w:firstLine="0"/>
+        <w:rPr>
+          <w:lang w:val="es-VE"/>
+        </w:rPr>
+      </w:pPr>
+    </w:p>
+    <w:p>
+      <w:pPr>
+        <w:pStyle w:val="Prrafodelista"/>
+        <w:numPr>
+          <w:ilvl w:val="0"/>
+          <w:numId w:val="19"/>
+        </w:numPr>
+        <w:rPr>
+          <w:lang w:val="es-VE"/>
+        </w:rPr>
+      </w:pPr>
+      <w:r>
+        <w:rPr>
+          <w:lang w:val="es-VE"/>
+        </w:rPr>
+        <w:t>Paráfrasis:</w:t>
+      </w:r>
+      <w:r>
+        <w:rPr>
+          <w:lang w:val="es-VE"/>
+        </w:rPr>
+        <w:t xml:space="preserve"> </w:t>
+      </w:r>
+      <w:r>
+        <w:rPr>
+          <w:lang w:val="es-VE"/>
+        </w:rPr>
+        <w:t>La paráfrasis, coloquialmente parafraseo, es la explicación con palabras propias del contenido de un texto para facilitar la comprensión de la información que contenga dicho texto o contenido.</w:t>
+      </w:r>
+      <w:r>
+        <w:rPr>
+          <w:lang w:val="es-VE"/>
+        </w:rPr>
+        <w:t xml:space="preserve"> </w:t>
+      </w:r>
+    </w:p>
+    <w:p>
+      <w:pPr>
+        <w:pStyle w:val="Prrafodelista"/>
+        <w:rPr>
+          <w:lang w:val="es-VE"/>
+        </w:rPr>
+      </w:pPr>
+    </w:p>
+    <w:p>
+      <w:pPr>
+        <w:pStyle w:val="Prrafodelista"/>
+        <w:ind w:left="1440" w:firstLine="0"/>
+        <w:rPr>
+          <w:lang w:val="es-VE"/>
+        </w:rPr>
+      </w:pPr>
+    </w:p>
+    <w:p>
+      <w:pPr>
+        <w:pStyle w:val="Prrafodelista"/>
+        <w:numPr>
+          <w:ilvl w:val="0"/>
+          <w:numId w:val="18"/>
+        </w:numPr>
+        <w:rPr>
+          <w:lang w:val="es-VE"/>
+        </w:rPr>
+      </w:pPr>
+      <w:r>
+        <w:rPr>
+          <w:lang w:val="es-VE"/>
+        </w:rPr>
+        <w:lastRenderedPageBreak/>
+        <w:t>Normas APA 7ma Edición: * Lista de Referencias</w:t>
+      </w:r>
+      <w:r>
+        <w:rPr>
+          <w:lang w:val="es-VE"/>
+        </w:rPr>
+        <w:t xml:space="preserve">: Estas </w:t>
+      </w:r>
+      <w:r>
+        <w:rPr>
+          <w:lang w:val="es-VE"/>
+        </w:rPr>
+        <w:t>debe incluir todas las fuentes citadas, ordenada alfabéticamente al final del documento con sangría francesa (1.27 cm) y doble espacio. Cada entrada incluye: Autor, Fecha, Título y Fuente</w:t>
+      </w:r>
+      <w:r>
+        <w:rPr>
+          <w:lang w:val="es-VE"/>
+        </w:rPr>
+        <w:t>.</w:t>
+      </w:r>
+    </w:p>
+    <w:p>
+      <w:pPr>
+        <w:pStyle w:val="Prrafodelista"/>
+        <w:numPr>
+          <w:ilvl w:val="0"/>
+          <w:numId w:val="20"/>
+        </w:numPr>
+        <w:rPr>
+          <w:lang w:val="es-VE"/>
+        </w:rPr>
+      </w:pPr>
+      <w:r>
+        <w:rPr>
+          <w:lang w:val="es-VE"/>
+        </w:rPr>
+        <w:t xml:space="preserve">DOI y </w:t>
+      </w:r>
+      <w:proofErr w:type="spellStart"/>
+      <w:r>
+        <w:rPr>
+          <w:lang w:val="es-VE"/>
+        </w:rPr>
+        <w:t>URLs</w:t>
+      </w:r>
+      <w:proofErr w:type="spellEnd"/>
+      <w:r>
+        <w:rPr>
+          <w:lang w:val="es-VE"/>
+        </w:rPr>
+        <w:t xml:space="preserve">: En el momento cuando </w:t>
+      </w:r>
+      <w:r>
+        <w:rPr>
+          <w:lang w:val="es-VE"/>
+        </w:rPr>
+        <w:t>ya se tiene toda la información en el documento para este tipos de trabajo, al final se tiene que poner la fuente</w:t>
+      </w:r>
+      <w:r>
+        <w:rPr>
+          <w:lang w:val="es-VE"/>
+        </w:rPr>
+        <w:t xml:space="preserve">s digitales de donde se saco parte de la información, </w:t>
+      </w:r>
+      <w:r>
+        <w:rPr>
+          <w:lang w:val="es-VE"/>
+        </w:rPr>
+        <w:t xml:space="preserve">es obligatorio incluir el DOI (Digital </w:t>
+      </w:r>
+      <w:proofErr w:type="spellStart"/>
+      <w:r>
+        <w:rPr>
+          <w:lang w:val="es-VE"/>
+        </w:rPr>
+        <w:t>Object</w:t>
+      </w:r>
+      <w:proofErr w:type="spellEnd"/>
+      <w:r>
+        <w:rPr>
+          <w:lang w:val="es-VE"/>
+        </w:rPr>
+        <w:t xml:space="preserve"> </w:t>
+      </w:r>
+      <w:proofErr w:type="spellStart"/>
+      <w:r>
+        <w:rPr>
+          <w:lang w:val="es-VE"/>
+        </w:rPr>
+        <w:t>Identifier</w:t>
+      </w:r>
+      <w:proofErr w:type="spellEnd"/>
+      <w:r>
+        <w:rPr>
+          <w:lang w:val="es-VE"/>
+        </w:rPr>
+        <w:t>) o, en su defecto, el enlace directo a la fuente confiable.</w:t>
+      </w:r>
+    </w:p>
+    <w:p>
+      <w:pPr>
+        <w:pStyle w:val="Prrafodelista"/>
+        <w:ind w:left="1440" w:firstLine="0"/>
+        <w:rPr>
+          <w:lang w:val="es-VE"/>
+        </w:rPr>
+      </w:pPr>
+    </w:p>
+    <w:p>
+      <w:pPr>
+        <w:pStyle w:val="Prrafodelista"/>
+        <w:numPr>
+          <w:ilvl w:val="0"/>
+          <w:numId w:val="20"/>
+        </w:numPr>
+        <w:rPr>
+          <w:lang w:val="es-VE"/>
+        </w:rPr>
+      </w:pPr>
+      <w:r>
+        <w:rPr>
+          <w:lang w:val="es-VE"/>
+        </w:rPr>
+        <w:t>Verificación de Fuentes:</w:t>
+      </w:r>
+      <w:r>
+        <w:rPr>
+          <w:lang w:val="es-VE"/>
+        </w:rPr>
+        <w:t xml:space="preserve"> E</w:t>
+      </w:r>
+      <w:r>
+        <w:rPr>
+          <w:lang w:val="es-VE"/>
+        </w:rPr>
+        <w:t xml:space="preserve">s </w:t>
+      </w:r>
+      <w:r>
+        <w:rPr>
+          <w:lang w:val="es-VE"/>
+        </w:rPr>
+        <w:t>el</w:t>
+      </w:r>
+      <w:r>
+        <w:rPr>
+          <w:lang w:val="es-VE"/>
+        </w:rPr>
+        <w:t xml:space="preserve"> proceso crítico para garantizar la integridad académica, evitar el plagio y asegurar la calidad de los trabajos universitarios. Implica evaluar la credibilidad, autoridad y precisión de la información utilizada</w:t>
+      </w:r>
+      <w:r>
+        <w:rPr>
+          <w:lang w:val="es-VE"/>
+        </w:rPr>
+        <w:t>, por eso deberíamos p</w:t>
+      </w:r>
+      <w:r>
+        <w:rPr>
+          <w:lang w:val="es-VE"/>
+        </w:rPr>
+        <w:t xml:space="preserve">riorizar repositorios académicos (Google </w:t>
+      </w:r>
+      <w:proofErr w:type="spellStart"/>
+      <w:r>
+        <w:rPr>
+          <w:lang w:val="es-VE"/>
+        </w:rPr>
+        <w:t>Scholar</w:t>
+      </w:r>
+      <w:proofErr w:type="spellEnd"/>
+      <w:r>
+        <w:rPr>
+          <w:lang w:val="es-VE"/>
+        </w:rPr>
+        <w:t xml:space="preserve">, IEEE </w:t>
+      </w:r>
+      <w:proofErr w:type="spellStart"/>
+      <w:r>
+        <w:rPr>
+          <w:lang w:val="es-VE"/>
+        </w:rPr>
+        <w:t>Xplore</w:t>
+      </w:r>
+      <w:proofErr w:type="spellEnd"/>
+      <w:r>
+        <w:rPr>
+          <w:lang w:val="es-VE"/>
+        </w:rPr>
+        <w:t>, SciELO) sobre blogs genéricos o wikis de edición libre</w:t>
+      </w:r>
+      <w:r>
+        <w:rPr>
+          <w:lang w:val="es-VE"/>
+        </w:rPr>
+        <w:t xml:space="preserve"> ya que a veces algunos sitios pueden ser engañosos y no tienen seguridad ni protección </w:t>
+      </w:r>
+    </w:p>
+    <w:p>
+      <w:pPr>
+        <w:pStyle w:val="Prrafodelista"/>
+        <w:rPr>
+          <w:lang w:val="es-VE"/>
+        </w:rPr>
+      </w:pPr>
+    </w:p>
+    <w:p>
+      <w:pPr>
+        <w:pStyle w:val="Prrafodelista"/>
+        <w:ind w:left="1440" w:firstLine="0"/>
+        <w:rPr>
+          <w:lang w:val="es-VE"/>
+        </w:rPr>
+      </w:pPr>
+    </w:p>
+    <w:p>
+      <w:pPr>
+        <w:pStyle w:val="Prrafodelista"/>
+        <w:ind w:left="1440" w:firstLine="0"/>
+        <w:rPr>
+          <w:lang w:val="es-VE"/>
+        </w:rPr>
+      </w:pPr>
     </w:p>
     <w:p>
       <w:pPr>
@@ -3043,6 +3430,95 @@
     </w:lvl>
   </w:abstractNum>
   <w:abstractNum w:abstractNumId="4" w15:restartNumberingAfterBreak="0">
+    <w:nsid w:val="1EEE3D8F"/>
+    <w:multiLevelType w:val="hybridMultilevel"/>
+    <w:tmpl w:val="2CCC181C"/>
+    <w:lvl w:ilvl="0" w:tplc="123E4FFE">
+      <w:start w:val="1"/>
+      <w:numFmt w:val="lowerLetter"/>
+      <w:lvlText w:val="%1)"/>
+      <w:lvlJc w:val="left"/>
+      <w:pPr>
+        <w:ind w:left="1440" w:hanging="360"/>
+      </w:pPr>
+      <w:rPr>
+        <w:rFonts w:hint="default"/>
+      </w:rPr>
+    </w:lvl>
+    <w:lvl w:ilvl="1" w:tplc="04150019" w:tentative="1">
+      <w:start w:val="1"/>
+      <w:numFmt w:val="lowerLetter"/>
+      <w:lvlText w:val="%2."/>
+      <w:lvlJc w:val="left"/>
+      <w:pPr>
+        <w:ind w:left="2160" w:hanging="360"/>
+      </w:pPr>
+    </w:lvl>
+    <w:lvl w:ilvl="2" w:tplc="0415001B" w:tentative="1">
+      <w:start w:val="1"/>
+      <w:numFmt w:val="lowerRoman"/>
+      <w:lvlText w:val="%3."/>
+      <w:lvlJc w:val="right"/>
+      <w:pPr>
+        <w:ind w:left="2880" w:hanging="180"/>
+      </w:pPr>
+    </w:lvl>
+    <w:lvl w:ilvl="3" w:tplc="0415000F" w:tentative="1">
+      <w:start w:val="1"/>
+      <w:numFmt w:val="decimal"/>
+      <w:lvlText w:val="%4."/>
+      <w:lvlJc w:val="left"/>
+      <w:pPr>
+        <w:ind w:left="3600" w:hanging="360"/>
+      </w:pPr>
+    </w:lvl>
+    <w:lvl w:ilvl="4" w:tplc="04150019" w:tentative="1">
+      <w:start w:val="1"/>
+      <w:numFmt w:val="lowerLetter"/>
+      <w:lvlText w:val="%5."/>
+      <w:lvlJc w:val="left"/>
+      <w:pPr>
+        <w:ind w:left="4320" w:hanging="360"/>
+      </w:pPr>
+    </w:lvl>
+    <w:lvl w:ilvl="5" w:tplc="0415001B" w:tentative="1">
+      <w:start w:val="1"/>
+      <w:numFmt w:val="lowerRoman"/>
+      <w:lvlText w:val="%6."/>
+      <w:lvlJc w:val="right"/>
+      <w:pPr>
+        <w:ind w:left="5040" w:hanging="180"/>
+      </w:pPr>
+    </w:lvl>
+    <w:lvl w:ilvl="6" w:tplc="0415000F" w:tentative="1">
+      <w:start w:val="1"/>
+      <w:numFmt w:val="decimal"/>
+      <w:lvlText w:val="%7."/>
+      <w:lvlJc w:val="left"/>
+      <w:pPr>
+        <w:ind w:left="5760" w:hanging="360"/>
+      </w:pPr>
+    </w:lvl>
+    <w:lvl w:ilvl="7" w:tplc="04150019" w:tentative="1">
+      <w:start w:val="1"/>
+      <w:numFmt w:val="lowerLetter"/>
+      <w:lvlText w:val="%8."/>
+      <w:lvlJc w:val="left"/>
+      <w:pPr>
+        <w:ind w:left="6480" w:hanging="360"/>
+      </w:pPr>
+    </w:lvl>
+    <w:lvl w:ilvl="8" w:tplc="0415001B" w:tentative="1">
+      <w:start w:val="1"/>
+      <w:numFmt w:val="lowerRoman"/>
+      <w:lvlText w:val="%9."/>
+      <w:lvlJc w:val="right"/>
+      <w:pPr>
+        <w:ind w:left="7200" w:hanging="180"/>
+      </w:pPr>
+    </w:lvl>
+  </w:abstractNum>
+  <w:abstractNum w:abstractNumId="5" w15:restartNumberingAfterBreak="0">
     <w:nsid w:val="21BA1B13"/>
     <w:multiLevelType w:val="hybridMultilevel"/>
     <w:tmpl w:val="8520873A"/>
@@ -3128,7 +3604,7 @@
       </w:pPr>
     </w:lvl>
   </w:abstractNum>
-  <w:abstractNum w:abstractNumId="5" w15:restartNumberingAfterBreak="0">
+  <w:abstractNum w:abstractNumId="6" w15:restartNumberingAfterBreak="0">
     <w:nsid w:val="301D7B33"/>
     <w:multiLevelType w:val="multilevel"/>
     <w:tmpl w:val="313E83AC"/>
@@ -3277,7 +3753,7 @@
       </w:rPr>
     </w:lvl>
   </w:abstractNum>
-  <w:abstractNum w:abstractNumId="6" w15:restartNumberingAfterBreak="0">
+  <w:abstractNum w:abstractNumId="7" w15:restartNumberingAfterBreak="0">
     <w:nsid w:val="33B32A9C"/>
     <w:multiLevelType w:val="hybridMultilevel"/>
     <w:tmpl w:val="61C65292"/>
@@ -3366,7 +3842,7 @@
       </w:pPr>
     </w:lvl>
   </w:abstractNum>
-  <w:abstractNum w:abstractNumId="7" w15:restartNumberingAfterBreak="0">
+  <w:abstractNum w:abstractNumId="8" w15:restartNumberingAfterBreak="0">
     <w:nsid w:val="3B241C37"/>
     <w:multiLevelType w:val="hybridMultilevel"/>
     <w:tmpl w:val="5CB02D7A"/>
@@ -3479,7 +3955,7 @@
       </w:rPr>
     </w:lvl>
   </w:abstractNum>
-  <w:abstractNum w:abstractNumId="8" w15:restartNumberingAfterBreak="0">
+  <w:abstractNum w:abstractNumId="9" w15:restartNumberingAfterBreak="0">
     <w:nsid w:val="3D897148"/>
     <w:multiLevelType w:val="hybridMultilevel"/>
     <w:tmpl w:val="5F246F42"/>
@@ -3565,7 +4041,7 @@
       </w:pPr>
     </w:lvl>
   </w:abstractNum>
-  <w:abstractNum w:abstractNumId="9" w15:restartNumberingAfterBreak="0">
+  <w:abstractNum w:abstractNumId="10" w15:restartNumberingAfterBreak="0">
     <w:nsid w:val="4F787A5F"/>
     <w:multiLevelType w:val="multilevel"/>
     <w:tmpl w:val="CEECADE8"/>
@@ -3714,7 +4190,7 @@
       </w:rPr>
     </w:lvl>
   </w:abstractNum>
-  <w:abstractNum w:abstractNumId="10" w15:restartNumberingAfterBreak="0">
+  <w:abstractNum w:abstractNumId="11" w15:restartNumberingAfterBreak="0">
     <w:nsid w:val="54477EF6"/>
     <w:multiLevelType w:val="hybridMultilevel"/>
     <w:tmpl w:val="F0DE18D0"/>
@@ -3827,7 +4303,7 @@
       </w:rPr>
     </w:lvl>
   </w:abstractNum>
-  <w:abstractNum w:abstractNumId="11" w15:restartNumberingAfterBreak="0">
+  <w:abstractNum w:abstractNumId="12" w15:restartNumberingAfterBreak="0">
     <w:nsid w:val="5680300B"/>
     <w:multiLevelType w:val="multilevel"/>
     <w:tmpl w:val="AB92B60E"/>
@@ -3976,7 +4452,7 @@
       </w:rPr>
     </w:lvl>
   </w:abstractNum>
-  <w:abstractNum w:abstractNumId="12" w15:restartNumberingAfterBreak="0">
+  <w:abstractNum w:abstractNumId="13" w15:restartNumberingAfterBreak="0">
     <w:nsid w:val="66841202"/>
     <w:multiLevelType w:val="multilevel"/>
     <w:tmpl w:val="2618EDDE"/>
@@ -4125,7 +4601,96 @@
       </w:rPr>
     </w:lvl>
   </w:abstractNum>
-  <w:abstractNum w:abstractNumId="13" w15:restartNumberingAfterBreak="0">
+  <w:abstractNum w:abstractNumId="14" w15:restartNumberingAfterBreak="0">
+    <w:nsid w:val="681B10A7"/>
+    <w:multiLevelType w:val="hybridMultilevel"/>
+    <w:tmpl w:val="F5D22F12"/>
+    <w:lvl w:ilvl="0" w:tplc="495A59F2">
+      <w:start w:val="1"/>
+      <w:numFmt w:val="lowerLetter"/>
+      <w:lvlText w:val="%1)"/>
+      <w:lvlJc w:val="left"/>
+      <w:pPr>
+        <w:ind w:left="1440" w:hanging="360"/>
+      </w:pPr>
+      <w:rPr>
+        <w:rFonts w:hint="default"/>
+      </w:rPr>
+    </w:lvl>
+    <w:lvl w:ilvl="1" w:tplc="04150019" w:tentative="1">
+      <w:start w:val="1"/>
+      <w:numFmt w:val="lowerLetter"/>
+      <w:lvlText w:val="%2."/>
+      <w:lvlJc w:val="left"/>
+      <w:pPr>
+        <w:ind w:left="2160" w:hanging="360"/>
+      </w:pPr>
+    </w:lvl>
+    <w:lvl w:ilvl="2" w:tplc="0415001B" w:tentative="1">
+      <w:start w:val="1"/>
+      <w:numFmt w:val="lowerRoman"/>
+      <w:lvlText w:val="%3."/>
+      <w:lvlJc w:val="right"/>
+      <w:pPr>
+        <w:ind w:left="2880" w:hanging="180"/>
+      </w:pPr>
+    </w:lvl>
+    <w:lvl w:ilvl="3" w:tplc="0415000F" w:tentative="1">
+      <w:start w:val="1"/>
+      <w:numFmt w:val="decimal"/>
+      <w:lvlText w:val="%4."/>
+      <w:lvlJc w:val="left"/>
+      <w:pPr>
+        <w:ind w:left="3600" w:hanging="360"/>
+      </w:pPr>
+    </w:lvl>
+    <w:lvl w:ilvl="4" w:tplc="04150019" w:tentative="1">
+      <w:start w:val="1"/>
+      <w:numFmt w:val="lowerLetter"/>
+      <w:lvlText w:val="%5."/>
+      <w:lvlJc w:val="left"/>
+      <w:pPr>
+        <w:ind w:left="4320" w:hanging="360"/>
+      </w:pPr>
+    </w:lvl>
+    <w:lvl w:ilvl="5" w:tplc="0415001B" w:tentative="1">
+      <w:start w:val="1"/>
+      <w:numFmt w:val="lowerRoman"/>
+      <w:lvlText w:val="%6."/>
+      <w:lvlJc w:val="right"/>
+      <w:pPr>
+        <w:ind w:left="5040" w:hanging="180"/>
+      </w:pPr>
+    </w:lvl>
+    <w:lvl w:ilvl="6" w:tplc="0415000F" w:tentative="1">
+      <w:start w:val="1"/>
+      <w:numFmt w:val="decimal"/>
+      <w:lvlText w:val="%7."/>
+      <w:lvlJc w:val="left"/>
+      <w:pPr>
+        <w:ind w:left="5760" w:hanging="360"/>
+      </w:pPr>
+    </w:lvl>
+    <w:lvl w:ilvl="7" w:tplc="04150019" w:tentative="1">
+      <w:start w:val="1"/>
+      <w:numFmt w:val="lowerLetter"/>
+      <w:lvlText w:val="%8."/>
+      <w:lvlJc w:val="left"/>
+      <w:pPr>
+        <w:ind w:left="6480" w:hanging="360"/>
+      </w:pPr>
+    </w:lvl>
+    <w:lvl w:ilvl="8" w:tplc="0415001B" w:tentative="1">
+      <w:start w:val="1"/>
+      <w:numFmt w:val="lowerRoman"/>
+      <w:lvlText w:val="%9."/>
+      <w:lvlJc w:val="right"/>
+      <w:pPr>
+        <w:ind w:left="7200" w:hanging="180"/>
+      </w:pPr>
+    </w:lvl>
+  </w:abstractNum>
+  <w:abstractNum w:abstractNumId="15" w15:restartNumberingAfterBreak="0">
     <w:nsid w:val="6D940B6B"/>
     <w:multiLevelType w:val="hybridMultilevel"/>
     <w:tmpl w:val="5658D946"/>
@@ -4214,7 +4779,7 @@
       </w:pPr>
     </w:lvl>
   </w:abstractNum>
-  <w:abstractNum w:abstractNumId="14" w15:restartNumberingAfterBreak="0">
+  <w:abstractNum w:abstractNumId="16" w15:restartNumberingAfterBreak="0">
     <w:nsid w:val="6E615836"/>
     <w:multiLevelType w:val="hybridMultilevel"/>
     <w:tmpl w:val="A0045F34"/>
@@ -4300,7 +4865,7 @@
       </w:pPr>
     </w:lvl>
   </w:abstractNum>
-  <w:abstractNum w:abstractNumId="15" w15:restartNumberingAfterBreak="0">
+  <w:abstractNum w:abstractNumId="17" w15:restartNumberingAfterBreak="0">
     <w:nsid w:val="72347A5D"/>
     <w:multiLevelType w:val="hybridMultilevel"/>
     <w:tmpl w:val="5F1C5312"/>
@@ -4413,7 +4978,7 @@
       </w:rPr>
     </w:lvl>
   </w:abstractNum>
-  <w:abstractNum w:abstractNumId="16" w15:restartNumberingAfterBreak="0">
+  <w:abstractNum w:abstractNumId="18" w15:restartNumberingAfterBreak="0">
     <w:nsid w:val="774B47E9"/>
     <w:multiLevelType w:val="multilevel"/>
     <w:tmpl w:val="1902AA58"/>
@@ -4562,7 +5127,7 @@
       </w:rPr>
     </w:lvl>
   </w:abstractNum>
-  <w:abstractNum w:abstractNumId="17" w15:restartNumberingAfterBreak="0">
+  <w:abstractNum w:abstractNumId="19" w15:restartNumberingAfterBreak="0">
     <w:nsid w:val="791A39F6"/>
     <w:multiLevelType w:val="hybridMultilevel"/>
     <w:tmpl w:val="140A212A"/>
@@ -4652,58 +5217,64 @@
     </w:lvl>
   </w:abstractNum>
   <w:num w:numId="1">
-    <w:abstractNumId w:val="13"/>
+    <w:abstractNumId w:val="15"/>
   </w:num>
   <w:num w:numId="2">
     <w:abstractNumId w:val="1"/>
   </w:num>
   <w:num w:numId="3">
-    <w:abstractNumId w:val="11"/>
+    <w:abstractNumId w:val="12"/>
   </w:num>
   <w:num w:numId="4">
-    <w:abstractNumId w:val="12"/>
+    <w:abstractNumId w:val="13"/>
   </w:num>
   <w:num w:numId="5">
-    <w:abstractNumId w:val="15"/>
+    <w:abstractNumId w:val="17"/>
   </w:num>
   <w:num w:numId="6">
-    <w:abstractNumId w:val="7"/>
+    <w:abstractNumId w:val="8"/>
   </w:num>
   <w:num w:numId="7">
     <w:abstractNumId w:val="0"/>
   </w:num>
   <w:num w:numId="8">
-    <w:abstractNumId w:val="4"/>
+    <w:abstractNumId w:val="5"/>
   </w:num>
   <w:num w:numId="9">
-    <w:abstractNumId w:val="16"/>
+    <w:abstractNumId w:val="18"/>
   </w:num>
   <w:num w:numId="10">
-    <w:abstractNumId w:val="5"/>
+    <w:abstractNumId w:val="6"/>
   </w:num>
   <w:num w:numId="11">
-    <w:abstractNumId w:val="10"/>
+    <w:abstractNumId w:val="11"/>
   </w:num>
   <w:num w:numId="12">
     <w:abstractNumId w:val="3"/>
   </w:num>
   <w:num w:numId="13">
-    <w:abstractNumId w:val="14"/>
+    <w:abstractNumId w:val="16"/>
   </w:num>
   <w:num w:numId="14">
     <w:abstractNumId w:val="2"/>
   </w:num>
   <w:num w:numId="15">
-    <w:abstractNumId w:val="8"/>
+    <w:abstractNumId w:val="9"/>
   </w:num>
   <w:num w:numId="16">
-    <w:abstractNumId w:val="9"/>
+    <w:abstractNumId w:val="10"/>
   </w:num>
   <w:num w:numId="17">
-    <w:abstractNumId w:val="6"/>
+    <w:abstractNumId w:val="7"/>
   </w:num>
   <w:num w:numId="18">
-    <w:abstractNumId w:val="17"/>
+    <w:abstractNumId w:val="19"/>
+  </w:num>
+  <w:num w:numId="19">
+    <w:abstractNumId w:val="14"/>
+  </w:num>
+  <w:num w:numId="20">
+    <w:abstractNumId w:val="4"/>
   </w:num>
 </w:numbering>
 </file>

</xml_diff>

<commit_message>
Gestión de Tiempos ajustes #7
</commit_message>
<xml_diff>
--- a/Documentos/Practicas.docx
+++ b/Documentos/Practicas.docx
@@ -2227,9 +2227,17 @@
       </w:pPr>
       <w:r>
         <w:rPr>
-          <w:lang w:val="es-VE"/>
-        </w:rPr>
-        <w:t>Definición de Hitos: No basta con saber la fecha final. Se deben establecer fechas de entrega intermedias. Por ejemplo: cierre de investigación, primer borrador del cuerpo, revisión cruzada y edición final</w:t>
+          <w:b/>
+          <w:bCs/>
+          <w:lang w:val="es-VE"/>
+        </w:rPr>
+        <w:t>Definición de Hitos:</w:t>
+      </w:r>
+      <w:r>
+        <w:rPr>
+          <w:lang w:val="es-VE"/>
+        </w:rPr>
+        <w:t xml:space="preserve"> No basta con saber la fecha final. Se deben establecer fechas de entrega intermedias. Por ejemplo: cierre de investigación, primer borrador del cuerpo, revisión cruzada y edición final</w:t>
       </w:r>
       <w:r>
         <w:rPr>
@@ -2237,6 +2245,15 @@
         </w:rPr>
         <w:t>.</w:t>
       </w:r>
+    </w:p>
+    <w:p>
+      <w:pPr>
+        <w:pStyle w:val="Prrafodelista"/>
+        <w:ind w:left="1080" w:firstLine="0"/>
+        <w:rPr>
+          <w:lang w:val="es-VE"/>
+        </w:rPr>
+      </w:pPr>
     </w:p>
     <w:p>
       <w:pPr>
@@ -2251,9 +2268,17 @@
       </w:pPr>
       <w:r>
         <w:rPr>
-          <w:lang w:val="es-VE"/>
-        </w:rPr>
-        <w:t xml:space="preserve">La Regla del Margen de Error: No se puede planificar todo al último  el día de la entrega. El desarrollo del documento debe ocurrir al menos 48 horas antes de la fecha límite. Esto permite reaccionar ante fallos de internet, </w:t>
+          <w:b/>
+          <w:bCs/>
+          <w:lang w:val="es-VE"/>
+        </w:rPr>
+        <w:t>La Regla del Margen de Error:</w:t>
+      </w:r>
+      <w:r>
+        <w:rPr>
+          <w:lang w:val="es-VE"/>
+        </w:rPr>
+        <w:t xml:space="preserve"> No se puede planificar todo al último  el día de la entrega. El desarrollo del documento debe ocurrir al menos 48 horas antes de la fecha límite. Esto permite reaccionar ante fallos de internet, </w:t>
       </w:r>
       <w:r>
         <w:rPr>
@@ -2267,6 +2292,15 @@
         </w:rPr>
         <w:t xml:space="preserve"> o emergencias personales.</w:t>
       </w:r>
+    </w:p>
+    <w:p>
+      <w:pPr>
+        <w:pStyle w:val="Prrafodelista"/>
+        <w:ind w:left="1080" w:firstLine="0"/>
+        <w:rPr>
+          <w:lang w:val="es-VE"/>
+        </w:rPr>
+      </w:pPr>
     </w:p>
     <w:p>
       <w:pPr>
@@ -2281,9 +2315,17 @@
       </w:pPr>
       <w:r>
         <w:rPr>
-          <w:lang w:val="es-VE"/>
-        </w:rPr>
-        <w:t xml:space="preserve">Uso de Tableros Kanban: Implementar herramientas como los Project </w:t>
+          <w:b/>
+          <w:bCs/>
+          <w:lang w:val="es-VE"/>
+        </w:rPr>
+        <w:t>Uso de Tableros Kanban:</w:t>
+      </w:r>
+      <w:r>
+        <w:rPr>
+          <w:lang w:val="es-VE"/>
+        </w:rPr>
+        <w:t xml:space="preserve"> Implementar herramientas como los Project </w:t>
       </w:r>
       <w:proofErr w:type="spellStart"/>
       <w:r>
@@ -2299,6 +2341,15 @@
         </w:rPr>
         <w:t xml:space="preserve"> de GitHub o Trello. Visualizar las tareas en columnas de "Por hacer", "En proceso" y "Finalizado" permite que el coordinador detecte cuellos de botella sin tener que preguntar constantemente a cada integrante.</w:t>
       </w:r>
+    </w:p>
+    <w:p>
+      <w:pPr>
+        <w:pStyle w:val="Prrafodelista"/>
+        <w:ind w:left="1080" w:firstLine="0"/>
+        <w:rPr>
+          <w:lang w:val="es-VE"/>
+        </w:rPr>
+      </w:pPr>
     </w:p>
     <w:p>
       <w:pPr>
@@ -2313,6 +2364,8 @@
       </w:pPr>
       <w:r>
         <w:rPr>
+          <w:b/>
+          <w:bCs/>
           <w:lang w:val="es-VE"/>
         </w:rPr>
         <w:t>Técnica de Time-</w:t>
@@ -2320,6 +2373,8 @@
       <w:proofErr w:type="spellStart"/>
       <w:r>
         <w:rPr>
+          <w:b/>
+          <w:bCs/>
           <w:lang w:val="es-VE"/>
         </w:rPr>
         <w:t>Blocking</w:t>
@@ -2327,34 +2382,22 @@
       <w:proofErr w:type="spellEnd"/>
       <w:r>
         <w:rPr>
-          <w:lang w:val="es-VE"/>
-        </w:rPr>
-        <w:t>: Se recomienda que el equipo acuerde bloques de tiempo específicos a la semana donde todos estén conectados simultáneamente (aunque sea en silencio) para resolver dudas inmediatas.</w:t>
-      </w:r>
-    </w:p>
-    <w:p>
-      <w:pPr>
-        <w:rPr>
-          <w:lang w:val="es-VE"/>
-        </w:rPr>
-      </w:pPr>
-    </w:p>
-    <w:p>
-      <w:pPr>
-        <w:rPr>
-          <w:lang w:val="es-VE"/>
-        </w:rPr>
-      </w:pPr>
-    </w:p>
-    <w:p>
-      <w:pPr>
-        <w:rPr>
-          <w:lang w:val="es-VE"/>
-        </w:rPr>
-      </w:pPr>
-    </w:p>
-    <w:p>
-      <w:pPr>
+          <w:b/>
+          <w:bCs/>
+          <w:lang w:val="es-VE"/>
+        </w:rPr>
+        <w:t>:</w:t>
+      </w:r>
+      <w:r>
+        <w:rPr>
+          <w:lang w:val="es-VE"/>
+        </w:rPr>
+        <w:t xml:space="preserve"> Se recomienda que el equipo acuerde bloques de tiempo específicos a la semana donde todos estén conectados simultáneamente (aunque sea en silencio) para resolver dudas inmediatas.</w:t>
+      </w:r>
+    </w:p>
+    <w:p>
+      <w:pPr>
+        <w:ind w:firstLine="0"/>
         <w:rPr>
           <w:lang w:val="es-VE"/>
         </w:rPr>

</xml_diff>

<commit_message>
Citación y Referencias Bibliográficas primera parte ajustes #8
</commit_message>
<xml_diff>
--- a/Documentos/Practicas.docx
+++ b/Documentos/Practicas.docx
@@ -2450,9 +2450,17 @@
       </w:pPr>
       <w:r>
         <w:rPr>
-          <w:lang w:val="es-VE"/>
-        </w:rPr>
-        <w:t xml:space="preserve">Uso de Gestores Bibliográficos: Para proyectos de ingeniería y sistemas, es altamente recomendable usar herramientas como Zotero o Mendeley. Estas permiten compartir una librería común donde todos los integrantes depositan los </w:t>
+          <w:b/>
+          <w:bCs/>
+          <w:lang w:val="es-VE"/>
+        </w:rPr>
+        <w:t>Uso de Gestores Bibliográficos:</w:t>
+      </w:r>
+      <w:r>
+        <w:rPr>
+          <w:lang w:val="es-VE"/>
+        </w:rPr>
+        <w:t xml:space="preserve"> Para proyectos de ingeniería y sistemas, es altamente recomendable usar herramientas como Zotero o Mendeley. Estas permiten compartir una librería común donde todos los integrantes depositan los </w:t>
       </w:r>
       <w:proofErr w:type="spellStart"/>
       <w:r>

</xml_diff>

<commit_message>
Citación y Referencias Bibliográficas segunda parte ajustes #8
</commit_message>
<xml_diff>
--- a/Documentos/Practicas.docx
+++ b/Documentos/Practicas.docx
@@ -2494,11 +2494,15 @@
           <w:numId w:val="18"/>
         </w:numPr>
         <w:rPr>
-          <w:lang w:val="es-VE"/>
-        </w:rPr>
-      </w:pPr>
-      <w:r>
-        <w:rPr>
+          <w:b/>
+          <w:bCs/>
+          <w:lang w:val="es-VE"/>
+        </w:rPr>
+      </w:pPr>
+      <w:r>
+        <w:rPr>
+          <w:b/>
+          <w:bCs/>
           <w:lang w:val="es-VE"/>
         </w:rPr>
         <w:t>Citas Textuales vs. Paráfrasis:</w:t>
@@ -2517,6 +2521,8 @@
       </w:pPr>
       <w:r>
         <w:rPr>
+          <w:b/>
+          <w:bCs/>
           <w:lang w:val="es-VE"/>
         </w:rPr>
         <w:t>Citas Textuales:</w:t>
@@ -2580,6 +2586,8 @@
       </w:pPr>
       <w:r>
         <w:rPr>
+          <w:b/>
+          <w:bCs/>
           <w:lang w:val="es-VE"/>
         </w:rPr>
         <w:t>Paráfrasis:</w:t>
@@ -2633,10 +2641,18 @@
       </w:pPr>
       <w:r>
         <w:rPr>
+          <w:b/>
+          <w:bCs/>
           <w:lang w:val="es-VE"/>
         </w:rPr>
         <w:lastRenderedPageBreak/>
-        <w:t>Normas APA 7ma Edición: * Lista de Referencias</w:t>
+        <w:t>Normas APA 7ma Edición:</w:t>
+      </w:r>
+      <w:r>
+        <w:rPr>
+          <w:lang w:val="es-VE"/>
+        </w:rPr>
+        <w:t xml:space="preserve"> * Lista de Referencias</w:t>
       </w:r>
       <w:r>
         <w:rPr>
@@ -2656,6 +2672,15 @@
         </w:rPr>
         <w:t>.</w:t>
       </w:r>
+    </w:p>
+    <w:p>
+      <w:pPr>
+        <w:pStyle w:val="Prrafodelista"/>
+        <w:ind w:left="1080" w:firstLine="0"/>
+        <w:rPr>
+          <w:lang w:val="es-VE"/>
+        </w:rPr>
+      </w:pPr>
     </w:p>
     <w:p>
       <w:pPr>
@@ -2670,6 +2695,8 @@
       </w:pPr>
       <w:r>
         <w:rPr>
+          <w:b/>
+          <w:bCs/>
           <w:lang w:val="es-VE"/>
         </w:rPr>
         <w:t xml:space="preserve">DOI y </w:t>
@@ -2677,6 +2704,8 @@
       <w:proofErr w:type="spellStart"/>
       <w:r>
         <w:rPr>
+          <w:b/>
+          <w:bCs/>
           <w:lang w:val="es-VE"/>
         </w:rPr>
         <w:t>URLs</w:t>
@@ -2684,9 +2713,17 @@
       <w:proofErr w:type="spellEnd"/>
       <w:r>
         <w:rPr>
-          <w:lang w:val="es-VE"/>
-        </w:rPr>
-        <w:t xml:space="preserve">: En el momento cuando </w:t>
+          <w:b/>
+          <w:bCs/>
+          <w:lang w:val="es-VE"/>
+        </w:rPr>
+        <w:t>:</w:t>
+      </w:r>
+      <w:r>
+        <w:rPr>
+          <w:lang w:val="es-VE"/>
+        </w:rPr>
+        <w:t xml:space="preserve"> En el momento cuando </w:t>
       </w:r>
       <w:r>
         <w:rPr>
@@ -2757,15 +2794,17 @@
       </w:pPr>
       <w:r>
         <w:rPr>
-          <w:lang w:val="es-VE"/>
-        </w:rPr>
-        <w:t>Verificación de Fuentes:</w:t>
-      </w:r>
-      <w:r>
-        <w:rPr>
-          <w:lang w:val="es-VE"/>
-        </w:rPr>
-        <w:t xml:space="preserve"> E</w:t>
+          <w:b/>
+          <w:bCs/>
+          <w:lang w:val="es-VE"/>
+        </w:rPr>
+        <w:t xml:space="preserve">Verificación de Fuentes: </w:t>
+      </w:r>
+      <w:r>
+        <w:rPr>
+          <w:lang w:val="es-VE"/>
+        </w:rPr>
+        <w:t>E</w:t>
       </w:r>
       <w:r>
         <w:rPr>
@@ -2896,17 +2935,7 @@
     </w:p>
     <w:p>
       <w:pPr>
-        <w:pStyle w:val="Prrafodelista"/>
-        <w:ind w:left="1440" w:firstLine="0"/>
-        <w:rPr>
-          <w:lang w:val="es-VE"/>
-        </w:rPr>
-      </w:pPr>
-    </w:p>
-    <w:p>
-      <w:pPr>
-        <w:pStyle w:val="Prrafodelista"/>
-        <w:ind w:left="1440" w:firstLine="0"/>
+        <w:ind w:firstLine="0"/>
         <w:rPr>
           <w:lang w:val="es-VE"/>
         </w:rPr>

</xml_diff>

<commit_message>
Manejo de coflictos final  #10
</commit_message>
<xml_diff>
--- a/Documentos/Practicas.docx
+++ b/Documentos/Practicas.docx
@@ -255,21 +255,7 @@
         <w:rPr>
           <w:lang w:val="es-VE"/>
         </w:rPr>
-        <w:t xml:space="preserve"> para </w:t>
-      </w:r>
-      <w:proofErr w:type="spellStart"/>
-      <w:r>
-        <w:rPr>
-          <w:lang w:val="es-VE"/>
-        </w:rPr>
-        <w:t>desarrolloa</w:t>
-      </w:r>
-      <w:proofErr w:type="spellEnd"/>
-      <w:r>
-        <w:rPr>
-          <w:lang w:val="es-VE"/>
-        </w:rPr>
-        <w:t xml:space="preserve"> el proyecto</w:t>
+        <w:t xml:space="preserve"> para desarrolloa el proyecto</w:t>
       </w:r>
       <w:r>
         <w:rPr>
@@ -463,21 +449,7 @@
         <w:rPr>
           <w:lang w:val="es-VE"/>
         </w:rPr>
-        <w:t xml:space="preserve"> </w:t>
-      </w:r>
-      <w:proofErr w:type="spellStart"/>
-      <w:r>
-        <w:rPr>
-          <w:lang w:val="es-VE"/>
-        </w:rPr>
-        <w:t>reslata</w:t>
-      </w:r>
-      <w:proofErr w:type="spellEnd"/>
-      <w:r>
-        <w:rPr>
-          <w:lang w:val="es-VE"/>
-        </w:rPr>
-        <w:t xml:space="preserve"> que el trabajar en equipo mejora;</w:t>
+        <w:t xml:space="preserve"> reslata que el trabajar en equipo mejora;</w:t>
       </w:r>
     </w:p>
     <w:p>
@@ -819,33 +791,17 @@
         </w:rPr>
         <w:t xml:space="preserve"> </w:t>
       </w:r>
-      <w:proofErr w:type="spellStart"/>
       <w:r>
         <w:rPr>
           <w:lang w:val="es-VE"/>
         </w:rPr>
         <w:t>telegram</w:t>
       </w:r>
-      <w:proofErr w:type="spellEnd"/>
-      <w:r>
-        <w:rPr>
-          <w:lang w:val="es-VE"/>
-        </w:rPr>
-        <w:t xml:space="preserve"> o </w:t>
-      </w:r>
-      <w:proofErr w:type="spellStart"/>
-      <w:r>
-        <w:rPr>
-          <w:lang w:val="es-VE"/>
-        </w:rPr>
-        <w:t>Discord</w:t>
-      </w:r>
-      <w:proofErr w:type="spellEnd"/>
-      <w:r>
-        <w:rPr>
-          <w:lang w:val="es-VE"/>
-        </w:rPr>
-        <w:t xml:space="preserve"> para enviar archivos y discutir temas del proyecto.</w:t>
+      <w:r>
+        <w:rPr>
+          <w:lang w:val="es-VE"/>
+        </w:rPr>
+        <w:t xml:space="preserve"> o Discord para enviar archivos y discutir temas del proyecto.</w:t>
       </w:r>
     </w:p>
     <w:p>
@@ -1032,21 +988,7 @@
         <w:rPr>
           <w:lang w:val="es-VE"/>
         </w:rPr>
-        <w:t xml:space="preserve"> GitHub (utilizando su sistema de Issues y Project </w:t>
-      </w:r>
-      <w:proofErr w:type="spellStart"/>
-      <w:r>
-        <w:rPr>
-          <w:lang w:val="es-VE"/>
-        </w:rPr>
-        <w:t>Boards</w:t>
-      </w:r>
-      <w:proofErr w:type="spellEnd"/>
-      <w:r>
-        <w:rPr>
-          <w:lang w:val="es-VE"/>
-        </w:rPr>
-        <w:t xml:space="preserve"> tipo Kanban) </w:t>
+        <w:t xml:space="preserve"> GitHub (utilizando su sistema de Issues y Project Boards tipo Kanban) </w:t>
       </w:r>
       <w:r>
         <w:rPr>
@@ -1064,21 +1006,7 @@
         <w:rPr>
           <w:lang w:val="es-VE"/>
         </w:rPr>
-        <w:t xml:space="preserve">, mas si es una carrera como Ingeniería en Computación, donde el uso de </w:t>
-      </w:r>
-      <w:proofErr w:type="spellStart"/>
-      <w:r>
-        <w:rPr>
-          <w:lang w:val="es-VE"/>
-        </w:rPr>
-        <w:t>github</w:t>
-      </w:r>
-      <w:proofErr w:type="spellEnd"/>
-      <w:r>
-        <w:rPr>
-          <w:lang w:val="es-VE"/>
-        </w:rPr>
-        <w:t xml:space="preserve"> es de mucho uso </w:t>
+        <w:t xml:space="preserve">, mas si es una carrera como Ingeniería en Computación, donde el uso de github es de mucho uso </w:t>
       </w:r>
     </w:p>
     <w:p>
@@ -1190,21 +1118,7 @@
         <w:rPr>
           <w:lang w:val="es-VE"/>
         </w:rPr>
-        <w:t xml:space="preserve">Título del proyecto, nombre de la institución, </w:t>
-      </w:r>
-      <w:proofErr w:type="spellStart"/>
-      <w:r>
-        <w:rPr>
-          <w:lang w:val="es-VE"/>
-        </w:rPr>
-        <w:t>integrantescon</w:t>
-      </w:r>
-      <w:proofErr w:type="spellEnd"/>
-      <w:r>
-        <w:rPr>
-          <w:lang w:val="es-VE"/>
-        </w:rPr>
-        <w:t xml:space="preserve"> sus respectivos roles o números de identidad, fecha de entrega.</w:t>
+        <w:t>Título del proyecto, nombre de la institución, integrantescon sus respectivos roles o números de identidad, fecha de entrega.</w:t>
       </w:r>
     </w:p>
     <w:p>
@@ -1383,49 +1297,7 @@
         <w:rPr>
           <w:lang w:val="es-VE"/>
         </w:rPr>
-        <w:t xml:space="preserve"> Times New </w:t>
-      </w:r>
-      <w:proofErr w:type="spellStart"/>
-      <w:r>
-        <w:rPr>
-          <w:lang w:val="es-VE"/>
-        </w:rPr>
-        <w:t>Roman</w:t>
-      </w:r>
-      <w:proofErr w:type="spellEnd"/>
-      <w:r>
-        <w:rPr>
-          <w:lang w:val="es-VE"/>
-        </w:rPr>
-        <w:t xml:space="preserve"> (12 </w:t>
-      </w:r>
-      <w:proofErr w:type="spellStart"/>
-      <w:r>
-        <w:rPr>
-          <w:lang w:val="es-VE"/>
-        </w:rPr>
-        <w:t>pts</w:t>
-      </w:r>
-      <w:proofErr w:type="spellEnd"/>
-      <w:r>
-        <w:rPr>
-          <w:lang w:val="es-VE"/>
-        </w:rPr>
-        <w:t xml:space="preserve">) o Arial (11 </w:t>
-      </w:r>
-      <w:proofErr w:type="spellStart"/>
-      <w:r>
-        <w:rPr>
-          <w:lang w:val="es-VE"/>
-        </w:rPr>
-        <w:t>pts</w:t>
-      </w:r>
-      <w:proofErr w:type="spellEnd"/>
-      <w:r>
-        <w:rPr>
-          <w:lang w:val="es-VE"/>
-        </w:rPr>
-        <w:t>).</w:t>
+        <w:t xml:space="preserve"> Times New Roman (12 pts) o Arial (11 pts).</w:t>
       </w:r>
     </w:p>
     <w:p>
@@ -1530,21 +1402,7 @@
         <w:rPr>
           <w:lang w:val="es-VE"/>
         </w:rPr>
-        <w:t xml:space="preserve"> 3ra opción en la parte </w:t>
-      </w:r>
-      <w:proofErr w:type="spellStart"/>
-      <w:r>
-        <w:rPr>
-          <w:lang w:val="es-VE"/>
-        </w:rPr>
-        <w:t>superiror</w:t>
-      </w:r>
-      <w:proofErr w:type="spellEnd"/>
-      <w:r>
-        <w:rPr>
-          <w:lang w:val="es-VE"/>
-        </w:rPr>
-        <w:t xml:space="preserve"> derecha.</w:t>
+        <w:t xml:space="preserve"> 3ra opción en la parte superiror derecha.</w:t>
       </w:r>
     </w:p>
     <w:p>
@@ -1603,63 +1461,7 @@
         <w:rPr>
           <w:lang w:val="es-VE"/>
         </w:rPr>
-        <w:t xml:space="preserve">y </w:t>
-      </w:r>
-      <w:proofErr w:type="spellStart"/>
-      <w:r>
-        <w:rPr>
-          <w:lang w:val="es-VE"/>
-        </w:rPr>
-        <w:t>subtitulos</w:t>
-      </w:r>
-      <w:proofErr w:type="spellEnd"/>
-      <w:r>
-        <w:rPr>
-          <w:lang w:val="es-VE"/>
-        </w:rPr>
-        <w:t xml:space="preserve">, para eso se configura el Word de manera </w:t>
-      </w:r>
-      <w:proofErr w:type="spellStart"/>
-      <w:r>
-        <w:rPr>
-          <w:lang w:val="es-VE"/>
-        </w:rPr>
-        <w:t>mas</w:t>
-      </w:r>
-      <w:proofErr w:type="spellEnd"/>
-      <w:r>
-        <w:rPr>
-          <w:lang w:val="es-VE"/>
-        </w:rPr>
-        <w:t xml:space="preserve"> automatizada y </w:t>
-      </w:r>
-      <w:proofErr w:type="spellStart"/>
-      <w:r>
-        <w:rPr>
-          <w:lang w:val="es-VE"/>
-        </w:rPr>
-        <w:t>asi</w:t>
-      </w:r>
-      <w:proofErr w:type="spellEnd"/>
-      <w:r>
-        <w:rPr>
-          <w:lang w:val="es-VE"/>
-        </w:rPr>
-        <w:t xml:space="preserve"> se ahorran la </w:t>
-      </w:r>
-      <w:proofErr w:type="spellStart"/>
-      <w:r>
-        <w:rPr>
-          <w:lang w:val="es-VE"/>
-        </w:rPr>
-        <w:t>tiedosidad</w:t>
-      </w:r>
-      <w:proofErr w:type="spellEnd"/>
-      <w:r>
-        <w:rPr>
-          <w:lang w:val="es-VE"/>
-        </w:rPr>
-        <w:t xml:space="preserve"> y logran que s</w:t>
+        <w:t>y subtitulos, para eso se configura el Word de manera mas automatizada y asi se ahorran la tiedosidad y logran que s</w:t>
       </w:r>
       <w:r>
         <w:rPr>
@@ -1745,21 +1547,7 @@
         <w:rPr>
           <w:lang w:val="es-VE"/>
         </w:rPr>
-        <w:t xml:space="preserve"> Todos en conjunto deben revisarlo de pies a cabeza para asegurarse que todo </w:t>
-      </w:r>
-      <w:proofErr w:type="spellStart"/>
-      <w:r>
-        <w:rPr>
-          <w:lang w:val="es-VE"/>
-        </w:rPr>
-        <w:t>este</w:t>
-      </w:r>
-      <w:proofErr w:type="spellEnd"/>
-      <w:r>
-        <w:rPr>
-          <w:lang w:val="es-VE"/>
-        </w:rPr>
-        <w:t xml:space="preserve"> bien.</w:t>
+        <w:t xml:space="preserve"> Todos en conjunto deben revisarlo de pies a cabeza para asegurarse que todo este bien.</w:t>
       </w:r>
     </w:p>
     <w:p>
@@ -1834,21 +1622,7 @@
         <w:rPr>
           <w:lang w:val="es-VE"/>
         </w:rPr>
-        <w:t xml:space="preserve"> Es incluso mejor si hacen un meeting para revisar que todo </w:t>
-      </w:r>
-      <w:proofErr w:type="spellStart"/>
-      <w:r>
-        <w:rPr>
-          <w:lang w:val="es-VE"/>
-        </w:rPr>
-        <w:t>este</w:t>
-      </w:r>
-      <w:proofErr w:type="spellEnd"/>
-      <w:r>
-        <w:rPr>
-          <w:lang w:val="es-VE"/>
-        </w:rPr>
-        <w:t xml:space="preserve"> en orden.</w:t>
+        <w:t xml:space="preserve"> Es incluso mejor si hacen un meeting para revisar que todo este en orden.</w:t>
       </w:r>
     </w:p>
     <w:p>
@@ -2080,21 +1854,7 @@
         <w:rPr>
           <w:lang w:val="es-VE"/>
         </w:rPr>
-        <w:t xml:space="preserve">que ya no se hagan modificaciones y </w:t>
-      </w:r>
-      <w:proofErr w:type="spellStart"/>
-      <w:r>
-        <w:rPr>
-          <w:lang w:val="es-VE"/>
-        </w:rPr>
-        <w:t>este</w:t>
-      </w:r>
-      <w:proofErr w:type="spellEnd"/>
-      <w:r>
-        <w:rPr>
-          <w:lang w:val="es-VE"/>
-        </w:rPr>
-        <w:t xml:space="preserve"> listo para enviar al profesor</w:t>
+        <w:t>que ya no se hagan modificaciones y este listo para enviar al profesor</w:t>
       </w:r>
     </w:p>
     <w:p>
@@ -2325,21 +2085,7 @@
         <w:rPr>
           <w:lang w:val="es-VE"/>
         </w:rPr>
-        <w:t xml:space="preserve"> Implementar herramientas como los Project </w:t>
-      </w:r>
-      <w:proofErr w:type="spellStart"/>
-      <w:r>
-        <w:rPr>
-          <w:lang w:val="es-VE"/>
-        </w:rPr>
-        <w:t>Boards</w:t>
-      </w:r>
-      <w:proofErr w:type="spellEnd"/>
-      <w:r>
-        <w:rPr>
-          <w:lang w:val="es-VE"/>
-        </w:rPr>
-        <w:t xml:space="preserve"> de GitHub o Trello. Visualizar las tareas en columnas de "Por hacer", "En proceso" y "Finalizado" permite que el coordinador detecte cuellos de botella sin tener que preguntar constantemente a cada integrante.</w:t>
+        <w:t xml:space="preserve"> Implementar herramientas como los Project Boards de GitHub o Trello. Visualizar las tareas en columnas de "Por hacer", "En proceso" y "Finalizado" permite que el coordinador detecte cuellos de botella sin tener que preguntar constantemente a cada integrante.</w:t>
       </w:r>
     </w:p>
     <w:p>
@@ -2368,25 +2114,7 @@
           <w:bCs/>
           <w:lang w:val="es-VE"/>
         </w:rPr>
-        <w:t>Técnica de Time-</w:t>
-      </w:r>
-      <w:proofErr w:type="spellStart"/>
-      <w:r>
-        <w:rPr>
-          <w:b/>
-          <w:bCs/>
-          <w:lang w:val="es-VE"/>
-        </w:rPr>
-        <w:t>Blocking</w:t>
-      </w:r>
-      <w:proofErr w:type="spellEnd"/>
-      <w:r>
-        <w:rPr>
-          <w:b/>
-          <w:bCs/>
-          <w:lang w:val="es-VE"/>
-        </w:rPr>
-        <w:t>:</w:t>
+        <w:t>Técnica de Time-Blocking:</w:t>
       </w:r>
       <w:r>
         <w:rPr>
@@ -2460,21 +2188,7 @@
         <w:rPr>
           <w:lang w:val="es-VE"/>
         </w:rPr>
-        <w:t xml:space="preserve"> Para proyectos de ingeniería y sistemas, es altamente recomendable usar herramientas como Zotero o Mendeley. Estas permiten compartir una librería común donde todos los integrantes depositan los </w:t>
-      </w:r>
-      <w:proofErr w:type="spellStart"/>
-      <w:r>
-        <w:rPr>
-          <w:lang w:val="es-VE"/>
-        </w:rPr>
-        <w:t>PDFs</w:t>
-      </w:r>
-      <w:proofErr w:type="spellEnd"/>
-      <w:r>
-        <w:rPr>
-          <w:lang w:val="es-VE"/>
-        </w:rPr>
-        <w:t xml:space="preserve"> y artículos encontrados.</w:t>
+        <w:t xml:space="preserve"> Para proyectos de ingeniería y sistemas, es altamente recomendable usar herramientas como Zotero o Mendeley. Estas permiten compartir una librería común donde todos los integrantes depositan los PDFs y artículos encontrados.</w:t>
       </w:r>
     </w:p>
     <w:p>
@@ -2699,25 +2413,7 @@
           <w:bCs/>
           <w:lang w:val="es-VE"/>
         </w:rPr>
-        <w:t xml:space="preserve">DOI y </w:t>
-      </w:r>
-      <w:proofErr w:type="spellStart"/>
-      <w:r>
-        <w:rPr>
-          <w:b/>
-          <w:bCs/>
-          <w:lang w:val="es-VE"/>
-        </w:rPr>
-        <w:t>URLs</w:t>
-      </w:r>
-      <w:proofErr w:type="spellEnd"/>
-      <w:r>
-        <w:rPr>
-          <w:b/>
-          <w:bCs/>
-          <w:lang w:val="es-VE"/>
-        </w:rPr>
-        <w:t>:</w:t>
+        <w:t>DOI y URLs:</w:t>
       </w:r>
       <w:r>
         <w:rPr>
@@ -2741,35 +2437,7 @@
         <w:rPr>
           <w:lang w:val="es-VE"/>
         </w:rPr>
-        <w:t xml:space="preserve">es obligatorio incluir el DOI (Digital </w:t>
-      </w:r>
-      <w:proofErr w:type="spellStart"/>
-      <w:r>
-        <w:rPr>
-          <w:lang w:val="es-VE"/>
-        </w:rPr>
-        <w:t>Object</w:t>
-      </w:r>
-      <w:proofErr w:type="spellEnd"/>
-      <w:r>
-        <w:rPr>
-          <w:lang w:val="es-VE"/>
-        </w:rPr>
-        <w:t xml:space="preserve"> </w:t>
-      </w:r>
-      <w:proofErr w:type="spellStart"/>
-      <w:r>
-        <w:rPr>
-          <w:lang w:val="es-VE"/>
-        </w:rPr>
-        <w:t>Identifier</w:t>
-      </w:r>
-      <w:proofErr w:type="spellEnd"/>
-      <w:r>
-        <w:rPr>
-          <w:lang w:val="es-VE"/>
-        </w:rPr>
-        <w:t>) o, en su defecto, el enlace directo a la fuente confiable.</w:t>
+        <w:t>es obligatorio incluir el DOI (Digital Object Identifier) o, en su defecto, el enlace directo a la fuente confiable.</w:t>
       </w:r>
     </w:p>
     <w:p>
@@ -2834,35 +2502,7 @@
         <w:rPr>
           <w:lang w:val="es-VE"/>
         </w:rPr>
-        <w:t xml:space="preserve">riorizar repositorios académicos (Google </w:t>
-      </w:r>
-      <w:proofErr w:type="spellStart"/>
-      <w:r>
-        <w:rPr>
-          <w:lang w:val="es-VE"/>
-        </w:rPr>
-        <w:t>Scholar</w:t>
-      </w:r>
-      <w:proofErr w:type="spellEnd"/>
-      <w:r>
-        <w:rPr>
-          <w:lang w:val="es-VE"/>
-        </w:rPr>
-        <w:t xml:space="preserve">, IEEE </w:t>
-      </w:r>
-      <w:proofErr w:type="spellStart"/>
-      <w:r>
-        <w:rPr>
-          <w:lang w:val="es-VE"/>
-        </w:rPr>
-        <w:t>Xplore</w:t>
-      </w:r>
-      <w:proofErr w:type="spellEnd"/>
-      <w:r>
-        <w:rPr>
-          <w:lang w:val="es-VE"/>
-        </w:rPr>
-        <w:t>, SciELO) sobre blogs genéricos o wikis de edición libre</w:t>
+        <w:t>riorizar repositorios académicos (Google Scholar, IEEE Xplore, SciELO) sobre blogs genéricos o wikis de edición libre</w:t>
       </w:r>
       <w:r>
         <w:rPr>
@@ -3022,30 +2662,8 @@
         <w:rPr>
           <w:lang w:val="es-VE"/>
         </w:rPr>
-        <w:t>Si el proyecto incluye software o procesos industriales, integrar videos cortos o animaciones de diagramas (</w:t>
-      </w:r>
-      <w:proofErr w:type="spellStart"/>
-      <w:r>
-        <w:rPr>
-          <w:lang w:val="es-VE"/>
-        </w:rPr>
-        <w:t>GIFs</w:t>
-      </w:r>
-      <w:proofErr w:type="spellEnd"/>
-      <w:r>
-        <w:rPr>
-          <w:lang w:val="es-VE"/>
-        </w:rPr>
-        <w:t xml:space="preserve"> de procesos) para mostrar el dinamismo que un </w:t>
-      </w:r>
-      <w:proofErr w:type="spellStart"/>
-      <w:r>
-        <w:rPr>
-          <w:lang w:val="es-VE"/>
-        </w:rPr>
-        <w:t>screenshot</w:t>
-      </w:r>
-      <w:proofErr w:type="spellEnd"/>
+        <w:t>Si el proyecto incluye software o procesos industriales, integrar videos cortos o animaciones de diagramas (GIFs de procesos) para mostrar el dinamismo que un screenshot</w:t>
+      </w:r>
     </w:p>
     <w:p>
       <w:pPr>
@@ -3196,19 +2814,545 @@
     </w:p>
     <w:p>
       <w:pPr>
-        <w:rPr>
+        <w:pStyle w:val="Ttulo1"/>
+        <w:rPr>
+          <w:lang w:val="es-VE"/>
+        </w:rPr>
+      </w:pPr>
+      <w:r>
+        <w:rPr>
+          <w:lang w:val="es-VE"/>
+        </w:rPr>
+        <w:lastRenderedPageBreak/>
+        <w:t>VIII. Manejo de Conflictos y Dinámica Grupal</w:t>
+      </w:r>
+    </w:p>
+    <w:p>
+      <w:pPr>
+        <w:rPr>
+          <w:lang w:val="es-VE"/>
+        </w:rPr>
+      </w:pPr>
+      <w:r>
+        <w:rPr>
+          <w:lang w:val="es-VE"/>
+        </w:rPr>
+        <w:t>Los desacuerdos son naturales y, si se manejan bien, enriquecen el proyecto. El problema surge cuando el conflicto se vuelve personal o afecta la productividad</w:t>
+      </w:r>
+      <w:r>
+        <w:rPr>
+          <w:lang w:val="es-VE"/>
+        </w:rPr>
+        <w:t xml:space="preserve">: </w:t>
+      </w:r>
+    </w:p>
+    <w:p>
+      <w:pPr>
+        <w:pStyle w:val="Prrafodelista"/>
+        <w:numPr>
+          <w:ilvl w:val="0"/>
+          <w:numId w:val="24"/>
+        </w:numPr>
+        <w:rPr>
+          <w:b/>
+          <w:bCs/>
           <w:u w:val="single"/>
           <w:lang w:val="es-VE"/>
         </w:rPr>
       </w:pPr>
-    </w:p>
-    <w:p>
-      <w:pPr>
-        <w:rPr>
+      <w:r>
+        <w:rPr>
+          <w:b/>
+          <w:bCs/>
+          <w:lang w:val="es-VE"/>
+        </w:rPr>
+        <w:t>Comunicación Asertiva</w:t>
+      </w:r>
+      <w:r>
+        <w:rPr>
+          <w:b/>
+          <w:bCs/>
+          <w:lang w:val="es-VE"/>
+        </w:rPr>
+        <w:t xml:space="preserve">: </w:t>
+      </w:r>
+      <w:r>
+        <w:rPr>
+          <w:lang w:val="es-VE"/>
+        </w:rPr>
+        <w:t>Se deben criticar las ideas o el trabajo, nunca a la persona</w:t>
+      </w:r>
+      <w:r>
+        <w:rPr>
+          <w:lang w:val="es-VE"/>
+        </w:rPr>
+        <w:t>, e</w:t>
+      </w:r>
+      <w:r>
+        <w:rPr>
+          <w:lang w:val="es-VE"/>
+        </w:rPr>
+        <w:t>n lugar de acusar</w:t>
+      </w:r>
+      <w:r>
+        <w:rPr>
+          <w:lang w:val="es-VE"/>
+        </w:rPr>
+        <w:t xml:space="preserve">la </w:t>
+      </w:r>
+      <w:r>
+        <w:rPr>
+          <w:lang w:val="es-VE"/>
+        </w:rPr>
+        <w:t>se debe expresar el impacto en el proyecto</w:t>
+      </w:r>
+      <w:r>
+        <w:rPr>
+          <w:lang w:val="es-VE"/>
+        </w:rPr>
+        <w:t xml:space="preserve"> lo que </w:t>
+      </w:r>
+      <w:r>
+        <w:rPr>
+          <w:lang w:val="es-VE"/>
+        </w:rPr>
+        <w:t>reduce la actitud defensiva del compañero</w:t>
+      </w:r>
+      <w:r>
+        <w:rPr>
+          <w:lang w:val="es-VE"/>
+        </w:rPr>
+        <w:t xml:space="preserve">. </w:t>
+      </w:r>
+      <w:r>
+        <w:rPr>
+          <w:lang w:val="es-VE"/>
+        </w:rPr>
+        <w:t>Se debe internalizar que una corrección a un diagrama o a un código no es un ataque al intelecto del autor, sino un filtro de calidad necesario para la excelencia del grupo</w:t>
+      </w:r>
+      <w:r>
+        <w:rPr>
+          <w:lang w:val="es-VE"/>
+        </w:rPr>
+        <w:t xml:space="preserve">, y como también </w:t>
+      </w:r>
+      <w:r>
+        <w:rPr>
+          <w:lang w:val="es-VE"/>
+        </w:rPr>
+        <w:t>a</w:t>
+      </w:r>
+      <w:r>
+        <w:rPr>
+          <w:lang w:val="es-VE"/>
+        </w:rPr>
+        <w:t>ntes de refutar una idea, el integrante debe repetir lo que entendió</w:t>
+      </w:r>
+      <w:r>
+        <w:rPr>
+          <w:lang w:val="es-VE"/>
+        </w:rPr>
+        <w:t xml:space="preserve"> ya que esto </w:t>
+      </w:r>
+      <w:r>
+        <w:rPr>
+          <w:lang w:val="es-VE"/>
+        </w:rPr>
+        <w:t>asegura que el conflicto no sea un simple problema de semántica</w:t>
+      </w:r>
+    </w:p>
+    <w:p>
+      <w:pPr>
+        <w:pStyle w:val="Prrafodelista"/>
+        <w:ind w:left="1080" w:firstLine="0"/>
+        <w:rPr>
+          <w:b/>
+          <w:bCs/>
           <w:u w:val="single"/>
           <w:lang w:val="es-VE"/>
         </w:rPr>
       </w:pPr>
+    </w:p>
+    <w:p>
+      <w:pPr>
+        <w:pStyle w:val="Prrafodelista"/>
+        <w:numPr>
+          <w:ilvl w:val="0"/>
+          <w:numId w:val="24"/>
+        </w:numPr>
+        <w:rPr>
+          <w:b/>
+          <w:bCs/>
+          <w:u w:val="single"/>
+          <w:lang w:val="es-VE"/>
+        </w:rPr>
+      </w:pPr>
+      <w:r>
+        <w:rPr>
+          <w:b/>
+          <w:bCs/>
+          <w:lang w:val="es-VE"/>
+        </w:rPr>
+        <w:t xml:space="preserve">Gestión de responsabilidad: </w:t>
+      </w:r>
+      <w:r>
+        <w:rPr>
+          <w:lang w:val="es-VE"/>
+        </w:rPr>
+        <w:t>Establecer desde el inicio qué sucede si alguien no cumple. Si un integrante desaparece o no entrega su parte a tiempo, el coordinador debe contactarlo formalmente. Si la conducta persiste, el equipo debe tener la madurez de informar al docente con evidencias del intento de coordinación (capturas de mensajes, historial de commits en GitHub).</w:t>
+      </w:r>
+      <w:r>
+        <w:rPr>
+          <w:lang w:val="es-VE"/>
+        </w:rPr>
+        <w:t xml:space="preserve"> </w:t>
+      </w:r>
+      <w:r>
+        <w:rPr>
+          <w:lang w:val="es-VE"/>
+        </w:rPr>
+        <w:t>El coordinador convoca a una breve reunión para entender si hay un bloqueo técnico o personal</w:t>
+      </w:r>
+      <w:r>
+        <w:rPr>
+          <w:lang w:val="es-VE"/>
+        </w:rPr>
+        <w:t xml:space="preserve"> y si aun persiste el problema el equipo pueden tomar la decisión de sacar esa persona, l</w:t>
+      </w:r>
+      <w:r>
+        <w:rPr>
+          <w:lang w:val="es-VE"/>
+        </w:rPr>
+        <w:t>a decisión de excluir a alguien o informar al profesor no debe ser un acto de "traición", sino de justicia con quienes sí trabajaron</w:t>
+      </w:r>
+    </w:p>
+    <w:p>
+      <w:pPr>
+        <w:pStyle w:val="Prrafodelista"/>
+        <w:rPr>
+          <w:b/>
+          <w:bCs/>
+          <w:u w:val="single"/>
+          <w:lang w:val="es-VE"/>
+        </w:rPr>
+      </w:pPr>
+    </w:p>
+    <w:p>
+      <w:pPr>
+        <w:pStyle w:val="Prrafodelista"/>
+        <w:numPr>
+          <w:ilvl w:val="0"/>
+          <w:numId w:val="24"/>
+        </w:numPr>
+        <w:rPr>
+          <w:b/>
+          <w:bCs/>
+          <w:u w:val="single"/>
+          <w:lang w:val="es-VE"/>
+        </w:rPr>
+      </w:pPr>
+      <w:r>
+        <w:rPr>
+          <w:b/>
+          <w:bCs/>
+          <w:lang w:val="es-VE"/>
+        </w:rPr>
+        <w:t>Negociación y Consenso</w:t>
+      </w:r>
+      <w:r>
+        <w:rPr>
+          <w:lang w:val="es-MX"/>
+        </w:rPr>
+        <w:t xml:space="preserve">: </w:t>
+      </w:r>
+      <w:r>
+        <w:rPr>
+          <w:lang w:val="es-MX"/>
+        </w:rPr>
+        <w:t>Cuando hay dos formas de resolver un problema técnico, se deben exponer los pros y contras de cada una</w:t>
+      </w:r>
+      <w:r>
+        <w:rPr>
+          <w:lang w:val="es-MX"/>
+        </w:rPr>
+        <w:t xml:space="preserve"> por medio de tres </w:t>
+      </w:r>
+      <w:r>
+        <w:rPr>
+          <w:lang w:val="es-MX"/>
+        </w:rPr>
+        <w:t>criterios</w:t>
+      </w:r>
+      <w:r>
+        <w:rPr>
+          <w:lang w:val="es-MX"/>
+        </w:rPr>
+        <w:t xml:space="preserve"> que son el</w:t>
+      </w:r>
+      <w:r>
+        <w:rPr>
+          <w:lang w:val="es-MX"/>
+        </w:rPr>
+        <w:t xml:space="preserve"> </w:t>
+      </w:r>
+      <w:r>
+        <w:rPr>
+          <w:lang w:val="es-MX"/>
+        </w:rPr>
+        <w:lastRenderedPageBreak/>
+        <w:t>t</w:t>
+      </w:r>
+      <w:r>
+        <w:rPr>
+          <w:lang w:val="es-MX"/>
+        </w:rPr>
+        <w:t>iempo de ejecución,</w:t>
+      </w:r>
+      <w:r>
+        <w:rPr>
+          <w:lang w:val="es-MX"/>
+        </w:rPr>
+        <w:t xml:space="preserve"> la</w:t>
+      </w:r>
+      <w:r>
+        <w:rPr>
+          <w:lang w:val="es-MX"/>
+        </w:rPr>
+        <w:t xml:space="preserve"> </w:t>
+      </w:r>
+      <w:r>
+        <w:rPr>
+          <w:lang w:val="es-MX"/>
+        </w:rPr>
+        <w:t>c</w:t>
+      </w:r>
+      <w:r>
+        <w:rPr>
+          <w:lang w:val="es-MX"/>
+        </w:rPr>
+        <w:t>omplejidad y</w:t>
+      </w:r>
+      <w:r>
+        <w:rPr>
+          <w:lang w:val="es-MX"/>
+        </w:rPr>
+        <w:t xml:space="preserve"> la</w:t>
+      </w:r>
+      <w:r>
+        <w:rPr>
+          <w:lang w:val="es-MX"/>
+        </w:rPr>
+        <w:t xml:space="preserve"> </w:t>
+      </w:r>
+      <w:r>
+        <w:rPr>
+          <w:lang w:val="es-MX"/>
+        </w:rPr>
+        <w:t>c</w:t>
+      </w:r>
+      <w:r>
+        <w:rPr>
+          <w:lang w:val="es-MX"/>
+        </w:rPr>
+        <w:t>alidad del resultado</w:t>
+      </w:r>
+      <w:r>
+        <w:rPr>
+          <w:lang w:val="es-MX"/>
+        </w:rPr>
+        <w:t>, también p</w:t>
+      </w:r>
+      <w:r>
+        <w:rPr>
+          <w:lang w:val="es-MX"/>
+        </w:rPr>
+        <w:t>ara evitar el estancamiento (parálisis por análisis), el Coordinador tiene la autoridad de decidir tras escuchar todas las partes. Esta autoridad no es arbitraria, debe estar justificada por la viabilidad del cronograma</w:t>
+      </w:r>
+      <w:r>
+        <w:rPr>
+          <w:lang w:val="es-MX"/>
+        </w:rPr>
+        <w:t xml:space="preserve"> y </w:t>
+      </w:r>
+      <w:r>
+        <w:rPr>
+          <w:lang w:val="es-MX"/>
+        </w:rPr>
+        <w:t>tiene el voto de calidad basado en la viabilidad del proyecto</w:t>
+      </w:r>
+      <w:r>
+        <w:rPr>
+          <w:lang w:val="es-MX"/>
+        </w:rPr>
+        <w:t xml:space="preserve"> y una vez que se haya tomada la decisión </w:t>
+      </w:r>
+      <w:r>
+        <w:rPr>
+          <w:lang w:val="es-MX"/>
+        </w:rPr>
+        <w:t>el equipo debe volcarse al 100% en ella</w:t>
+      </w:r>
+      <w:r>
+        <w:rPr>
+          <w:lang w:val="es-MX"/>
+        </w:rPr>
+        <w:t xml:space="preserve"> </w:t>
+      </w:r>
+      <w:r>
+        <w:rPr>
+          <w:lang w:val="es-MX"/>
+        </w:rPr>
+        <w:t>si</w:t>
+      </w:r>
+      <w:r>
+        <w:rPr>
+          <w:lang w:val="es-MX"/>
+        </w:rPr>
+        <w:t>n objeciones ni</w:t>
+      </w:r>
+      <w:r>
+        <w:rPr>
+          <w:lang w:val="es-MX"/>
+        </w:rPr>
+        <w:t xml:space="preserve"> dificultades.</w:t>
+      </w:r>
+    </w:p>
+    <w:p>
+      <w:pPr>
+        <w:pStyle w:val="Prrafodelista"/>
+        <w:rPr>
+          <w:b/>
+          <w:bCs/>
+          <w:u w:val="single"/>
+          <w:lang w:val="es-VE"/>
+        </w:rPr>
+      </w:pPr>
+    </w:p>
+    <w:p>
+      <w:pPr>
+        <w:pStyle w:val="Prrafodelista"/>
+        <w:numPr>
+          <w:ilvl w:val="0"/>
+          <w:numId w:val="24"/>
+        </w:numPr>
+        <w:rPr>
+          <w:b/>
+          <w:bCs/>
+          <w:lang w:val="es-VE"/>
+        </w:rPr>
+      </w:pPr>
+      <w:r>
+        <w:rPr>
+          <w:b/>
+          <w:bCs/>
+          <w:lang w:val="es-VE"/>
+        </w:rPr>
+        <w:t>Cultura de Feedback</w:t>
+      </w:r>
+      <w:r>
+        <w:rPr>
+          <w:b/>
+          <w:bCs/>
+          <w:lang w:val="es-VE"/>
+        </w:rPr>
+        <w:t xml:space="preserve">: </w:t>
+      </w:r>
+      <w:r>
+        <w:rPr>
+          <w:lang w:val="es-VE"/>
+        </w:rPr>
+        <w:t>E</w:t>
+      </w:r>
+      <w:r>
+        <w:rPr>
+          <w:lang w:val="es-VE"/>
+        </w:rPr>
+        <w:t>s un entorno laboral donde la retroalimentación constructiva, continua y bidireccional entre líderes y empleados es habitual, valorada y forma parte de la interacción diaria. Su objetivo es mejorar el rendimiento, potenciar el desarrollo profesional y fomentar la comunicación abierta, transformando la evaluación en una herramienta de aprendizaje</w:t>
+      </w:r>
+      <w:r>
+        <w:rPr>
+          <w:lang w:val="es-VE"/>
+        </w:rPr>
+        <w:t xml:space="preserve">. Una vez que hayan terminado todo el proyecto y de hacer la entrega final, todo el equipo se hace como una autoevaluación y se preguntan cosas como por ejemplo </w:t>
+      </w:r>
+      <w:r>
+        <w:rPr>
+          <w:lang w:val="es-VE"/>
+        </w:rPr>
+        <w:t>¿Qué debemos dejar de hacer?</w:t>
+      </w:r>
+      <w:r>
+        <w:rPr>
+          <w:lang w:val="es-VE"/>
+        </w:rPr>
+        <w:t xml:space="preserve">,  </w:t>
+      </w:r>
+      <w:r>
+        <w:rPr>
+          <w:lang w:val="es-VE"/>
+        </w:rPr>
+        <w:t>¿Qué debemos empezar a hacer?</w:t>
+      </w:r>
+      <w:r>
+        <w:rPr>
+          <w:lang w:val="es-VE"/>
+        </w:rPr>
+        <w:t xml:space="preserve">, </w:t>
+      </w:r>
+      <w:r>
+        <w:rPr>
+          <w:lang w:val="es-VE"/>
+        </w:rPr>
+        <w:t>¿</w:t>
+      </w:r>
+      <w:r>
+        <w:rPr>
+          <w:lang w:val="es-VE"/>
+        </w:rPr>
+        <w:t>En que deberíamos mejorar</w:t>
+      </w:r>
+      <w:r>
+        <w:rPr>
+          <w:lang w:val="es-VE"/>
+        </w:rPr>
+        <w:t>?</w:t>
+      </w:r>
+      <w:r>
+        <w:rPr>
+          <w:lang w:val="es-VE"/>
+        </w:rPr>
+        <w:t xml:space="preserve">, entre esas cosas para que así se </w:t>
+      </w:r>
+      <w:r>
+        <w:rPr>
+          <w:lang w:val="es-VE"/>
+        </w:rPr>
+        <w:t>r</w:t>
+      </w:r>
+      <w:r>
+        <w:rPr>
+          <w:lang w:val="es-VE"/>
+        </w:rPr>
+        <w:t>efue</w:t>
+      </w:r>
+      <w:r>
+        <w:rPr>
+          <w:lang w:val="es-VE"/>
+        </w:rPr>
+        <w:t>rce</w:t>
+      </w:r>
+      <w:r>
+        <w:rPr>
+          <w:lang w:val="es-VE"/>
+        </w:rPr>
+        <w:t xml:space="preserve"> la moral y el compromiso grupal</w:t>
+      </w:r>
+      <w:r>
+        <w:rPr>
+          <w:lang w:val="es-VE"/>
+        </w:rPr>
+        <w:t xml:space="preserve"> de todos los integrantes</w:t>
+      </w:r>
     </w:p>
     <w:sectPr>
       <w:headerReference w:type="default" r:id="rId8"/>
@@ -4989,6 +5133,96 @@
     </w:lvl>
   </w:abstractNum>
   <w:abstractNum w:abstractNumId="14" w15:restartNumberingAfterBreak="0">
+    <w:nsid w:val="67835895"/>
+    <w:multiLevelType w:val="hybridMultilevel"/>
+    <w:tmpl w:val="8F122438"/>
+    <w:lvl w:ilvl="0" w:tplc="C9AEA822">
+      <w:start w:val="1"/>
+      <w:numFmt w:val="decimal"/>
+      <w:lvlText w:val="%1)"/>
+      <w:lvlJc w:val="left"/>
+      <w:pPr>
+        <w:ind w:left="1080" w:hanging="360"/>
+      </w:pPr>
+      <w:rPr>
+        <w:rFonts w:hint="default"/>
+        <w:u w:val="none"/>
+      </w:rPr>
+    </w:lvl>
+    <w:lvl w:ilvl="1" w:tplc="04150019" w:tentative="1">
+      <w:start w:val="1"/>
+      <w:numFmt w:val="lowerLetter"/>
+      <w:lvlText w:val="%2."/>
+      <w:lvlJc w:val="left"/>
+      <w:pPr>
+        <w:ind w:left="1800" w:hanging="360"/>
+      </w:pPr>
+    </w:lvl>
+    <w:lvl w:ilvl="2" w:tplc="0415001B" w:tentative="1">
+      <w:start w:val="1"/>
+      <w:numFmt w:val="lowerRoman"/>
+      <w:lvlText w:val="%3."/>
+      <w:lvlJc w:val="right"/>
+      <w:pPr>
+        <w:ind w:left="2520" w:hanging="180"/>
+      </w:pPr>
+    </w:lvl>
+    <w:lvl w:ilvl="3" w:tplc="0415000F" w:tentative="1">
+      <w:start w:val="1"/>
+      <w:numFmt w:val="decimal"/>
+      <w:lvlText w:val="%4."/>
+      <w:lvlJc w:val="left"/>
+      <w:pPr>
+        <w:ind w:left="3240" w:hanging="360"/>
+      </w:pPr>
+    </w:lvl>
+    <w:lvl w:ilvl="4" w:tplc="04150019" w:tentative="1">
+      <w:start w:val="1"/>
+      <w:numFmt w:val="lowerLetter"/>
+      <w:lvlText w:val="%5."/>
+      <w:lvlJc w:val="left"/>
+      <w:pPr>
+        <w:ind w:left="3960" w:hanging="360"/>
+      </w:pPr>
+    </w:lvl>
+    <w:lvl w:ilvl="5" w:tplc="0415001B" w:tentative="1">
+      <w:start w:val="1"/>
+      <w:numFmt w:val="lowerRoman"/>
+      <w:lvlText w:val="%6."/>
+      <w:lvlJc w:val="right"/>
+      <w:pPr>
+        <w:ind w:left="4680" w:hanging="180"/>
+      </w:pPr>
+    </w:lvl>
+    <w:lvl w:ilvl="6" w:tplc="0415000F" w:tentative="1">
+      <w:start w:val="1"/>
+      <w:numFmt w:val="decimal"/>
+      <w:lvlText w:val="%7."/>
+      <w:lvlJc w:val="left"/>
+      <w:pPr>
+        <w:ind w:left="5400" w:hanging="360"/>
+      </w:pPr>
+    </w:lvl>
+    <w:lvl w:ilvl="7" w:tplc="04150019" w:tentative="1">
+      <w:start w:val="1"/>
+      <w:numFmt w:val="lowerLetter"/>
+      <w:lvlText w:val="%8."/>
+      <w:lvlJc w:val="left"/>
+      <w:pPr>
+        <w:ind w:left="6120" w:hanging="360"/>
+      </w:pPr>
+    </w:lvl>
+    <w:lvl w:ilvl="8" w:tplc="0415001B" w:tentative="1">
+      <w:start w:val="1"/>
+      <w:numFmt w:val="lowerRoman"/>
+      <w:lvlText w:val="%9."/>
+      <w:lvlJc w:val="right"/>
+      <w:pPr>
+        <w:ind w:left="6840" w:hanging="180"/>
+      </w:pPr>
+    </w:lvl>
+  </w:abstractNum>
+  <w:abstractNum w:abstractNumId="15" w15:restartNumberingAfterBreak="0">
     <w:nsid w:val="681B10A7"/>
     <w:multiLevelType w:val="hybridMultilevel"/>
     <w:tmpl w:val="F5D22F12"/>
@@ -5077,7 +5311,7 @@
       </w:pPr>
     </w:lvl>
   </w:abstractNum>
-  <w:abstractNum w:abstractNumId="15" w15:restartNumberingAfterBreak="0">
+  <w:abstractNum w:abstractNumId="16" w15:restartNumberingAfterBreak="0">
     <w:nsid w:val="6B1A0795"/>
     <w:multiLevelType w:val="hybridMultilevel"/>
     <w:tmpl w:val="214A5C64"/>
@@ -5166,7 +5400,7 @@
       </w:pPr>
     </w:lvl>
   </w:abstractNum>
-  <w:abstractNum w:abstractNumId="16" w15:restartNumberingAfterBreak="0">
+  <w:abstractNum w:abstractNumId="17" w15:restartNumberingAfterBreak="0">
     <w:nsid w:val="6D940B6B"/>
     <w:multiLevelType w:val="hybridMultilevel"/>
     <w:tmpl w:val="5658D946"/>
@@ -5255,7 +5489,7 @@
       </w:pPr>
     </w:lvl>
   </w:abstractNum>
-  <w:abstractNum w:abstractNumId="17" w15:restartNumberingAfterBreak="0">
+  <w:abstractNum w:abstractNumId="18" w15:restartNumberingAfterBreak="0">
     <w:nsid w:val="6E615836"/>
     <w:multiLevelType w:val="hybridMultilevel"/>
     <w:tmpl w:val="A0045F34"/>
@@ -5341,7 +5575,96 @@
       </w:pPr>
     </w:lvl>
   </w:abstractNum>
-  <w:abstractNum w:abstractNumId="18" w15:restartNumberingAfterBreak="0">
+  <w:abstractNum w:abstractNumId="19" w15:restartNumberingAfterBreak="0">
+    <w:nsid w:val="70607331"/>
+    <w:multiLevelType w:val="hybridMultilevel"/>
+    <w:tmpl w:val="F20C69EE"/>
+    <w:lvl w:ilvl="0" w:tplc="4810DB70">
+      <w:start w:val="1"/>
+      <w:numFmt w:val="decimal"/>
+      <w:lvlText w:val="%1)"/>
+      <w:lvlJc w:val="left"/>
+      <w:pPr>
+        <w:ind w:left="1080" w:hanging="360"/>
+      </w:pPr>
+      <w:rPr>
+        <w:rFonts w:hint="default"/>
+      </w:rPr>
+    </w:lvl>
+    <w:lvl w:ilvl="1" w:tplc="04150019" w:tentative="1">
+      <w:start w:val="1"/>
+      <w:numFmt w:val="lowerLetter"/>
+      <w:lvlText w:val="%2."/>
+      <w:lvlJc w:val="left"/>
+      <w:pPr>
+        <w:ind w:left="1800" w:hanging="360"/>
+      </w:pPr>
+    </w:lvl>
+    <w:lvl w:ilvl="2" w:tplc="0415001B" w:tentative="1">
+      <w:start w:val="1"/>
+      <w:numFmt w:val="lowerRoman"/>
+      <w:lvlText w:val="%3."/>
+      <w:lvlJc w:val="right"/>
+      <w:pPr>
+        <w:ind w:left="2520" w:hanging="180"/>
+      </w:pPr>
+    </w:lvl>
+    <w:lvl w:ilvl="3" w:tplc="0415000F" w:tentative="1">
+      <w:start w:val="1"/>
+      <w:numFmt w:val="decimal"/>
+      <w:lvlText w:val="%4."/>
+      <w:lvlJc w:val="left"/>
+      <w:pPr>
+        <w:ind w:left="3240" w:hanging="360"/>
+      </w:pPr>
+    </w:lvl>
+    <w:lvl w:ilvl="4" w:tplc="04150019" w:tentative="1">
+      <w:start w:val="1"/>
+      <w:numFmt w:val="lowerLetter"/>
+      <w:lvlText w:val="%5."/>
+      <w:lvlJc w:val="left"/>
+      <w:pPr>
+        <w:ind w:left="3960" w:hanging="360"/>
+      </w:pPr>
+    </w:lvl>
+    <w:lvl w:ilvl="5" w:tplc="0415001B" w:tentative="1">
+      <w:start w:val="1"/>
+      <w:numFmt w:val="lowerRoman"/>
+      <w:lvlText w:val="%6."/>
+      <w:lvlJc w:val="right"/>
+      <w:pPr>
+        <w:ind w:left="4680" w:hanging="180"/>
+      </w:pPr>
+    </w:lvl>
+    <w:lvl w:ilvl="6" w:tplc="0415000F" w:tentative="1">
+      <w:start w:val="1"/>
+      <w:numFmt w:val="decimal"/>
+      <w:lvlText w:val="%7."/>
+      <w:lvlJc w:val="left"/>
+      <w:pPr>
+        <w:ind w:left="5400" w:hanging="360"/>
+      </w:pPr>
+    </w:lvl>
+    <w:lvl w:ilvl="7" w:tplc="04150019" w:tentative="1">
+      <w:start w:val="1"/>
+      <w:numFmt w:val="lowerLetter"/>
+      <w:lvlText w:val="%8."/>
+      <w:lvlJc w:val="left"/>
+      <w:pPr>
+        <w:ind w:left="6120" w:hanging="360"/>
+      </w:pPr>
+    </w:lvl>
+    <w:lvl w:ilvl="8" w:tplc="0415001B" w:tentative="1">
+      <w:start w:val="1"/>
+      <w:numFmt w:val="lowerRoman"/>
+      <w:lvlText w:val="%9."/>
+      <w:lvlJc w:val="right"/>
+      <w:pPr>
+        <w:ind w:left="6840" w:hanging="180"/>
+      </w:pPr>
+    </w:lvl>
+  </w:abstractNum>
+  <w:abstractNum w:abstractNumId="20" w15:restartNumberingAfterBreak="0">
     <w:nsid w:val="72347A5D"/>
     <w:multiLevelType w:val="hybridMultilevel"/>
     <w:tmpl w:val="5F1C5312"/>
@@ -5454,7 +5777,7 @@
       </w:rPr>
     </w:lvl>
   </w:abstractNum>
-  <w:abstractNum w:abstractNumId="19" w15:restartNumberingAfterBreak="0">
+  <w:abstractNum w:abstractNumId="21" w15:restartNumberingAfterBreak="0">
     <w:nsid w:val="774B47E9"/>
     <w:multiLevelType w:val="multilevel"/>
     <w:tmpl w:val="1902AA58"/>
@@ -5603,7 +5926,96 @@
       </w:rPr>
     </w:lvl>
   </w:abstractNum>
-  <w:abstractNum w:abstractNumId="20" w15:restartNumberingAfterBreak="0">
+  <w:abstractNum w:abstractNumId="22" w15:restartNumberingAfterBreak="0">
+    <w:nsid w:val="77E71E52"/>
+    <w:multiLevelType w:val="hybridMultilevel"/>
+    <w:tmpl w:val="35DA6F18"/>
+    <w:lvl w:ilvl="0" w:tplc="77C64F22">
+      <w:start w:val="1"/>
+      <w:numFmt w:val="decimal"/>
+      <w:lvlText w:val="%1)"/>
+      <w:lvlJc w:val="left"/>
+      <w:pPr>
+        <w:ind w:left="1080" w:hanging="360"/>
+      </w:pPr>
+      <w:rPr>
+        <w:rFonts w:hint="default"/>
+      </w:rPr>
+    </w:lvl>
+    <w:lvl w:ilvl="1" w:tplc="04150019" w:tentative="1">
+      <w:start w:val="1"/>
+      <w:numFmt w:val="lowerLetter"/>
+      <w:lvlText w:val="%2."/>
+      <w:lvlJc w:val="left"/>
+      <w:pPr>
+        <w:ind w:left="1800" w:hanging="360"/>
+      </w:pPr>
+    </w:lvl>
+    <w:lvl w:ilvl="2" w:tplc="0415001B" w:tentative="1">
+      <w:start w:val="1"/>
+      <w:numFmt w:val="lowerRoman"/>
+      <w:lvlText w:val="%3."/>
+      <w:lvlJc w:val="right"/>
+      <w:pPr>
+        <w:ind w:left="2520" w:hanging="180"/>
+      </w:pPr>
+    </w:lvl>
+    <w:lvl w:ilvl="3" w:tplc="0415000F" w:tentative="1">
+      <w:start w:val="1"/>
+      <w:numFmt w:val="decimal"/>
+      <w:lvlText w:val="%4."/>
+      <w:lvlJc w:val="left"/>
+      <w:pPr>
+        <w:ind w:left="3240" w:hanging="360"/>
+      </w:pPr>
+    </w:lvl>
+    <w:lvl w:ilvl="4" w:tplc="04150019" w:tentative="1">
+      <w:start w:val="1"/>
+      <w:numFmt w:val="lowerLetter"/>
+      <w:lvlText w:val="%5."/>
+      <w:lvlJc w:val="left"/>
+      <w:pPr>
+        <w:ind w:left="3960" w:hanging="360"/>
+      </w:pPr>
+    </w:lvl>
+    <w:lvl w:ilvl="5" w:tplc="0415001B" w:tentative="1">
+      <w:start w:val="1"/>
+      <w:numFmt w:val="lowerRoman"/>
+      <w:lvlText w:val="%6."/>
+      <w:lvlJc w:val="right"/>
+      <w:pPr>
+        <w:ind w:left="4680" w:hanging="180"/>
+      </w:pPr>
+    </w:lvl>
+    <w:lvl w:ilvl="6" w:tplc="0415000F" w:tentative="1">
+      <w:start w:val="1"/>
+      <w:numFmt w:val="decimal"/>
+      <w:lvlText w:val="%7."/>
+      <w:lvlJc w:val="left"/>
+      <w:pPr>
+        <w:ind w:left="5400" w:hanging="360"/>
+      </w:pPr>
+    </w:lvl>
+    <w:lvl w:ilvl="7" w:tplc="04150019" w:tentative="1">
+      <w:start w:val="1"/>
+      <w:numFmt w:val="lowerLetter"/>
+      <w:lvlText w:val="%8."/>
+      <w:lvlJc w:val="left"/>
+      <w:pPr>
+        <w:ind w:left="6120" w:hanging="360"/>
+      </w:pPr>
+    </w:lvl>
+    <w:lvl w:ilvl="8" w:tplc="0415001B" w:tentative="1">
+      <w:start w:val="1"/>
+      <w:numFmt w:val="lowerRoman"/>
+      <w:lvlText w:val="%9."/>
+      <w:lvlJc w:val="right"/>
+      <w:pPr>
+        <w:ind w:left="6840" w:hanging="180"/>
+      </w:pPr>
+    </w:lvl>
+  </w:abstractNum>
+  <w:abstractNum w:abstractNumId="23" w15:restartNumberingAfterBreak="0">
     <w:nsid w:val="791A39F6"/>
     <w:multiLevelType w:val="hybridMultilevel"/>
     <w:tmpl w:val="140A212A"/>
@@ -5693,7 +6105,7 @@
     </w:lvl>
   </w:abstractNum>
   <w:num w:numId="1">
-    <w:abstractNumId w:val="16"/>
+    <w:abstractNumId w:val="17"/>
   </w:num>
   <w:num w:numId="2">
     <w:abstractNumId w:val="1"/>
@@ -5705,7 +6117,7 @@
     <w:abstractNumId w:val="13"/>
   </w:num>
   <w:num w:numId="5">
-    <w:abstractNumId w:val="18"/>
+    <w:abstractNumId w:val="20"/>
   </w:num>
   <w:num w:numId="6">
     <w:abstractNumId w:val="8"/>
@@ -5717,7 +6129,7 @@
     <w:abstractNumId w:val="5"/>
   </w:num>
   <w:num w:numId="9">
-    <w:abstractNumId w:val="19"/>
+    <w:abstractNumId w:val="21"/>
   </w:num>
   <w:num w:numId="10">
     <w:abstractNumId w:val="6"/>
@@ -5729,7 +6141,7 @@
     <w:abstractNumId w:val="3"/>
   </w:num>
   <w:num w:numId="13">
-    <w:abstractNumId w:val="17"/>
+    <w:abstractNumId w:val="18"/>
   </w:num>
   <w:num w:numId="14">
     <w:abstractNumId w:val="2"/>
@@ -5744,16 +6156,25 @@
     <w:abstractNumId w:val="7"/>
   </w:num>
   <w:num w:numId="18">
-    <w:abstractNumId w:val="20"/>
+    <w:abstractNumId w:val="23"/>
   </w:num>
   <w:num w:numId="19">
-    <w:abstractNumId w:val="14"/>
+    <w:abstractNumId w:val="15"/>
   </w:num>
   <w:num w:numId="20">
     <w:abstractNumId w:val="4"/>
   </w:num>
   <w:num w:numId="21">
-    <w:abstractNumId w:val="15"/>
+    <w:abstractNumId w:val="16"/>
+  </w:num>
+  <w:num w:numId="22">
+    <w:abstractNumId w:val="19"/>
+  </w:num>
+  <w:num w:numId="23">
+    <w:abstractNumId w:val="22"/>
+  </w:num>
+  <w:num w:numId="24">
+    <w:abstractNumId w:val="14"/>
   </w:num>
 </w:numbering>
 </file>

</xml_diff>